<commit_message>
docs: reformat documentation to academic thesis style
- Times New Roman 12pt body, 16/14/14 headings
- 1.5 line spacing, 3cm margins all sides
- Justified text alignment
- Page numbers in footer
- Table of contents field (update in Word)
- Academic table format: grid style, shaded headers
- Figure captions with proper numbering
- Notes section style for remarks
- Proper cover page with double spacing
</commit_message>
<xml_diff>
--- a/docs/Documentacion_Tecnica.docx
+++ b/docs/Documentacion_Tecnica.docx
@@ -2,23 +2,110 @@
 <file path=word/document.xml><?xml version="1.0" encoding="utf-8"?>
 <w:document xmlns:wpc="http://schemas.microsoft.com/office/word/2010/wordprocessingCanvas" xmlns:mo="http://schemas.microsoft.com/office/mac/office/2008/main" xmlns:mc="http://schemas.openxmlformats.org/markup-compatibility/2006" xmlns:mv="urn:schemas-microsoft-com:mac:vml" xmlns:o="urn:schemas-microsoft-com:office:office" xmlns:r="http://schemas.openxmlformats.org/officeDocument/2006/relationships" xmlns:m="http://schemas.openxmlformats.org/officeDocument/2006/math" xmlns:v="urn:schemas-microsoft-com:vml" xmlns:wp14="http://schemas.microsoft.com/office/word/2010/wordprocessingDrawing" xmlns:wp="http://schemas.openxmlformats.org/drawingml/2006/wordprocessingDrawing" xmlns:w10="urn:schemas-microsoft-com:office:word" xmlns:w="http://schemas.openxmlformats.org/wordprocessingml/2006/main" xmlns:w14="http://schemas.microsoft.com/office/word/2010/wordml" xmlns:wpg="http://schemas.microsoft.com/office/word/2010/wordprocessingGroup" xmlns:wpi="http://schemas.microsoft.com/office/word/2010/wordprocessingInk" xmlns:wne="http://schemas.microsoft.com/office/word/2006/wordml" xmlns:wps="http://schemas.microsoft.com/office/word/2010/wordprocessingShape" mc:Ignorable="w14 wp14">
   <w:body>
-    <w:p/>
-    <w:p/>
-    <w:p/>
-    <w:p/>
-    <w:p/>
-    <w:p/>
     <w:p>
       <w:pPr>
+        <w:spacing w:line="480" w:lineRule="auto"/>
+      </w:pPr>
+    </w:p>
+    <w:p>
+      <w:pPr>
+        <w:spacing w:line="480" w:lineRule="auto"/>
+      </w:pPr>
+    </w:p>
+    <w:p>
+      <w:pPr>
+        <w:spacing w:line="480" w:lineRule="auto"/>
+      </w:pPr>
+    </w:p>
+    <w:p>
+      <w:pPr>
+        <w:spacing w:line="480" w:lineRule="auto"/>
+      </w:pPr>
+    </w:p>
+    <w:p>
+      <w:pPr>
+        <w:spacing w:line="480" w:lineRule="auto"/>
         <w:jc w:val="center"/>
       </w:pPr>
       <w:r>
         <w:rPr>
+          <w:rFonts w:ascii="Times New Roman" w:hAnsi="Times New Roman"/>
           <w:b/>
-          <w:color w:val="E86C00"/>
-          <w:sz w:val="56"/>
+          <w:sz w:val="40"/>
         </w:rPr>
-        <w:t>Documentacion Tecnica</w:t>
+        <w:t>DOCUMENTACION TECNICA</w:t>
+      </w:r>
+    </w:p>
+    <w:p>
+      <w:pPr>
+        <w:spacing w:line="480" w:lineRule="auto"/>
+        <w:jc w:val="center"/>
+      </w:pPr>
+      <w:r>
+        <w:rPr>
+          <w:rFonts w:ascii="Times New Roman" w:hAnsi="Times New Roman"/>
+          <w:sz w:val="28"/>
+        </w:rPr>
+        <w:t>Plataforma TDA-SIMP</w:t>
+        <w:br/>
+        <w:t>Arquitectura, Algoritmos y Validacion de Hipotesis</w:t>
+      </w:r>
+    </w:p>
+    <w:p>
+      <w:pPr>
+        <w:spacing w:line="480" w:lineRule="auto"/>
+      </w:pPr>
+    </w:p>
+    <w:p>
+      <w:pPr>
+        <w:spacing w:line="480" w:lineRule="auto"/>
+      </w:pPr>
+    </w:p>
+    <w:p>
+      <w:pPr>
+        <w:spacing w:line="480" w:lineRule="auto"/>
+      </w:pPr>
+    </w:p>
+    <w:p>
+      <w:pPr>
+        <w:spacing w:line="480" w:lineRule="auto"/>
+        <w:jc w:val="center"/>
+      </w:pPr>
+      <w:r>
+        <w:rPr>
+          <w:rFonts w:ascii="Times New Roman" w:hAnsi="Times New Roman"/>
+          <w:b/>
+          <w:sz w:val="28"/>
+        </w:rPr>
+        <w:t>Jorge Larry Copa Cruz</w:t>
+      </w:r>
+    </w:p>
+    <w:p>
+      <w:pPr>
+        <w:spacing w:line="480" w:lineRule="auto"/>
+        <w:jc w:val="center"/>
+      </w:pPr>
+      <w:r>
+        <w:rPr>
+          <w:rFonts w:ascii="Times New Roman" w:hAnsi="Times New Roman"/>
+          <w:sz w:val="24"/>
+        </w:rPr>
+        <w:t>Maestria en Matematica — Universidad Autonoma Gabriel Rene Moreno</w:t>
+        <w:br/>
+        <w:t>2026</w:t>
+      </w:r>
+    </w:p>
+    <w:p>
+      <w:r>
+        <w:br w:type="page"/>
+      </w:r>
+    </w:p>
+    <w:p>
+      <w:pPr>
+        <w:pStyle w:val="Heading1"/>
+      </w:pPr>
+      <w:r>
+        <w:t>Tabla de Contenidos</w:t>
       </w:r>
     </w:p>
     <w:p>
@@ -27,48 +114,23 @@
       </w:pPr>
       <w:r>
         <w:rPr>
-          <w:color w:val="666666"/>
-          <w:sz w:val="28"/>
+          <w:rFonts w:ascii="Times New Roman" w:hAnsi="Times New Roman"/>
+          <w:i/>
+          <w:color w:val="999999"/>
+          <w:sz w:val="22"/>
         </w:rPr>
-        <w:t>Plataforma TDA-SIMP</w:t>
-        <w:br/>
-        <w:t>Arquitectura, Algoritmos y Validacion</w:t>
-      </w:r>
-    </w:p>
-    <w:p/>
-    <w:p>
-      <w:pPr>
-        <w:jc w:val="center"/>
-      </w:pPr>
-      <w:r>
-        <w:rPr>
-          <w:color w:val="1A1A2E"/>
-          <w:sz w:val="24"/>
-        </w:rPr>
-        <w:t>Jorge Larry Copa Cruz</w:t>
+        <w:t>[Actualizar campo de tabla de contenidos en Word]</w:t>
       </w:r>
     </w:p>
     <w:p>
-      <w:pPr>
-        <w:jc w:val="center"/>
-      </w:pPr>
       <w:r>
-        <w:rPr>
-          <w:color w:val="1A1A2E"/>
-          <w:sz w:val="24"/>
-        </w:rPr>
-        <w:t>Maestria en Matematica — UAGRM — 2026</w:t>
+        <w:fldChar w:fldCharType="begin"/>
       </w:r>
-    </w:p>
-    <w:p>
-      <w:pPr>
-        <w:jc w:val="center"/>
-      </w:pPr>
       <w:r>
-        <w:rPr>
-          <w:color w:val="1A1A2E"/>
-          <w:sz w:val="24"/>
-        </w:rPr>
+        <w:instrText xml:space="preserve"> TOC \o "1-3" \h \z \u </w:instrText>
+      </w:r>
+      <w:r>
+        <w:fldChar w:fldCharType="end"/>
       </w:r>
     </w:p>
     <w:p>
@@ -86,7 +148,7 @@
     </w:p>
     <w:p>
       <w:r>
-        <w:t>La plataforma sigue una arquitectura modular con separacion clara entre logica de dominio, optimizacion, analisis topologico e interfaz de usuario.</w:t>
+        <w:t>La Plataforma TDA-SIMP sigue una arquitectura modular con separacion clara entre logica de dominio, optimizacion, analisis topologico e interfaz de usuario. Esta separacion facilita el mantenimiento, las pruebas y la extension futura del sistema.</w:t>
       </w:r>
     </w:p>
     <w:p>
@@ -99,41 +161,50 @@
     </w:p>
     <w:p>
       <w:r>
+        <w:t>El proyecto se organiza en el siguiente arbol de directorios:</w:t>
+      </w:r>
+    </w:p>
+    <w:p>
+      <w:r>
+        <w:rPr>
+          <w:rFonts w:ascii="Courier New" w:hAnsi="Courier New"/>
+          <w:sz w:val="18"/>
+        </w:rPr>
         <w:t>src/tda/</w:t>
         <w:br/>
-        <w:t xml:space="preserve">  app/                    # Interfaz Streamlit</w:t>
+        <w:t xml:space="preserve">  app/                         # Interfaz de usuario (Streamlit)</w:t>
         <w:br/>
-        <w:t xml:space="preserve">    plataforma_tda_simp.py  # Landing page</w:t>
+        <w:t xml:space="preserve">    plataforma_tda_simp.py       # Pagina principal (landing)</w:t>
         <w:br/>
-        <w:t xml:space="preserve">    pages/                  # 4 modulos de analisis</w:t>
+        <w:t xml:space="preserve">    pages/                       # Cuatro modulos de analisis</w:t>
         <w:br/>
-        <w:t xml:space="preserve">    theme.py                # Estilos, fonts, responsive</w:t>
+        <w:t xml:space="preserve">    theme.py                     # Estilos, fuentes, responsive</w:t>
         <w:br/>
-        <w:t xml:space="preserve">    download_utils.py       # Exportacion de archivos</w:t>
+        <w:t xml:space="preserve">    download_utils.py            # Exportacion de archivos</w:t>
         <w:br/>
-        <w:t xml:space="preserve">  core/                   # Logica de dominio</w:t>
+        <w:t xml:space="preserve">  core/                        # Logica de dominio</w:t>
         <w:br/>
-        <w:t xml:space="preserve">    betti.py / betti2d.py   # Calculo de numeros de Betti</w:t>
+        <w:t xml:space="preserve">    betti.py / betti2d.py        # Calculo de numeros de Betti</w:t>
         <w:br/>
-        <w:t xml:space="preserve">    topology.py             # Wasserstein, bottleneck (numpy puro)</w:t>
+        <w:t xml:space="preserve">    topology.py                  # Wasserstein, bottleneck (numpy puro)</w:t>
         <w:br/>
-        <w:t xml:space="preserve">    metric.py               # Metricas topologicas</w:t>
+        <w:t xml:space="preserve">    metric.py                    # Metricas topologicas</w:t>
         <w:br/>
-        <w:t xml:space="preserve">    fem.py                  # Solver FEM 2D</w:t>
+        <w:t xml:space="preserve">    fem.py                       # Solver FEM 2D</w:t>
         <w:br/>
-        <w:t xml:space="preserve">  optimization/           # Optimizacion</w:t>
+        <w:t xml:space="preserve">  optimization/                # Modulo de optimizacion</w:t>
         <w:br/>
-        <w:t xml:space="preserve">    metric_simp.py          # MetricaTDA_SIMP</w:t>
+        <w:t xml:space="preserve">    metric_simp.py               # MetricaTDA_SIMP</w:t>
         <w:br/>
-        <w:t xml:space="preserve">    beam_optimizer.py       # Optimizador 1D (viga)</w:t>
+        <w:t xml:space="preserve">    beam_optimizer.py            # Optimizador de viga 1D</w:t>
         <w:br/>
-        <w:t xml:space="preserve">  analysis/               # Analisis de robustez</w:t>
+        <w:t xml:space="preserve">  analysis/                    # Analisis de robustez</w:t>
         <w:br/>
-        <w:t xml:space="preserve">    stability.py            # Sweep de ruido, Hausdorff</w:t>
+        <w:t xml:space="preserve">    stability.py                 # Sweep de ruido, Hausdorff</w:t>
         <w:br/>
-        <w:t xml:space="preserve">  simulation/             # Pipeline de simulacion</w:t>
+        <w:t xml:space="preserve">  simulation/                  # Pipeline de simulacion</w:t>
         <w:br/>
-        <w:t xml:space="preserve">    pipeline.py             # Pipeline TDA completo</w:t>
+        <w:t xml:space="preserve">    pipeline.py                  # Pipeline TDA completo</w:t>
       </w:r>
     </w:p>
     <w:p>
@@ -146,24 +217,30 @@
     </w:p>
     <w:tbl>
       <w:tblPr>
-        <w:tblStyle w:val="LightGrid-Accent1"/>
+        <w:tblStyle w:val="TableGrid"/>
         <w:tblW w:type="auto" w:w="0"/>
         <w:jc w:val="center"/>
         <w:tblLook w:firstColumn="1" w:firstRow="1" w:lastColumn="0" w:lastRow="0" w:noHBand="0" w:noVBand="1" w:val="04A0"/>
       </w:tblPr>
       <w:tblGrid>
-        <w:gridCol w:w="3135"/>
-        <w:gridCol w:w="3135"/>
-        <w:gridCol w:w="3135"/>
+        <w:gridCol w:w="2946"/>
+        <w:gridCol w:w="2946"/>
+        <w:gridCol w:w="2946"/>
       </w:tblGrid>
       <w:tr>
         <w:tc>
           <w:tcPr>
-            <w:tcW w:type="dxa" w:w="3135"/>
+            <w:tcW w:type="dxa" w:w="2946"/>
+            <w:shd w:fill="D9E2F3"/>
           </w:tcPr>
           <w:p>
+            <w:pPr>
+              <w:jc w:val="center"/>
+            </w:pPr>
+            <w:r/>
             <w:r>
               <w:rPr>
+                <w:rFonts w:ascii="Times New Roman" w:hAnsi="Times New Roman"/>
                 <w:b/>
                 <w:sz w:val="20"/>
               </w:rPr>
@@ -173,11 +250,17 @@
         </w:tc>
         <w:tc>
           <w:tcPr>
-            <w:tcW w:type="dxa" w:w="3135"/>
+            <w:tcW w:type="dxa" w:w="2946"/>
+            <w:shd w:fill="D9E2F3"/>
           </w:tcPr>
           <w:p>
+            <w:pPr>
+              <w:jc w:val="center"/>
+            </w:pPr>
+            <w:r/>
             <w:r>
               <w:rPr>
+                <w:rFonts w:ascii="Times New Roman" w:hAnsi="Times New Roman"/>
                 <w:b/>
                 <w:sz w:val="20"/>
               </w:rPr>
@@ -187,15 +270,21 @@
         </w:tc>
         <w:tc>
           <w:tcPr>
-            <w:tcW w:type="dxa" w:w="3135"/>
+            <w:tcW w:type="dxa" w:w="2946"/>
+            <w:shd w:fill="D9E2F3"/>
           </w:tcPr>
           <w:p>
+            <w:pPr>
+              <w:jc w:val="center"/>
+            </w:pPr>
+            <w:r/>
             <w:r>
               <w:rPr>
+                <w:rFonts w:ascii="Times New Roman" w:hAnsi="Times New Roman"/>
                 <w:b/>
                 <w:sz w:val="20"/>
               </w:rPr>
-              <w:t>Uso</w:t>
+              <w:t>Funcion en el sistema</w:t>
             </w:r>
           </w:p>
         </w:tc>
@@ -203,11 +292,13 @@
       <w:tr>
         <w:tc>
           <w:tcPr>
-            <w:tcW w:type="dxa" w:w="3135"/>
+            <w:tcW w:type="dxa" w:w="2946"/>
           </w:tcPr>
           <w:p>
+            <w:r/>
             <w:r>
               <w:rPr>
+                <w:rFonts w:ascii="Times New Roman" w:hAnsi="Times New Roman"/>
                 <w:sz w:val="20"/>
               </w:rPr>
               <w:t>streamlit</w:t>
@@ -216,11 +307,13 @@
         </w:tc>
         <w:tc>
           <w:tcPr>
-            <w:tcW w:type="dxa" w:w="3135"/>
+            <w:tcW w:type="dxa" w:w="2946"/>
           </w:tcPr>
           <w:p>
+            <w:r/>
             <w:r>
               <w:rPr>
+                <w:rFonts w:ascii="Times New Roman" w:hAnsi="Times New Roman"/>
                 <w:sz w:val="20"/>
               </w:rPr>
               <w:t>&gt;=1.38</w:t>
@@ -229,14 +322,16 @@
         </w:tc>
         <w:tc>
           <w:tcPr>
-            <w:tcW w:type="dxa" w:w="3135"/>
+            <w:tcW w:type="dxa" w:w="2946"/>
           </w:tcPr>
           <w:p>
+            <w:r/>
             <w:r>
               <w:rPr>
+                <w:rFonts w:ascii="Times New Roman" w:hAnsi="Times New Roman"/>
                 <w:sz w:val="20"/>
               </w:rPr>
-              <w:t>Framework de interfaz web</w:t>
+              <w:t>Framework de interfaz web interactiva</w:t>
             </w:r>
           </w:p>
         </w:tc>
@@ -244,11 +339,13 @@
       <w:tr>
         <w:tc>
           <w:tcPr>
-            <w:tcW w:type="dxa" w:w="3135"/>
+            <w:tcW w:type="dxa" w:w="2946"/>
           </w:tcPr>
           <w:p>
+            <w:r/>
             <w:r>
               <w:rPr>
+                <w:rFonts w:ascii="Times New Roman" w:hAnsi="Times New Roman"/>
                 <w:sz w:val="20"/>
               </w:rPr>
               <w:t>numpy</w:t>
@@ -257,11 +354,13 @@
         </w:tc>
         <w:tc>
           <w:tcPr>
-            <w:tcW w:type="dxa" w:w="3135"/>
+            <w:tcW w:type="dxa" w:w="2946"/>
           </w:tcPr>
           <w:p>
+            <w:r/>
             <w:r>
               <w:rPr>
+                <w:rFonts w:ascii="Times New Roman" w:hAnsi="Times New Roman"/>
                 <w:sz w:val="20"/>
               </w:rPr>
               <w:t>&gt;=2.1</w:t>
@@ -270,14 +369,16 @@
         </w:tc>
         <w:tc>
           <w:tcPr>
-            <w:tcW w:type="dxa" w:w="3135"/>
+            <w:tcW w:type="dxa" w:w="2946"/>
           </w:tcPr>
           <w:p>
+            <w:r/>
             <w:r>
               <w:rPr>
+                <w:rFonts w:ascii="Times New Roman" w:hAnsi="Times New Roman"/>
                 <w:sz w:val="20"/>
               </w:rPr>
-              <w:t>Calculo numerico</w:t>
+              <w:t>Calculo numerico y algebra matricial</w:t>
             </w:r>
           </w:p>
         </w:tc>
@@ -285,11 +386,13 @@
       <w:tr>
         <w:tc>
           <w:tcPr>
-            <w:tcW w:type="dxa" w:w="3135"/>
+            <w:tcW w:type="dxa" w:w="2946"/>
           </w:tcPr>
           <w:p>
+            <w:r/>
             <w:r>
               <w:rPr>
+                <w:rFonts w:ascii="Times New Roman" w:hAnsi="Times New Roman"/>
                 <w:sz w:val="20"/>
               </w:rPr>
               <w:t>scipy</w:t>
@@ -298,11 +401,13 @@
         </w:tc>
         <w:tc>
           <w:tcPr>
-            <w:tcW w:type="dxa" w:w="3135"/>
+            <w:tcW w:type="dxa" w:w="2946"/>
           </w:tcPr>
           <w:p>
+            <w:r/>
             <w:r>
               <w:rPr>
+                <w:rFonts w:ascii="Times New Roman" w:hAnsi="Times New Roman"/>
                 <w:sz w:val="20"/>
               </w:rPr>
               <w:t>&gt;=1.14</w:t>
@@ -311,11 +416,13 @@
         </w:tc>
         <w:tc>
           <w:tcPr>
-            <w:tcW w:type="dxa" w:w="3135"/>
+            <w:tcW w:type="dxa" w:w="2946"/>
           </w:tcPr>
           <w:p>
+            <w:r/>
             <w:r>
               <w:rPr>
+                <w:rFonts w:ascii="Times New Roman" w:hAnsi="Times New Roman"/>
                 <w:sz w:val="20"/>
               </w:rPr>
               <w:t>Optimizacion (MMA), algebra dispersa</w:t>
@@ -326,11 +433,13 @@
       <w:tr>
         <w:tc>
           <w:tcPr>
-            <w:tcW w:type="dxa" w:w="3135"/>
+            <w:tcW w:type="dxa" w:w="2946"/>
           </w:tcPr>
           <w:p>
+            <w:r/>
             <w:r>
               <w:rPr>
+                <w:rFonts w:ascii="Times New Roman" w:hAnsi="Times New Roman"/>
                 <w:sz w:val="20"/>
               </w:rPr>
               <w:t>scikit-learn</w:t>
@@ -339,11 +448,13 @@
         </w:tc>
         <w:tc>
           <w:tcPr>
-            <w:tcW w:type="dxa" w:w="3135"/>
+            <w:tcW w:type="dxa" w:w="2946"/>
           </w:tcPr>
           <w:p>
+            <w:r/>
             <w:r>
               <w:rPr>
+                <w:rFonts w:ascii="Times New Roman" w:hAnsi="Times New Roman"/>
                 <w:sz w:val="20"/>
               </w:rPr>
               <w:t>&gt;=1.5</w:t>
@@ -352,11 +463,13 @@
         </w:tc>
         <w:tc>
           <w:tcPr>
-            <w:tcW w:type="dxa" w:w="3135"/>
+            <w:tcW w:type="dxa" w:w="2946"/>
           </w:tcPr>
           <w:p>
+            <w:r/>
             <w:r>
               <w:rPr>
+                <w:rFonts w:ascii="Times New Roman" w:hAnsi="Times New Roman"/>
                 <w:sz w:val="20"/>
               </w:rPr>
               <w:t>Clustering (K-medias), PCA</w:t>
@@ -367,11 +480,13 @@
       <w:tr>
         <w:tc>
           <w:tcPr>
-            <w:tcW w:type="dxa" w:w="3135"/>
+            <w:tcW w:type="dxa" w:w="2946"/>
           </w:tcPr>
           <w:p>
+            <w:r/>
             <w:r>
               <w:rPr>
+                <w:rFonts w:ascii="Times New Roman" w:hAnsi="Times New Roman"/>
                 <w:sz w:val="20"/>
               </w:rPr>
               <w:t>matplotlib</w:t>
@@ -380,11 +495,13 @@
         </w:tc>
         <w:tc>
           <w:tcPr>
-            <w:tcW w:type="dxa" w:w="3135"/>
+            <w:tcW w:type="dxa" w:w="2946"/>
           </w:tcPr>
           <w:p>
+            <w:r/>
             <w:r>
               <w:rPr>
+                <w:rFonts w:ascii="Times New Roman" w:hAnsi="Times New Roman"/>
                 <w:sz w:val="20"/>
               </w:rPr>
               <w:t>&gt;=3.9</w:t>
@@ -393,14 +510,16 @@
         </w:tc>
         <w:tc>
           <w:tcPr>
-            <w:tcW w:type="dxa" w:w="3135"/>
+            <w:tcW w:type="dxa" w:w="2946"/>
           </w:tcPr>
           <w:p>
+            <w:r/>
             <w:r>
               <w:rPr>
+                <w:rFonts w:ascii="Times New Roman" w:hAnsi="Times New Roman"/>
                 <w:sz w:val="20"/>
               </w:rPr>
-              <w:t>Graficas estaticas</w:t>
+              <w:t>Generacion de graficas estaticas</w:t>
             </w:r>
           </w:p>
         </w:tc>
@@ -408,11 +527,13 @@
       <w:tr>
         <w:tc>
           <w:tcPr>
-            <w:tcW w:type="dxa" w:w="3135"/>
+            <w:tcW w:type="dxa" w:w="2946"/>
           </w:tcPr>
           <w:p>
+            <w:r/>
             <w:r>
               <w:rPr>
+                <w:rFonts w:ascii="Times New Roman" w:hAnsi="Times New Roman"/>
                 <w:sz w:val="20"/>
               </w:rPr>
               <w:t>plotly</w:t>
@@ -421,11 +542,13 @@
         </w:tc>
         <w:tc>
           <w:tcPr>
-            <w:tcW w:type="dxa" w:w="3135"/>
+            <w:tcW w:type="dxa" w:w="2946"/>
           </w:tcPr>
           <w:p>
+            <w:r/>
             <w:r>
               <w:rPr>
+                <w:rFonts w:ascii="Times New Roman" w:hAnsi="Times New Roman"/>
                 <w:sz w:val="20"/>
               </w:rPr>
               <w:t>&gt;=5.24</w:t>
@@ -434,14 +557,16 @@
         </w:tc>
         <w:tc>
           <w:tcPr>
-            <w:tcW w:type="dxa" w:w="3135"/>
+            <w:tcW w:type="dxa" w:w="2946"/>
           </w:tcPr>
           <w:p>
+            <w:r/>
             <w:r>
               <w:rPr>
+                <w:rFonts w:ascii="Times New Roman" w:hAnsi="Times New Roman"/>
                 <w:sz w:val="20"/>
               </w:rPr>
-              <w:t>Graficas interactivas</w:t>
+              <w:t>Generacion de graficas interactivas</w:t>
             </w:r>
           </w:p>
         </w:tc>
@@ -449,11 +574,13 @@
       <w:tr>
         <w:tc>
           <w:tcPr>
-            <w:tcW w:type="dxa" w:w="3135"/>
+            <w:tcW w:type="dxa" w:w="2946"/>
           </w:tcPr>
           <w:p>
+            <w:r/>
             <w:r>
               <w:rPr>
+                <w:rFonts w:ascii="Times New Roman" w:hAnsi="Times New Roman"/>
                 <w:sz w:val="20"/>
               </w:rPr>
               <w:t>gudhi</w:t>
@@ -462,11 +589,13 @@
         </w:tc>
         <w:tc>
           <w:tcPr>
-            <w:tcW w:type="dxa" w:w="3135"/>
+            <w:tcW w:type="dxa" w:w="2946"/>
           </w:tcPr>
           <w:p>
+            <w:r/>
             <w:r>
               <w:rPr>
+                <w:rFonts w:ascii="Times New Roman" w:hAnsi="Times New Roman"/>
                 <w:sz w:val="20"/>
               </w:rPr>
               <w:t>&gt;=3.13</w:t>
@@ -475,14 +604,16 @@
         </w:tc>
         <w:tc>
           <w:tcPr>
-            <w:tcW w:type="dxa" w:w="3135"/>
+            <w:tcW w:type="dxa" w:w="2946"/>
           </w:tcPr>
           <w:p>
+            <w:r/>
             <w:r>
               <w:rPr>
+                <w:rFonts w:ascii="Times New Roman" w:hAnsi="Times New Roman"/>
                 <w:sz w:val="20"/>
               </w:rPr>
-              <w:t>Homologia persistente</w:t>
+              <w:t>Computacion de homologia persistente</w:t>
             </w:r>
           </w:p>
         </w:tc>
@@ -490,11 +621,13 @@
       <w:tr>
         <w:tc>
           <w:tcPr>
-            <w:tcW w:type="dxa" w:w="3135"/>
+            <w:tcW w:type="dxa" w:w="2946"/>
           </w:tcPr>
           <w:p>
+            <w:r/>
             <w:r>
               <w:rPr>
+                <w:rFonts w:ascii="Times New Roman" w:hAnsi="Times New Roman"/>
                 <w:sz w:val="20"/>
               </w:rPr>
               <w:t>ripser</w:t>
@@ -503,11 +636,13 @@
         </w:tc>
         <w:tc>
           <w:tcPr>
-            <w:tcW w:type="dxa" w:w="3135"/>
+            <w:tcW w:type="dxa" w:w="2946"/>
           </w:tcPr>
           <w:p>
+            <w:r/>
             <w:r>
               <w:rPr>
+                <w:rFonts w:ascii="Times New Roman" w:hAnsi="Times New Roman"/>
                 <w:sz w:val="20"/>
               </w:rPr>
               <w:t>latest</w:t>
@@ -516,102 +651,27 @@
         </w:tc>
         <w:tc>
           <w:tcPr>
-            <w:tcW w:type="dxa" w:w="3135"/>
+            <w:tcW w:type="dxa" w:w="2946"/>
           </w:tcPr>
           <w:p>
+            <w:r/>
             <w:r>
               <w:rPr>
+                <w:rFonts w:ascii="Times New Roman" w:hAnsi="Times New Roman"/>
                 <w:sz w:val="20"/>
               </w:rPr>
-              <w:t>Rips complexes (sin persim)</w:t>
-            </w:r>
-          </w:p>
-        </w:tc>
-      </w:tr>
-      <w:tr>
-        <w:tc>
-          <w:tcPr>
-            <w:tcW w:type="dxa" w:w="3135"/>
-          </w:tcPr>
-          <w:p>
-            <w:r>
-              <w:rPr>
-                <w:sz w:val="20"/>
-              </w:rPr>
-              <w:t>pyinstaller</w:t>
-            </w:r>
-          </w:p>
-        </w:tc>
-        <w:tc>
-          <w:tcPr>
-            <w:tcW w:type="dxa" w:w="3135"/>
-          </w:tcPr>
-          <w:p>
-            <w:r>
-              <w:rPr>
-                <w:sz w:val="20"/>
-              </w:rPr>
-              <w:t>6.22+</w:t>
-            </w:r>
-          </w:p>
-        </w:tc>
-        <w:tc>
-          <w:tcPr>
-            <w:tcW w:type="dxa" w:w="3135"/>
-          </w:tcPr>
-          <w:p>
-            <w:r>
-              <w:rPr>
-                <w:sz w:val="20"/>
-              </w:rPr>
-              <w:t>Empaquetado .exe</w:t>
-            </w:r>
-          </w:p>
-        </w:tc>
-      </w:tr>
-      <w:tr>
-        <w:tc>
-          <w:tcPr>
-            <w:tcW w:type="dxa" w:w="3135"/>
-          </w:tcPr>
-          <w:p>
-            <w:r>
-              <w:rPr>
-                <w:sz w:val="20"/>
-              </w:rPr>
-              <w:t>streamlit-desktop-app</w:t>
-            </w:r>
-          </w:p>
-        </w:tc>
-        <w:tc>
-          <w:tcPr>
-            <w:tcW w:type="dxa" w:w="3135"/>
-          </w:tcPr>
-          <w:p>
-            <w:r>
-              <w:rPr>
-                <w:sz w:val="20"/>
-              </w:rPr>
-              <w:t>0.3.4</w:t>
-            </w:r>
-          </w:p>
-        </w:tc>
-        <w:tc>
-          <w:tcPr>
-            <w:tcW w:type="dxa" w:w="3135"/>
-          </w:tcPr>
-          <w:p>
-            <w:r>
-              <w:rPr>
-                <w:sz w:val="20"/>
-              </w:rPr>
-              <w:t>Envoltorio nativo Windows</w:t>
+              <w:t>Rips complexes (instalado sin dependencias)</w:t>
             </w:r>
           </w:p>
         </w:tc>
       </w:tr>
     </w:tbl>
     <w:p/>
+    <w:p>
+      <w:r>
+        <w:br w:type="page"/>
+      </w:r>
+    </w:p>
     <w:p>
       <w:pPr>
         <w:pStyle w:val="Heading1"/>
@@ -630,7 +690,7 @@
     </w:p>
     <w:p>
       <w:r>
-        <w:t>El metodo SIMP penaliza densidades intermedias para converger a disenos binarios (0-1). La formulacion es:</w:t>
+        <w:t>El metodo SIMP (Solid Isotropic Material with Penalization) penaliza las densidades intermedias para converger a disenos binarios (0-1). La formulacion del problema de optimizacion es la siguiente:</w:t>
       </w:r>
     </w:p>
     <w:p>
@@ -638,7 +698,7 @@
         <w:pStyle w:val="IntenseQuote"/>
       </w:pPr>
       <w:r>
-        <w:t xml:space="preserve">  min  c(rho) = rho^p * Ke * ue</w:t>
+        <w:t>Minimizar:  c(rho) = sum(rho_e^p * ue^T * Ke * ue)</w:t>
       </w:r>
     </w:p>
     <w:p>
@@ -646,7 +706,7 @@
         <w:pStyle w:val="IntenseQuote"/>
       </w:pPr>
       <w:r>
-        <w:t xml:space="preserve">  s.t. K(rho) * U = F</w:t>
+        <w:t>Sujeto a:   K(rho) * U = F</w:t>
       </w:r>
     </w:p>
     <w:p>
@@ -654,7 +714,7 @@
         <w:pStyle w:val="IntenseQuote"/>
       </w:pPr>
       <w:r>
-        <w:t xml:space="preserve">       sum(rho_e * v_e) = fV * V0</w:t>
+        <w:t xml:space="preserve">            sum(rho_e * v_e) = fV * V0</w:t>
       </w:r>
     </w:p>
     <w:p>
@@ -662,17 +722,17 @@
         <w:pStyle w:val="IntenseQuote"/>
       </w:pPr>
       <w:r>
-        <w:t xml:space="preserve">       0 &lt; rho_min &lt;= rho_e &lt;= 1</w:t>
+        <w:t xml:space="preserve">            0 &lt; rho_min &lt;= rho_e &lt;= 1</w:t>
       </w:r>
     </w:p>
     <w:p>
       <w:r>
-        <w:t>Donde p es el factor de penalizacion, rho la densidad de cada elemento, Ke la rigidez del elemento, y fV la fraccion de volumen objetivo.</w:t>
+        <w:t>Donde p es el factor de penalizacion, rho_e es la densidad del elemento e, Ke es la matriz de rigidez del elemento, ue es el vector de desplazamientos, fV es la fraccion de volumen objetivo y V0 es el volumen total del dominio.</w:t>
       </w:r>
     </w:p>
     <w:p>
       <w:r>
-        <w:t>El optimizador usa MMA (Method of Moving Asymptotes) para calcular las actualizaciones de densidad en cada iteracion.</w:t>
+        <w:t>El optimizador implementado utiliza el metodo MMA (Method of Moving Asymptotes) para calcular las actualizaciones de densidad en cada iteracion. MMA es un metodo de programacion matematica que approxima el problema original con subproblemas convexos resolubles.</w:t>
       </w:r>
     </w:p>
     <w:p>
@@ -685,7 +745,7 @@
     </w:p>
     <w:p>
       <w:r>
-        <w:t>La metrica compuesta combina compliance y topologia:</w:t>
+        <w:t>La metrica compuesta combina el compliance (eficiencia estructural) con la complejidad topologica (numero de Betti-1) en una unica funcion objetivo escalar:</w:t>
       </w:r>
     </w:p>
     <w:p>
@@ -693,17 +753,17 @@
         <w:pStyle w:val="IntenseQuote"/>
       </w:pPr>
       <w:r>
-        <w:t xml:space="preserve">  mu_alpha = c(rho*) + alpha * B1(Omega_solido)</w:t>
+        <w:t>mu_alpha = c(rho*) + alpha * B1(Omega_solido)</w:t>
       </w:r>
     </w:p>
     <w:p>
       <w:r>
-        <w:t>Donde c(rho*) es el compliance optimizado y B1 es el numero de Betti-1 (agujeros) del diseno binarizado. El parametro alpha calibra el peso relativo entre eficiencia estructural y complejidad topologica.</w:t>
+        <w:t>Donde c(rho*) es el compliance optimizado y B1 es el numero de Betti-1 (agujeros) del diseno binarizado. El parametro alpha calibra el peso relativo entre ambos terminos.</w:t>
       </w:r>
     </w:p>
     <w:p>
       <w:r>
-        <w:t>Alpha se calcula para que ambos terminos tengan magnitud comparable: alpha = c_promedio / B1_promedio * 0.05.</w:t>
+        <w:t>El valor de alpha se calcula automaticamente para que ambos terminos tengan magnitud comparable: alpha = c_promedio / B1_promedio * 0.05. Esto permite que la metrica discrimine entre configuraciones que difieren en topologia pero no en compliance, o viceversa.</w:t>
       </w:r>
     </w:p>
     <w:p>
@@ -716,22 +776,28 @@
     </w:p>
     <w:p>
       <w:r>
-        <w:t>La plataforma calcula numeros de Betti (B0, B1) usando dos metodos independientes para validacion cruzada:</w:t>
+        <w:t>La plataforma calcula numeros de Betti (B0, B1) utilizando dos metodos independientes para validacion cruzada:</w:t>
+      </w:r>
+    </w:p>
+    <w:p>
+      <w:pPr>
+        <w:pStyle w:val="ListBullet"/>
+      </w:pPr>
+      <w:r>
+        <w:t>GUDHI: computa filtraciones de complejos de Rips sobre la nube de puntos y extrae los numeros de Betti de los diagramas de persistencia resultantes.</w:t>
+      </w:r>
+    </w:p>
+    <w:p>
+      <w:pPr>
+        <w:pStyle w:val="ListBullet"/>
+      </w:pPr>
+      <w:r>
+        <w:t>Euler numerico: realiza el conteo directo de componentes y agujeros sobre la grilla de densidades del diseno.</w:t>
       </w:r>
     </w:p>
     <w:p>
       <w:r>
-        <w:t xml:space="preserve">  - GUDHI: filtracion de komplejos de Rips complejos</w:t>
-      </w:r>
-    </w:p>
-    <w:p>
-      <w:r>
-        <w:t xml:space="preserve">  - Euler numerico: conteo directo en la grilla de densidades</w:t>
-      </w:r>
-    </w:p>
-    <w:p>
-      <w:r>
-        <w:t>La concordancia entre ambos metodos se verifica en cada ejecucion. Las distancias entre diagramas de persistencia (Wasserstein, bottleneck) se implementan en numpy puro, eliminando la dependencia de persim.</w:t>
+        <w:t>La concordancia entre ambos metodos se verifica en cada ejecucion. Las distancias entre diagramas de persistencia (Wasserstein y bottleneck) se implementan en numpy puro, eliminando la dependencia externa de persim.</w:t>
       </w:r>
     </w:p>
     <w:p>
@@ -742,26 +808,37 @@
         <w:t>2.4 Validaciones estadisticas</w:t>
       </w:r>
     </w:p>
+    <w:p>
+      <w:r>
+        <w:t>Las hipotesis se validan mediante los siguientes criterios:</w:t>
+      </w:r>
+    </w:p>
     <w:tbl>
       <w:tblPr>
-        <w:tblStyle w:val="LightGrid-Accent1"/>
+        <w:tblStyle w:val="TableGrid"/>
         <w:tblW w:type="auto" w:w="0"/>
         <w:jc w:val="center"/>
         <w:tblLook w:firstColumn="1" w:firstRow="1" w:lastColumn="0" w:lastRow="0" w:noHBand="0" w:noVBand="1" w:val="04A0"/>
       </w:tblPr>
       <w:tblGrid>
-        <w:gridCol w:w="3135"/>
-        <w:gridCol w:w="3135"/>
-        <w:gridCol w:w="3135"/>
+        <w:gridCol w:w="2946"/>
+        <w:gridCol w:w="2946"/>
+        <w:gridCol w:w="2946"/>
       </w:tblGrid>
       <w:tr>
         <w:tc>
           <w:tcPr>
-            <w:tcW w:type="dxa" w:w="3135"/>
+            <w:tcW w:type="dxa" w:w="2946"/>
+            <w:shd w:fill="D9E2F3"/>
           </w:tcPr>
           <w:p>
+            <w:pPr>
+              <w:jc w:val="center"/>
+            </w:pPr>
+            <w:r/>
             <w:r>
               <w:rPr>
+                <w:rFonts w:ascii="Times New Roman" w:hAnsi="Times New Roman"/>
                 <w:b/>
                 <w:sz w:val="20"/>
               </w:rPr>
@@ -771,29 +848,41 @@
         </w:tc>
         <w:tc>
           <w:tcPr>
-            <w:tcW w:type="dxa" w:w="3135"/>
+            <w:tcW w:type="dxa" w:w="2946"/>
+            <w:shd w:fill="D9E2F3"/>
           </w:tcPr>
           <w:p>
+            <w:pPr>
+              <w:jc w:val="center"/>
+            </w:pPr>
+            <w:r/>
             <w:r>
               <w:rPr>
+                <w:rFonts w:ascii="Times New Roman" w:hAnsi="Times New Roman"/>
                 <w:b/>
                 <w:sz w:val="20"/>
               </w:rPr>
-              <w:t>Metodo</w:t>
+              <w:t>Metodo de validacion</w:t>
             </w:r>
           </w:p>
         </w:tc>
         <w:tc>
           <w:tcPr>
-            <w:tcW w:type="dxa" w:w="3135"/>
+            <w:tcW w:type="dxa" w:w="2946"/>
+            <w:shd w:fill="D9E2F3"/>
           </w:tcPr>
           <w:p>
+            <w:pPr>
+              <w:jc w:val="center"/>
+            </w:pPr>
+            <w:r/>
             <w:r>
               <w:rPr>
+                <w:rFonts w:ascii="Times New Roman" w:hAnsi="Times New Roman"/>
                 <w:b/>
                 <w:sz w:val="20"/>
               </w:rPr>
-              <w:t>Criterio</w:t>
+              <w:t>Criterio de aceptacion</w:t>
             </w:r>
           </w:p>
         </w:tc>
@@ -801,11 +890,13 @@
       <w:tr>
         <w:tc>
           <w:tcPr>
-            <w:tcW w:type="dxa" w:w="3135"/>
+            <w:tcW w:type="dxa" w:w="2946"/>
           </w:tcPr>
           <w:p>
+            <w:r/>
             <w:r>
               <w:rPr>
+                <w:rFonts w:ascii="Times New Roman" w:hAnsi="Times New Roman"/>
                 <w:sz w:val="20"/>
               </w:rPr>
               <w:t>H.E.1a' (cota bottleneck)</w:t>
@@ -814,11 +905,13 @@
         </w:tc>
         <w:tc>
           <w:tcPr>
-            <w:tcW w:type="dxa" w:w="3135"/>
+            <w:tcW w:type="dxa" w:w="2946"/>
           </w:tcPr>
           <w:p>
+            <w:r/>
             <w:r>
               <w:rPr>
+                <w:rFonts w:ascii="Times New Roman" w:hAnsi="Times New Roman"/>
                 <w:sz w:val="20"/>
               </w:rPr>
               <w:t>Ratio dB/diam(X) &lt;= 2q</w:t>
@@ -827,14 +920,16 @@
         </w:tc>
         <w:tc>
           <w:tcPr>
-            <w:tcW w:type="dxa" w:w="3135"/>
+            <w:tcW w:type="dxa" w:w="2946"/>
           </w:tcPr>
           <w:p>
+            <w:r/>
             <w:r>
               <w:rPr>
+                <w:rFonts w:ascii="Times New Roman" w:hAnsi="Times New Roman"/>
                 <w:sz w:val="20"/>
               </w:rPr>
-              <w:t>Todos los shapes cumplen</w:t>
+              <w:t>Todos los shapes deben cumplir la desigualdad</w:t>
             </w:r>
           </w:p>
         </w:tc>
@@ -842,11 +937,13 @@
       <w:tr>
         <w:tc>
           <w:tcPr>
-            <w:tcW w:type="dxa" w:w="3135"/>
+            <w:tcW w:type="dxa" w:w="2946"/>
           </w:tcPr>
           <w:p>
+            <w:r/>
             <w:r>
               <w:rPr>
+                <w:rFonts w:ascii="Times New Roman" w:hAnsi="Times New Roman"/>
                 <w:sz w:val="20"/>
               </w:rPr>
               <w:t>H.E.1b (clasificacion)</w:t>
@@ -855,11 +952,13 @@
         </w:tc>
         <w:tc>
           <w:tcPr>
-            <w:tcW w:type="dxa" w:w="3135"/>
+            <w:tcW w:type="dxa" w:w="2946"/>
           </w:tcPr>
           <w:p>
+            <w:r/>
             <w:r>
               <w:rPr>
+                <w:rFonts w:ascii="Times New Roman" w:hAnsi="Times New Roman"/>
                 <w:sz w:val="20"/>
               </w:rPr>
               <w:t>Test de McNemar</w:t>
@@ -868,14 +967,16 @@
         </w:tc>
         <w:tc>
           <w:tcPr>
-            <w:tcW w:type="dxa" w:w="3135"/>
+            <w:tcW w:type="dxa" w:w="2946"/>
           </w:tcPr>
           <w:p>
+            <w:r/>
             <w:r>
               <w:rPr>
+                <w:rFonts w:ascii="Times New Roman" w:hAnsi="Times New Roman"/>
                 <w:sz w:val="20"/>
               </w:rPr>
-              <w:t>p &lt; 0.05 (superioridad TDA)</w:t>
+              <w:t>p &lt; 0.05 (superioridad estadistica de TDA)</w:t>
             </w:r>
           </w:p>
         </w:tc>
@@ -883,11 +984,13 @@
       <w:tr>
         <w:tc>
           <w:tcPr>
-            <w:tcW w:type="dxa" w:w="3135"/>
+            <w:tcW w:type="dxa" w:w="2946"/>
           </w:tcPr>
           <w:p>
+            <w:r/>
             <w:r>
               <w:rPr>
+                <w:rFonts w:ascii="Times New Roman" w:hAnsi="Times New Roman"/>
                 <w:sz w:val="20"/>
               </w:rPr>
               <w:t>H.E.1c (estabilidad)</w:t>
@@ -896,27 +999,31 @@
         </w:tc>
         <w:tc>
           <w:tcPr>
-            <w:tcW w:type="dxa" w:w="3135"/>
+            <w:tcW w:type="dxa" w:w="2946"/>
           </w:tcPr>
           <w:p>
+            <w:r/>
             <w:r>
               <w:rPr>
+                <w:rFonts w:ascii="Times New Roman" w:hAnsi="Times New Roman"/>
                 <w:sz w:val="20"/>
               </w:rPr>
-              <w:t>dB &lt;= 2*dH</w:t>
+              <w:t>dB &lt;= 2 * dH(X,Y)</w:t>
             </w:r>
           </w:p>
         </w:tc>
         <w:tc>
           <w:tcPr>
-            <w:tcW w:type="dxa" w:w="3135"/>
+            <w:tcW w:type="dxa" w:w="2946"/>
           </w:tcPr>
           <w:p>
+            <w:r/>
             <w:r>
               <w:rPr>
+                <w:rFonts w:ascii="Times New Roman" w:hAnsi="Times New Roman"/>
                 <w:sz w:val="20"/>
               </w:rPr>
-              <w:t>Todos los shapes cumplen</w:t>
+              <w:t>Todos los shapes deben cumplir la cota</w:t>
             </w:r>
           </w:p>
         </w:tc>
@@ -924,11 +1031,13 @@
       <w:tr>
         <w:tc>
           <w:tcPr>
-            <w:tcW w:type="dxa" w:w="3135"/>
+            <w:tcW w:type="dxa" w:w="2946"/>
           </w:tcPr>
           <w:p>
+            <w:r/>
             <w:r>
               <w:rPr>
+                <w:rFonts w:ascii="Times New Roman" w:hAnsi="Times New Roman"/>
                 <w:sz w:val="20"/>
               </w:rPr>
               <w:t>H.E.2a' (reduccion)</w:t>
@@ -937,27 +1046,31 @@
         </w:tc>
         <w:tc>
           <w:tcPr>
-            <w:tcW w:type="dxa" w:w="3135"/>
+            <w:tcW w:type="dxa" w:w="2946"/>
           </w:tcPr>
           <w:p>
+            <w:r/>
             <w:r>
               <w:rPr>
+                <w:rFonts w:ascii="Times New Roman" w:hAnsi="Times New Roman"/>
                 <w:sz w:val="20"/>
               </w:rPr>
-              <w:t>(c_uniform - c_star) / c_uniform &gt;= 0.40</w:t>
+              <w:t>(c_unif - c_star) / c_unif &gt;= 0.40</w:t>
             </w:r>
           </w:p>
         </w:tc>
         <w:tc>
           <w:tcPr>
-            <w:tcW w:type="dxa" w:w="3135"/>
+            <w:tcW w:type="dxa" w:w="2946"/>
           </w:tcPr>
           <w:p>
+            <w:r/>
             <w:r>
               <w:rPr>
+                <w:rFonts w:ascii="Times New Roman" w:hAnsi="Times New Roman"/>
                 <w:sz w:val="20"/>
               </w:rPr>
-              <w:t>Reduccion &gt;= 40%</w:t>
+              <w:t>Reduccion de compliance &gt;= 40%</w:t>
             </w:r>
           </w:p>
         </w:tc>
@@ -965,11 +1078,13 @@
       <w:tr>
         <w:tc>
           <w:tcPr>
-            <w:tcW w:type="dxa" w:w="3135"/>
+            <w:tcW w:type="dxa" w:w="2946"/>
           </w:tcPr>
           <w:p>
+            <w:r/>
             <w:r>
               <w:rPr>
+                <w:rFonts w:ascii="Times New Roman" w:hAnsi="Times New Roman"/>
                 <w:sz w:val="20"/>
               </w:rPr>
               <w:t>H.E.2b' (invariancia)</w:t>
@@ -978,11 +1093,13 @@
         </w:tc>
         <w:tc>
           <w:tcPr>
-            <w:tcW w:type="dxa" w:w="3135"/>
+            <w:tcW w:type="dxa" w:w="2946"/>
           </w:tcPr>
           <w:p>
+            <w:r/>
             <w:r>
               <w:rPr>
+                <w:rFonts w:ascii="Times New Roman" w:hAnsi="Times New Roman"/>
                 <w:sz w:val="20"/>
               </w:rPr>
               <w:t>B1 invariante</w:t>
@@ -991,20 +1108,27 @@
         </w:tc>
         <w:tc>
           <w:tcPr>
-            <w:tcW w:type="dxa" w:w="3135"/>
+            <w:tcW w:type="dxa" w:w="2946"/>
           </w:tcPr>
           <w:p>
+            <w:r/>
             <w:r>
               <w:rPr>
+                <w:rFonts w:ascii="Times New Roman" w:hAnsi="Times New Roman"/>
                 <w:sz w:val="20"/>
               </w:rPr>
-              <w:t>B1 constante para p,malla,r_min</w:t>
+              <w:t>B1 constante para variaciones de p, malla y r_min</w:t>
             </w:r>
           </w:p>
         </w:tc>
       </w:tr>
     </w:tbl>
     <w:p/>
+    <w:p>
+      <w:r>
+        <w:br w:type="page"/>
+      </w:r>
+    </w:p>
     <w:p>
       <w:pPr>
         <w:pStyle w:val="Heading1"/>
@@ -1015,7 +1139,7 @@
     </w:p>
     <w:p>
       <w:r>
-        <w:t>El solver FEM resuelve problemas de estado plano de tension en 2D. Usa elementos Q4 (cuadrilaterales de 4 nodos) con integracion completa.</w:t>
+        <w:t>El solver FEM resuelve problemas de estado plano de tension en dos dimensiones. Utiliza elementos cuadrilaterales de cuatro nodos (Q4) con integracion completa de 2x2 puntos de Gauss.</w:t>
       </w:r>
     </w:p>
     <w:p>
@@ -1028,71 +1152,74 @@
     </w:p>
     <w:tbl>
       <w:tblPr>
-        <w:tblStyle w:val="LightGrid-Accent1"/>
+        <w:tblStyle w:val="TableGrid"/>
         <w:tblW w:type="auto" w:w="0"/>
         <w:jc w:val="center"/>
         <w:tblLook w:firstColumn="1" w:firstRow="1" w:lastColumn="0" w:lastRow="0" w:noHBand="0" w:noVBand="1" w:val="04A0"/>
       </w:tblPr>
       <w:tblGrid>
-        <w:gridCol w:w="2351"/>
-        <w:gridCol w:w="2351"/>
-        <w:gridCol w:w="2351"/>
-        <w:gridCol w:w="2351"/>
+        <w:gridCol w:w="2946"/>
+        <w:gridCol w:w="2946"/>
+        <w:gridCol w:w="2946"/>
       </w:tblGrid>
       <w:tr>
         <w:tc>
           <w:tcPr>
-            <w:tcW w:type="dxa" w:w="2351"/>
+            <w:tcW w:type="dxa" w:w="2946"/>
+            <w:shd w:fill="D9E2F3"/>
           </w:tcPr>
           <w:p>
+            <w:pPr>
+              <w:jc w:val="center"/>
+            </w:pPr>
+            <w:r/>
             <w:r>
               <w:rPr>
+                <w:rFonts w:ascii="Times New Roman" w:hAnsi="Times New Roman"/>
                 <w:b/>
                 <w:sz w:val="20"/>
               </w:rPr>
-              <w:t>Caso</w:t>
+              <w:t>Caso de uso</w:t>
             </w:r>
           </w:p>
         </w:tc>
         <w:tc>
           <w:tcPr>
-            <w:tcW w:type="dxa" w:w="2351"/>
+            <w:tcW w:type="dxa" w:w="2946"/>
+            <w:shd w:fill="D9E2F3"/>
           </w:tcPr>
           <w:p>
+            <w:pPr>
+              <w:jc w:val="center"/>
+            </w:pPr>
+            <w:r/>
             <w:r>
               <w:rPr>
+                <w:rFonts w:ascii="Times New Roman" w:hAnsi="Times New Roman"/>
                 <w:b/>
                 <w:sz w:val="20"/>
               </w:rPr>
-              <w:t>BC Izquierda</w:t>
+              <w:t>Condicion izquierda</w:t>
             </w:r>
           </w:p>
         </w:tc>
         <w:tc>
           <w:tcPr>
-            <w:tcW w:type="dxa" w:w="2351"/>
+            <w:tcW w:type="dxa" w:w="2946"/>
+            <w:shd w:fill="D9E2F3"/>
           </w:tcPr>
           <w:p>
+            <w:pPr>
+              <w:jc w:val="center"/>
+            </w:pPr>
+            <w:r/>
             <w:r>
               <w:rPr>
+                <w:rFonts w:ascii="Times New Roman" w:hAnsi="Times New Roman"/>
                 <w:b/>
                 <w:sz w:val="20"/>
               </w:rPr>
-              <w:t>Carga</w:t>
-            </w:r>
-          </w:p>
-        </w:tc>
-        <w:tc>
-          <w:tcPr>
-            <w:tcW w:type="dxa" w:w="2351"/>
-          </w:tcPr>
-          <w:p>
-            <w:r>
-              <w:rPr>
-                <w:b/>
-                <w:sz w:val="20"/>
-              </w:rPr>
-              <w:t>Aplicacion</w:t>
+              <w:t>Carga aplicada</w:t>
             </w:r>
           </w:p>
         </w:tc>
@@ -1100,11 +1227,13 @@
       <w:tr>
         <w:tc>
           <w:tcPr>
-            <w:tcW w:type="dxa" w:w="2351"/>
+            <w:tcW w:type="dxa" w:w="2946"/>
           </w:tcPr>
           <w:p>
+            <w:r/>
             <w:r>
               <w:rPr>
+                <w:rFonts w:ascii="Times New Roman" w:hAnsi="Times New Roman"/>
                 <w:sz w:val="20"/>
               </w:rPr>
               <w:t>Viga en voladizo</w:t>
@@ -1113,40 +1242,31 @@
         </w:tc>
         <w:tc>
           <w:tcPr>
-            <w:tcW w:type="dxa" w:w="2351"/>
+            <w:tcW w:type="dxa" w:w="2946"/>
           </w:tcPr>
           <w:p>
+            <w:r/>
             <w:r>
               <w:rPr>
+                <w:rFonts w:ascii="Times New Roman" w:hAnsi="Times New Roman"/>
                 <w:sz w:val="20"/>
               </w:rPr>
-              <w:t>Empotrada (uj=0, vj=0)</w:t>
+              <w:t>Empotrada (uj = 0, vj = 0)</w:t>
             </w:r>
           </w:p>
         </w:tc>
         <w:tc>
           <w:tcPr>
-            <w:tcW w:type="dxa" w:w="2351"/>
+            <w:tcW w:type="dxa" w:w="2946"/>
           </w:tcPr>
           <w:p>
+            <w:r/>
             <w:r>
               <w:rPr>
+                <w:rFonts w:ascii="Times New Roman" w:hAnsi="Times New Roman"/>
                 <w:sz w:val="20"/>
               </w:rPr>
-              <w:t>Puntual en extremo</w:t>
-            </w:r>
-          </w:p>
-        </w:tc>
-        <w:tc>
-          <w:tcPr>
-            <w:tcW w:type="dxa" w:w="2351"/>
-          </w:tcPr>
-          <w:p>
-            <w:r>
-              <w:rPr>
-                <w:sz w:val="20"/>
-              </w:rPr>
-              <w:t>H.E.2, Ejemplo Viga</w:t>
+              <w:t>Puntual en extremo libre</w:t>
             </w:r>
           </w:p>
         </w:tc>
@@ -1154,11 +1274,13 @@
       <w:tr>
         <w:tc>
           <w:tcPr>
-            <w:tcW w:type="dxa" w:w="2351"/>
+            <w:tcW w:type="dxa" w:w="2946"/>
           </w:tcPr>
           <w:p>
+            <w:r/>
             <w:r>
               <w:rPr>
+                <w:rFonts w:ascii="Times New Roman" w:hAnsi="Times New Roman"/>
                 <w:sz w:val="20"/>
               </w:rPr>
               <w:t>Placa cuadrada</w:t>
@@ -1167,40 +1289,31 @@
         </w:tc>
         <w:tc>
           <w:tcPr>
-            <w:tcW w:type="dxa" w:w="2351"/>
+            <w:tcW w:type="dxa" w:w="2946"/>
           </w:tcPr>
           <w:p>
+            <w:r/>
             <w:r>
               <w:rPr>
+                <w:rFonts w:ascii="Times New Roman" w:hAnsi="Times New Roman"/>
                 <w:sz w:val="20"/>
               </w:rPr>
-              <w:t>Empotrada (uj=0, vj=0)</w:t>
+              <w:t>Empotrada (uj = 0, vj = 0)</w:t>
             </w:r>
           </w:p>
         </w:tc>
         <w:tc>
           <w:tcPr>
-            <w:tcW w:type="dxa" w:w="2351"/>
+            <w:tcW w:type="dxa" w:w="2946"/>
           </w:tcPr>
           <w:p>
+            <w:r/>
             <w:r>
               <w:rPr>
+                <w:rFonts w:ascii="Times New Roman" w:hAnsi="Times New Roman"/>
                 <w:sz w:val="20"/>
               </w:rPr>
-              <w:t>Puntual en esquina</w:t>
-            </w:r>
-          </w:p>
-        </w:tc>
-        <w:tc>
-          <w:tcPr>
-            <w:tcW w:type="dxa" w:w="2351"/>
-          </w:tcPr>
-          <w:p>
-            <w:r>
-              <w:rPr>
-                <w:sz w:val="20"/>
-              </w:rPr>
-              <w:t>Independencia de malla</w:t>
+              <w:t>Puntual en esquina opuesta</w:t>
             </w:r>
           </w:p>
         </w:tc>
@@ -1212,29 +1325,35 @@
         <w:pStyle w:val="Heading2"/>
       </w:pPr>
       <w:r>
-        <w:t>3.2 Material</w:t>
+        <w:t>3.2 Propiedades del material</w:t>
       </w:r>
     </w:p>
     <w:tbl>
       <w:tblPr>
-        <w:tblStyle w:val="LightGrid-Accent1"/>
+        <w:tblStyle w:val="TableGrid"/>
         <w:tblW w:type="auto" w:w="0"/>
         <w:jc w:val="center"/>
         <w:tblLook w:firstColumn="1" w:firstRow="1" w:lastColumn="0" w:lastRow="0" w:noHBand="0" w:noVBand="1" w:val="04A0"/>
       </w:tblPr>
       <w:tblGrid>
-        <w:gridCol w:w="3135"/>
-        <w:gridCol w:w="3135"/>
-        <w:gridCol w:w="3135"/>
+        <w:gridCol w:w="2946"/>
+        <w:gridCol w:w="2946"/>
+        <w:gridCol w:w="2946"/>
       </w:tblGrid>
       <w:tr>
         <w:tc>
           <w:tcPr>
-            <w:tcW w:type="dxa" w:w="3135"/>
+            <w:tcW w:type="dxa" w:w="2946"/>
+            <w:shd w:fill="D9E2F3"/>
           </w:tcPr>
           <w:p>
+            <w:pPr>
+              <w:jc w:val="center"/>
+            </w:pPr>
+            <w:r/>
             <w:r>
               <w:rPr>
+                <w:rFonts w:ascii="Times New Roman" w:hAnsi="Times New Roman"/>
                 <w:b/>
                 <w:sz w:val="20"/>
               </w:rPr>
@@ -1244,11 +1363,17 @@
         </w:tc>
         <w:tc>
           <w:tcPr>
-            <w:tcW w:type="dxa" w:w="3135"/>
+            <w:tcW w:type="dxa" w:w="2946"/>
+            <w:shd w:fill="D9E2F3"/>
           </w:tcPr>
           <w:p>
+            <w:pPr>
+              <w:jc w:val="center"/>
+            </w:pPr>
+            <w:r/>
             <w:r>
               <w:rPr>
+                <w:rFonts w:ascii="Times New Roman" w:hAnsi="Times New Roman"/>
                 <w:b/>
                 <w:sz w:val="20"/>
               </w:rPr>
@@ -1258,11 +1383,17 @@
         </w:tc>
         <w:tc>
           <w:tcPr>
-            <w:tcW w:type="dxa" w:w="3135"/>
+            <w:tcW w:type="dxa" w:w="2946"/>
+            <w:shd w:fill="D9E2F3"/>
           </w:tcPr>
           <w:p>
+            <w:pPr>
+              <w:jc w:val="center"/>
+            </w:pPr>
+            <w:r/>
             <w:r>
               <w:rPr>
+                <w:rFonts w:ascii="Times New Roman" w:hAnsi="Times New Roman"/>
                 <w:b/>
                 <w:sz w:val="20"/>
               </w:rPr>
@@ -1274,11 +1405,13 @@
       <w:tr>
         <w:tc>
           <w:tcPr>
-            <w:tcW w:type="dxa" w:w="3135"/>
+            <w:tcW w:type="dxa" w:w="2946"/>
           </w:tcPr>
           <w:p>
+            <w:r/>
             <w:r>
               <w:rPr>
+                <w:rFonts w:ascii="Times New Roman" w:hAnsi="Times New Roman"/>
                 <w:sz w:val="20"/>
               </w:rPr>
               <w:t>Modulo Young (E0)</w:t>
@@ -1287,11 +1420,13 @@
         </w:tc>
         <w:tc>
           <w:tcPr>
-            <w:tcW w:type="dxa" w:w="3135"/>
+            <w:tcW w:type="dxa" w:w="2946"/>
           </w:tcPr>
           <w:p>
+            <w:r/>
             <w:r>
               <w:rPr>
+                <w:rFonts w:ascii="Times New Roman" w:hAnsi="Times New Roman"/>
                 <w:sz w:val="20"/>
               </w:rPr>
               <w:t>200000</w:t>
@@ -1300,11 +1435,13 @@
         </w:tc>
         <w:tc>
           <w:tcPr>
-            <w:tcW w:type="dxa" w:w="3135"/>
+            <w:tcW w:type="dxa" w:w="2946"/>
           </w:tcPr>
           <w:p>
+            <w:r/>
             <w:r>
               <w:rPr>
+                <w:rFonts w:ascii="Times New Roman" w:hAnsi="Times New Roman"/>
                 <w:sz w:val="20"/>
               </w:rPr>
               <w:t>MPa</w:t>
@@ -1315,11 +1452,13 @@
       <w:tr>
         <w:tc>
           <w:tcPr>
-            <w:tcW w:type="dxa" w:w="3135"/>
+            <w:tcW w:type="dxa" w:w="2946"/>
           </w:tcPr>
           <w:p>
+            <w:r/>
             <w:r>
               <w:rPr>
+                <w:rFonts w:ascii="Times New Roman" w:hAnsi="Times New Roman"/>
                 <w:sz w:val="20"/>
               </w:rPr>
               <w:t>Relacion de Poisson</w:t>
@@ -1328,11 +1467,13 @@
         </w:tc>
         <w:tc>
           <w:tcPr>
-            <w:tcW w:type="dxa" w:w="3135"/>
+            <w:tcW w:type="dxa" w:w="2946"/>
           </w:tcPr>
           <w:p>
+            <w:r/>
             <w:r>
               <w:rPr>
+                <w:rFonts w:ascii="Times New Roman" w:hAnsi="Times New Roman"/>
                 <w:sz w:val="20"/>
               </w:rPr>
               <w:t>0.3</w:t>
@@ -1341,14 +1482,16 @@
         </w:tc>
         <w:tc>
           <w:tcPr>
-            <w:tcW w:type="dxa" w:w="3135"/>
+            <w:tcW w:type="dxa" w:w="2946"/>
           </w:tcPr>
           <w:p>
+            <w:r/>
             <w:r>
               <w:rPr>
+                <w:rFonts w:ascii="Times New Roman" w:hAnsi="Times New Roman"/>
                 <w:sz w:val="20"/>
               </w:rPr>
-              <w:t>-</w:t>
+              <w:t>Adimensional</w:t>
             </w:r>
           </w:p>
         </w:tc>
@@ -1356,11 +1499,13 @@
       <w:tr>
         <w:tc>
           <w:tcPr>
-            <w:tcW w:type="dxa" w:w="3135"/>
+            <w:tcW w:type="dxa" w:w="2946"/>
           </w:tcPr>
           <w:p>
+            <w:r/>
             <w:r>
               <w:rPr>
+                <w:rFonts w:ascii="Times New Roman" w:hAnsi="Times New Roman"/>
                 <w:sz w:val="20"/>
               </w:rPr>
               <w:t>Espesor</w:t>
@@ -1369,11 +1514,13 @@
         </w:tc>
         <w:tc>
           <w:tcPr>
-            <w:tcW w:type="dxa" w:w="3135"/>
+            <w:tcW w:type="dxa" w:w="2946"/>
           </w:tcPr>
           <w:p>
+            <w:r/>
             <w:r>
               <w:rPr>
+                <w:rFonts w:ascii="Times New Roman" w:hAnsi="Times New Roman"/>
                 <w:sz w:val="20"/>
               </w:rPr>
               <w:t>1.0</w:t>
@@ -1382,11 +1529,13 @@
         </w:tc>
         <w:tc>
           <w:tcPr>
-            <w:tcW w:type="dxa" w:w="3135"/>
+            <w:tcW w:type="dxa" w:w="2946"/>
           </w:tcPr>
           <w:p>
+            <w:r/>
             <w:r>
               <w:rPr>
+                <w:rFonts w:ascii="Times New Roman" w:hAnsi="Times New Roman"/>
                 <w:sz w:val="20"/>
               </w:rPr>
               <w:t>mm</w:t>
@@ -1397,11 +1546,13 @@
       <w:tr>
         <w:tc>
           <w:tcPr>
-            <w:tcW w:type="dxa" w:w="3135"/>
+            <w:tcW w:type="dxa" w:w="2946"/>
           </w:tcPr>
           <w:p>
+            <w:r/>
             <w:r>
               <w:rPr>
+                <w:rFonts w:ascii="Times New Roman" w:hAnsi="Times New Roman"/>
                 <w:sz w:val="20"/>
               </w:rPr>
               <w:t>Densidad de referencia</w:t>
@@ -1410,11 +1561,13 @@
         </w:tc>
         <w:tc>
           <w:tcPr>
-            <w:tcW w:type="dxa" w:w="3135"/>
+            <w:tcW w:type="dxa" w:w="2946"/>
           </w:tcPr>
           <w:p>
+            <w:r/>
             <w:r>
               <w:rPr>
+                <w:rFonts w:ascii="Times New Roman" w:hAnsi="Times New Roman"/>
                 <w:sz w:val="20"/>
               </w:rPr>
               <w:t>1.0</w:t>
@@ -1423,11 +1576,13 @@
         </w:tc>
         <w:tc>
           <w:tcPr>
-            <w:tcW w:type="dxa" w:w="3135"/>
+            <w:tcW w:type="dxa" w:w="2946"/>
           </w:tcPr>
           <w:p>
+            <w:r/>
             <w:r>
               <w:rPr>
+                <w:rFonts w:ascii="Times New Roman" w:hAnsi="Times New Roman"/>
                 <w:sz w:val="20"/>
               </w:rPr>
               <w:t>kg/mm3</w:t>
@@ -1437,6 +1592,11 @@
       </w:tr>
     </w:tbl>
     <w:p/>
+    <w:p>
+      <w:r>
+        <w:br w:type="page"/>
+      </w:r>
+    </w:p>
     <w:p>
       <w:pPr>
         <w:pStyle w:val="Heading1"/>
@@ -1450,29 +1610,35 @@
         <w:pStyle w:val="Heading2"/>
       </w:pPr>
       <w:r>
-        <w:t>4.1 Cuadros del documento</w:t>
+        <w:t>4.1 Cuadros de resultados del documento</w:t>
       </w:r>
     </w:p>
     <w:tbl>
       <w:tblPr>
-        <w:tblStyle w:val="LightGrid-Accent1"/>
+        <w:tblStyle w:val="TableGrid"/>
         <w:tblW w:type="auto" w:w="0"/>
         <w:jc w:val="center"/>
         <w:tblLook w:firstColumn="1" w:firstRow="1" w:lastColumn="0" w:lastRow="0" w:noHBand="0" w:noVBand="1" w:val="04A0"/>
       </w:tblPr>
       <w:tblGrid>
-        <w:gridCol w:w="3135"/>
-        <w:gridCol w:w="3135"/>
-        <w:gridCol w:w="3135"/>
+        <w:gridCol w:w="2946"/>
+        <w:gridCol w:w="2946"/>
+        <w:gridCol w:w="2946"/>
       </w:tblGrid>
       <w:tr>
         <w:tc>
           <w:tcPr>
-            <w:tcW w:type="dxa" w:w="3135"/>
+            <w:tcW w:type="dxa" w:w="2946"/>
+            <w:shd w:fill="D9E2F3"/>
           </w:tcPr>
           <w:p>
+            <w:pPr>
+              <w:jc w:val="center"/>
+            </w:pPr>
+            <w:r/>
             <w:r>
               <w:rPr>
+                <w:rFonts w:ascii="Times New Roman" w:hAnsi="Times New Roman"/>
                 <w:b/>
                 <w:sz w:val="20"/>
               </w:rPr>
@@ -1482,11 +1648,17 @@
         </w:tc>
         <w:tc>
           <w:tcPr>
-            <w:tcW w:type="dxa" w:w="3135"/>
+            <w:tcW w:type="dxa" w:w="2946"/>
+            <w:shd w:fill="D9E2F3"/>
           </w:tcPr>
           <w:p>
+            <w:pPr>
+              <w:jc w:val="center"/>
+            </w:pPr>
+            <w:r/>
             <w:r>
               <w:rPr>
+                <w:rFonts w:ascii="Times New Roman" w:hAnsi="Times New Roman"/>
                 <w:b/>
                 <w:sz w:val="20"/>
               </w:rPr>
@@ -1496,15 +1668,21 @@
         </w:tc>
         <w:tc>
           <w:tcPr>
-            <w:tcW w:type="dxa" w:w="3135"/>
+            <w:tcW w:type="dxa" w:w="2946"/>
+            <w:shd w:fill="D9E2F3"/>
           </w:tcPr>
           <w:p>
+            <w:pPr>
+              <w:jc w:val="center"/>
+            </w:pPr>
+            <w:r/>
             <w:r>
               <w:rPr>
+                <w:rFonts w:ascii="Times New Roman" w:hAnsi="Times New Roman"/>
                 <w:b/>
                 <w:sz w:val="20"/>
               </w:rPr>
-              <w:t>Descripcion</w:t>
+              <w:t>Contenido</w:t>
             </w:r>
           </w:p>
         </w:tc>
@@ -1512,11 +1690,13 @@
       <w:tr>
         <w:tc>
           <w:tcPr>
-            <w:tcW w:type="dxa" w:w="3135"/>
+            <w:tcW w:type="dxa" w:w="2946"/>
           </w:tcPr>
           <w:p>
+            <w:r/>
             <w:r>
               <w:rPr>
+                <w:rFonts w:ascii="Times New Roman" w:hAnsi="Times New Roman"/>
                 <w:sz w:val="20"/>
               </w:rPr>
               <w:t>Cuadro 1</w:t>
@@ -1525,11 +1705,13 @@
         </w:tc>
         <w:tc>
           <w:tcPr>
-            <w:tcW w:type="dxa" w:w="3135"/>
+            <w:tcW w:type="dxa" w:w="2946"/>
           </w:tcPr>
           <w:p>
+            <w:r/>
             <w:r>
               <w:rPr>
+                <w:rFonts w:ascii="Times New Roman" w:hAnsi="Times New Roman"/>
                 <w:sz w:val="20"/>
               </w:rPr>
               <w:t>H.E.2a'</w:t>
@@ -1538,14 +1720,16 @@
         </w:tc>
         <w:tc>
           <w:tcPr>
-            <w:tcW w:type="dxa" w:w="3135"/>
+            <w:tcW w:type="dxa" w:w="2946"/>
           </w:tcPr>
           <w:p>
+            <w:r/>
             <w:r>
               <w:rPr>
+                <w:rFonts w:ascii="Times New Roman" w:hAnsi="Times New Roman"/>
                 <w:sz w:val="20"/>
               </w:rPr>
-              <w:t>Reduccion de compliance &gt;= 40% vs uniforme</w:t>
+              <w:t>Reduccion de compliance &gt;= 40% vs diseno uniforme</w:t>
             </w:r>
           </w:p>
         </w:tc>
@@ -1553,11 +1737,13 @@
       <w:tr>
         <w:tc>
           <w:tcPr>
-            <w:tcW w:type="dxa" w:w="3135"/>
+            <w:tcW w:type="dxa" w:w="2946"/>
           </w:tcPr>
           <w:p>
+            <w:r/>
             <w:r>
               <w:rPr>
+                <w:rFonts w:ascii="Times New Roman" w:hAnsi="Times New Roman"/>
                 <w:sz w:val="20"/>
               </w:rPr>
               <w:t>Cuadro 4</w:t>
@@ -1566,11 +1752,13 @@
         </w:tc>
         <w:tc>
           <w:tcPr>
-            <w:tcW w:type="dxa" w:w="3135"/>
+            <w:tcW w:type="dxa" w:w="2946"/>
           </w:tcPr>
           <w:p>
+            <w:r/>
             <w:r>
               <w:rPr>
+                <w:rFonts w:ascii="Times New Roman" w:hAnsi="Times New Roman"/>
                 <w:sz w:val="20"/>
               </w:rPr>
               <w:t>H.E.1</w:t>
@@ -1579,11 +1767,13 @@
         </w:tc>
         <w:tc>
           <w:tcPr>
-            <w:tcW w:type="dxa" w:w="3135"/>
+            <w:tcW w:type="dxa" w:w="2946"/>
           </w:tcPr>
           <w:p>
+            <w:r/>
             <w:r>
               <w:rPr>
+                <w:rFonts w:ascii="Times New Roman" w:hAnsi="Times New Roman"/>
                 <w:sz w:val="20"/>
               </w:rPr>
               <w:t>Tasa de acierto de Bk por nivel de ruido</w:t>
@@ -1594,11 +1784,13 @@
       <w:tr>
         <w:tc>
           <w:tcPr>
-            <w:tcW w:type="dxa" w:w="3135"/>
+            <w:tcW w:type="dxa" w:w="2946"/>
           </w:tcPr>
           <w:p>
+            <w:r/>
             <w:r>
               <w:rPr>
+                <w:rFonts w:ascii="Times New Roman" w:hAnsi="Times New Roman"/>
                 <w:sz w:val="20"/>
               </w:rPr>
               <w:t>Cuadro 5</w:t>
@@ -1607,11 +1799,13 @@
         </w:tc>
         <w:tc>
           <w:tcPr>
-            <w:tcW w:type="dxa" w:w="3135"/>
+            <w:tcW w:type="dxa" w:w="2946"/>
           </w:tcPr>
           <w:p>
+            <w:r/>
             <w:r>
               <w:rPr>
+                <w:rFonts w:ascii="Times New Roman" w:hAnsi="Times New Roman"/>
                 <w:sz w:val="20"/>
               </w:rPr>
               <w:t>H.E.1</w:t>
@@ -1620,11 +1814,13 @@
         </w:tc>
         <w:tc>
           <w:tcPr>
-            <w:tcW w:type="dxa" w:w="3135"/>
+            <w:tcW w:type="dxa" w:w="2946"/>
           </w:tcPr>
           <w:p>
+            <w:r/>
             <w:r>
               <w:rPr>
+                <w:rFonts w:ascii="Times New Roman" w:hAnsi="Times New Roman"/>
                 <w:sz w:val="20"/>
               </w:rPr>
               <w:t>Clasificacion TDA vs Euclidianos</w:t>
@@ -1635,11 +1831,13 @@
       <w:tr>
         <w:tc>
           <w:tcPr>
-            <w:tcW w:type="dxa" w:w="3135"/>
+            <w:tcW w:type="dxa" w:w="2946"/>
           </w:tcPr>
           <w:p>
+            <w:r/>
             <w:r>
               <w:rPr>
+                <w:rFonts w:ascii="Times New Roman" w:hAnsi="Times New Roman"/>
                 <w:sz w:val="20"/>
               </w:rPr>
               <w:t>Cuadro 7</w:t>
@@ -1648,11 +1846,13 @@
         </w:tc>
         <w:tc>
           <w:tcPr>
-            <w:tcW w:type="dxa" w:w="3135"/>
+            <w:tcW w:type="dxa" w:w="2946"/>
           </w:tcPr>
           <w:p>
+            <w:r/>
             <w:r>
               <w:rPr>
+                <w:rFonts w:ascii="Times New Roman" w:hAnsi="Times New Roman"/>
                 <w:sz w:val="20"/>
               </w:rPr>
               <w:t>H.E.2b'</w:t>
@@ -1661,14 +1861,16 @@
         </w:tc>
         <w:tc>
           <w:tcPr>
-            <w:tcW w:type="dxa" w:w="3135"/>
+            <w:tcW w:type="dxa" w:w="2946"/>
           </w:tcPr>
           <w:p>
+            <w:r/>
             <w:r>
               <w:rPr>
+                <w:rFonts w:ascii="Times New Roman" w:hAnsi="Times New Roman"/>
                 <w:sz w:val="20"/>
               </w:rPr>
-              <w:t>Barrido de penalizacion p={1,2,3,4}</w:t>
+              <w:t>Barrido de penalizacion p = {1, 2, 3, 4}</w:t>
             </w:r>
           </w:p>
         </w:tc>
@@ -1676,11 +1878,13 @@
       <w:tr>
         <w:tc>
           <w:tcPr>
-            <w:tcW w:type="dxa" w:w="3135"/>
+            <w:tcW w:type="dxa" w:w="2946"/>
           </w:tcPr>
           <w:p>
+            <w:r/>
             <w:r>
               <w:rPr>
+                <w:rFonts w:ascii="Times New Roman" w:hAnsi="Times New Roman"/>
                 <w:sz w:val="20"/>
               </w:rPr>
               <w:t>Cuadro 8</w:t>
@@ -1689,11 +1893,13 @@
         </w:tc>
         <w:tc>
           <w:tcPr>
-            <w:tcW w:type="dxa" w:w="3135"/>
+            <w:tcW w:type="dxa" w:w="2946"/>
           </w:tcPr>
           <w:p>
+            <w:r/>
             <w:r>
               <w:rPr>
+                <w:rFonts w:ascii="Times New Roman" w:hAnsi="Times New Roman"/>
                 <w:sz w:val="20"/>
               </w:rPr>
               <w:t>H.E.2b'</w:t>
@@ -1702,14 +1908,16 @@
         </w:tc>
         <w:tc>
           <w:tcPr>
-            <w:tcW w:type="dxa" w:w="3135"/>
+            <w:tcW w:type="dxa" w:w="2946"/>
           </w:tcPr>
           <w:p>
+            <w:r/>
             <w:r>
               <w:rPr>
+                <w:rFonts w:ascii="Times New Roman" w:hAnsi="Times New Roman"/>
                 <w:sz w:val="20"/>
               </w:rPr>
-              <w:t>Barrido de malla Ne={1600,6400,14400}</w:t>
+              <w:t>Barrido de malla Ne = {1600, 6400, 14400}</w:t>
             </w:r>
           </w:p>
         </w:tc>
@@ -1721,29 +1929,35 @@
         <w:pStyle w:val="Heading2"/>
       </w:pPr>
       <w:r>
-        <w:t>4.2 Parametros fijos</w:t>
+        <w:t>4.2 Parametros fijos de referencia</w:t>
       </w:r>
     </w:p>
     <w:tbl>
       <w:tblPr>
-        <w:tblStyle w:val="LightGrid-Accent1"/>
+        <w:tblStyle w:val="TableGrid"/>
         <w:tblW w:type="auto" w:w="0"/>
         <w:jc w:val="center"/>
         <w:tblLook w:firstColumn="1" w:firstRow="1" w:lastColumn="0" w:lastRow="0" w:noHBand="0" w:noVBand="1" w:val="04A0"/>
       </w:tblPr>
       <w:tblGrid>
-        <w:gridCol w:w="3135"/>
-        <w:gridCol w:w="3135"/>
-        <w:gridCol w:w="3135"/>
+        <w:gridCol w:w="2946"/>
+        <w:gridCol w:w="2946"/>
+        <w:gridCol w:w="2946"/>
       </w:tblGrid>
       <w:tr>
         <w:tc>
           <w:tcPr>
-            <w:tcW w:type="dxa" w:w="3135"/>
+            <w:tcW w:type="dxa" w:w="2946"/>
+            <w:shd w:fill="D9E2F3"/>
           </w:tcPr>
           <w:p>
+            <w:pPr>
+              <w:jc w:val="center"/>
+            </w:pPr>
+            <w:r/>
             <w:r>
               <w:rPr>
+                <w:rFonts w:ascii="Times New Roman" w:hAnsi="Times New Roman"/>
                 <w:b/>
                 <w:sz w:val="20"/>
               </w:rPr>
@@ -1753,11 +1967,17 @@
         </w:tc>
         <w:tc>
           <w:tcPr>
-            <w:tcW w:type="dxa" w:w="3135"/>
+            <w:tcW w:type="dxa" w:w="2946"/>
+            <w:shd w:fill="D9E2F3"/>
           </w:tcPr>
           <w:p>
+            <w:pPr>
+              <w:jc w:val="center"/>
+            </w:pPr>
+            <w:r/>
             <w:r>
               <w:rPr>
+                <w:rFonts w:ascii="Times New Roman" w:hAnsi="Times New Roman"/>
                 <w:b/>
                 <w:sz w:val="20"/>
               </w:rPr>
@@ -1767,11 +1987,17 @@
         </w:tc>
         <w:tc>
           <w:tcPr>
-            <w:tcW w:type="dxa" w:w="3135"/>
+            <w:tcW w:type="dxa" w:w="2946"/>
+            <w:shd w:fill="D9E2F3"/>
           </w:tcPr>
           <w:p>
+            <w:pPr>
+              <w:jc w:val="center"/>
+            </w:pPr>
+            <w:r/>
             <w:r>
               <w:rPr>
+                <w:rFonts w:ascii="Times New Roman" w:hAnsi="Times New Roman"/>
                 <w:b/>
                 <w:sz w:val="20"/>
               </w:rPr>
@@ -1783,24 +2009,28 @@
       <w:tr>
         <w:tc>
           <w:tcPr>
-            <w:tcW w:type="dxa" w:w="3135"/>
+            <w:tcW w:type="dxa" w:w="2946"/>
           </w:tcPr>
           <w:p>
+            <w:r/>
             <w:r>
               <w:rPr>
+                <w:rFonts w:ascii="Times New Roman" w:hAnsi="Times New Roman"/>
                 <w:sz w:val="20"/>
               </w:rPr>
-              <w:t>fV</w:t>
+              <w:t>fV (fraccion de volumen)</w:t>
             </w:r>
           </w:p>
         </w:tc>
         <w:tc>
           <w:tcPr>
-            <w:tcW w:type="dxa" w:w="3135"/>
+            <w:tcW w:type="dxa" w:w="2946"/>
           </w:tcPr>
           <w:p>
+            <w:r/>
             <w:r>
               <w:rPr>
+                <w:rFonts w:ascii="Times New Roman" w:hAnsi="Times New Roman"/>
                 <w:sz w:val="20"/>
               </w:rPr>
               <w:t>0.5</w:t>
@@ -1809,14 +2039,16 @@
         </w:tc>
         <w:tc>
           <w:tcPr>
-            <w:tcW w:type="dxa" w:w="3135"/>
+            <w:tcW w:type="dxa" w:w="2946"/>
           </w:tcPr>
           <w:p>
+            <w:r/>
             <w:r>
               <w:rPr>
+                <w:rFonts w:ascii="Times New Roman" w:hAnsi="Times New Roman"/>
                 <w:sz w:val="20"/>
               </w:rPr>
-              <w:t>Diseno uniforme de referencia</w:t>
+              <w:t>Diseno uniforme de referencia para comparacion</w:t>
             </w:r>
           </w:p>
         </w:tc>
@@ -1824,11 +2056,13 @@
       <w:tr>
         <w:tc>
           <w:tcPr>
-            <w:tcW w:type="dxa" w:w="3135"/>
+            <w:tcW w:type="dxa" w:w="2946"/>
           </w:tcPr>
           <w:p>
+            <w:r/>
             <w:r>
               <w:rPr>
+                <w:rFonts w:ascii="Times New Roman" w:hAnsi="Times New Roman"/>
                 <w:sz w:val="20"/>
               </w:rPr>
               <w:t>Puntos por forma (H.E.1)</w:t>
@@ -1837,11 +2071,13 @@
         </w:tc>
         <w:tc>
           <w:tcPr>
-            <w:tcW w:type="dxa" w:w="3135"/>
+            <w:tcW w:type="dxa" w:w="2946"/>
           </w:tcPr>
           <w:p>
+            <w:r/>
             <w:r>
               <w:rPr>
+                <w:rFonts w:ascii="Times New Roman" w:hAnsi="Times New Roman"/>
                 <w:sz w:val="20"/>
               </w:rPr>
               <w:t>400</w:t>
@@ -1850,14 +2086,16 @@
         </w:tc>
         <w:tc>
           <w:tcPr>
-            <w:tcW w:type="dxa" w:w="3135"/>
+            <w:tcW w:type="dxa" w:w="2946"/>
           </w:tcPr>
           <w:p>
+            <w:r/>
             <w:r>
               <w:rPr>
+                <w:rFonts w:ascii="Times New Roman" w:hAnsi="Times New Roman"/>
                 <w:sz w:val="20"/>
               </w:rPr>
-              <w:t>Balance precision/velocidad</w:t>
+              <w:t>Balance entre precision y tiempo de computo</w:t>
             </w:r>
           </w:p>
         </w:tc>
@@ -1865,11 +2103,13 @@
       <w:tr>
         <w:tc>
           <w:tcPr>
-            <w:tcW w:type="dxa" w:w="3135"/>
+            <w:tcW w:type="dxa" w:w="2946"/>
           </w:tcPr>
           <w:p>
+            <w:r/>
             <w:r>
               <w:rPr>
+                <w:rFonts w:ascii="Times New Roman" w:hAnsi="Times New Roman"/>
                 <w:sz w:val="20"/>
               </w:rPr>
               <w:t>Ruido gaussiano (H.E.1)</w:t>
@@ -1878,27 +2118,31 @@
         </w:tc>
         <w:tc>
           <w:tcPr>
-            <w:tcW w:type="dxa" w:w="3135"/>
+            <w:tcW w:type="dxa" w:w="2946"/>
           </w:tcPr>
           <w:p>
+            <w:r/>
             <w:r>
               <w:rPr>
+                <w:rFonts w:ascii="Times New Roman" w:hAnsi="Times New Roman"/>
                 <w:sz w:val="20"/>
               </w:rPr>
-              <w:t>0.15</w:t>
+              <w:t>0.15 (15%)</w:t>
             </w:r>
           </w:p>
         </w:tc>
         <w:tc>
           <w:tcPr>
-            <w:tcW w:type="dxa" w:w="3135"/>
+            <w:tcW w:type="dxa" w:w="2946"/>
           </w:tcPr>
           <w:p>
+            <w:r/>
             <w:r>
               <w:rPr>
+                <w:rFonts w:ascii="Times New Roman" w:hAnsi="Times New Roman"/>
                 <w:sz w:val="20"/>
               </w:rPr>
-              <w:t>Nivel representativo</w:t>
+              <w:t>Nivel representativo de perturbacion</w:t>
             </w:r>
           </w:p>
         </w:tc>
@@ -1906,11 +2150,13 @@
       <w:tr>
         <w:tc>
           <w:tcPr>
-            <w:tcW w:type="dxa" w:w="3135"/>
+            <w:tcW w:type="dxa" w:w="2946"/>
           </w:tcPr>
           <w:p>
+            <w:r/>
             <w:r>
               <w:rPr>
+                <w:rFonts w:ascii="Times New Roman" w:hAnsi="Times New Roman"/>
                 <w:sz w:val="20"/>
               </w:rPr>
               <w:t>Malla (H.E.2)</w:t>
@@ -1919,27 +2165,31 @@
         </w:tc>
         <w:tc>
           <w:tcPr>
-            <w:tcW w:type="dxa" w:w="3135"/>
+            <w:tcW w:type="dxa" w:w="2946"/>
           </w:tcPr>
           <w:p>
+            <w:r/>
             <w:r>
               <w:rPr>
+                <w:rFonts w:ascii="Times New Roman" w:hAnsi="Times New Roman"/>
                 <w:sz w:val="20"/>
               </w:rPr>
-              <w:t>60x30 (1800)</w:t>
+              <w:t>60x30 (1800 elem.)</w:t>
             </w:r>
           </w:p>
         </w:tc>
         <w:tc>
           <w:tcPr>
-            <w:tcW w:type="dxa" w:w="3135"/>
+            <w:tcW w:type="dxa" w:w="2946"/>
           </w:tcPr>
           <w:p>
+            <w:r/>
             <w:r>
               <w:rPr>
+                <w:rFonts w:ascii="Times New Roman" w:hAnsi="Times New Roman"/>
                 <w:sz w:val="20"/>
               </w:rPr>
-              <w:t>Resolucion intermedia</w:t>
+              <w:t>Resolucion intermedia para barridos</w:t>
             </w:r>
           </w:p>
         </w:tc>
@@ -1948,10 +2198,240 @@
     <w:p/>
     <w:p>
       <w:pPr>
+        <w:pStyle w:val="Heading2"/>
+      </w:pPr>
+      <w:r>
+        <w:t>4.3 Rangos de barrido</w:t>
+      </w:r>
+    </w:p>
+    <w:tbl>
+      <w:tblPr>
+        <w:tblStyle w:val="TableGrid"/>
+        <w:tblW w:type="auto" w:w="0"/>
+        <w:jc w:val="center"/>
+        <w:tblLook w:firstColumn="1" w:firstRow="1" w:lastColumn="0" w:lastRow="0" w:noHBand="0" w:noVBand="1" w:val="04A0"/>
+      </w:tblPr>
+      <w:tblGrid>
+        <w:gridCol w:w="2946"/>
+        <w:gridCol w:w="2946"/>
+        <w:gridCol w:w="2946"/>
+      </w:tblGrid>
+      <w:tr>
+        <w:tc>
+          <w:tcPr>
+            <w:tcW w:type="dxa" w:w="2946"/>
+            <w:shd w:fill="D9E2F3"/>
+          </w:tcPr>
+          <w:p>
+            <w:pPr>
+              <w:jc w:val="center"/>
+            </w:pPr>
+            <w:r/>
+            <w:r>
+              <w:rPr>
+                <w:rFonts w:ascii="Times New Roman" w:hAnsi="Times New Roman"/>
+                <w:b/>
+                <w:sz w:val="20"/>
+              </w:rPr>
+              <w:t>Barrido</w:t>
+            </w:r>
+          </w:p>
+        </w:tc>
+        <w:tc>
+          <w:tcPr>
+            <w:tcW w:type="dxa" w:w="2946"/>
+            <w:shd w:fill="D9E2F3"/>
+          </w:tcPr>
+          <w:p>
+            <w:pPr>
+              <w:jc w:val="center"/>
+            </w:pPr>
+            <w:r/>
+            <w:r>
+              <w:rPr>
+                <w:rFonts w:ascii="Times New Roman" w:hAnsi="Times New Roman"/>
+                <w:b/>
+                <w:sz w:val="20"/>
+              </w:rPr>
+              <w:t>Valores</w:t>
+            </w:r>
+          </w:p>
+        </w:tc>
+        <w:tc>
+          <w:tcPr>
+            <w:tcW w:type="dxa" w:w="2946"/>
+            <w:shd w:fill="D9E2F3"/>
+          </w:tcPr>
+          <w:p>
+            <w:pPr>
+              <w:jc w:val="center"/>
+            </w:pPr>
+            <w:r/>
+            <w:r>
+              <w:rPr>
+                <w:rFonts w:ascii="Times New Roman" w:hAnsi="Times New Roman"/>
+                <w:b/>
+                <w:sz w:val="20"/>
+              </w:rPr>
+              <w:t>Verificacion</w:t>
+            </w:r>
+          </w:p>
+        </w:tc>
+      </w:tr>
+      <w:tr>
+        <w:tc>
+          <w:tcPr>
+            <w:tcW w:type="dxa" w:w="2946"/>
+          </w:tcPr>
+          <w:p>
+            <w:r/>
+            <w:r>
+              <w:rPr>
+                <w:rFonts w:ascii="Times New Roman" w:hAnsi="Times New Roman"/>
+                <w:sz w:val="20"/>
+              </w:rPr>
+              <w:t>Penalizacion p</w:t>
+            </w:r>
+          </w:p>
+        </w:tc>
+        <w:tc>
+          <w:tcPr>
+            <w:tcW w:type="dxa" w:w="2946"/>
+          </w:tcPr>
+          <w:p>
+            <w:r/>
+            <w:r>
+              <w:rPr>
+                <w:rFonts w:ascii="Times New Roman" w:hAnsi="Times New Roman"/>
+                <w:sz w:val="20"/>
+              </w:rPr>
+              <w:t>{1, 2, 3, 4}</w:t>
+            </w:r>
+          </w:p>
+        </w:tc>
+        <w:tc>
+          <w:tcPr>
+            <w:tcW w:type="dxa" w:w="2946"/>
+          </w:tcPr>
+          <w:p>
+            <w:r/>
+            <w:r>
+              <w:rPr>
+                <w:rFonts w:ascii="Times New Roman" w:hAnsi="Times New Roman"/>
+                <w:sz w:val="20"/>
+              </w:rPr>
+              <w:t>H.E.2b' — invariancia de B1</w:t>
+            </w:r>
+          </w:p>
+        </w:tc>
+      </w:tr>
+      <w:tr>
+        <w:tc>
+          <w:tcPr>
+            <w:tcW w:type="dxa" w:w="2946"/>
+          </w:tcPr>
+          <w:p>
+            <w:r/>
+            <w:r>
+              <w:rPr>
+                <w:rFonts w:ascii="Times New Roman" w:hAnsi="Times New Roman"/>
+                <w:sz w:val="20"/>
+              </w:rPr>
+              <w:t>Malla Ne</w:t>
+            </w:r>
+          </w:p>
+        </w:tc>
+        <w:tc>
+          <w:tcPr>
+            <w:tcW w:type="dxa" w:w="2946"/>
+          </w:tcPr>
+          <w:p>
+            <w:r/>
+            <w:r>
+              <w:rPr>
+                <w:rFonts w:ascii="Times New Roman" w:hAnsi="Times New Roman"/>
+                <w:sz w:val="20"/>
+              </w:rPr>
+              <w:t>{1600, 6400, 14400}</w:t>
+            </w:r>
+          </w:p>
+        </w:tc>
+        <w:tc>
+          <w:tcPr>
+            <w:tcW w:type="dxa" w:w="2946"/>
+          </w:tcPr>
+          <w:p>
+            <w:r/>
+            <w:r>
+              <w:rPr>
+                <w:rFonts w:ascii="Times New Roman" w:hAnsi="Times New Roman"/>
+                <w:sz w:val="20"/>
+              </w:rPr>
+              <w:t>H.E.2b' — independencia de malla</w:t>
+            </w:r>
+          </w:p>
+        </w:tc>
+      </w:tr>
+      <w:tr>
+        <w:tc>
+          <w:tcPr>
+            <w:tcW w:type="dxa" w:w="2946"/>
+          </w:tcPr>
+          <w:p>
+            <w:r/>
+            <w:r>
+              <w:rPr>
+                <w:rFonts w:ascii="Times New Roman" w:hAnsi="Times New Roman"/>
+                <w:sz w:val="20"/>
+              </w:rPr>
+              <w:t>Radio r_min</w:t>
+            </w:r>
+          </w:p>
+        </w:tc>
+        <w:tc>
+          <w:tcPr>
+            <w:tcW w:type="dxa" w:w="2946"/>
+          </w:tcPr>
+          <w:p>
+            <w:r/>
+            <w:r>
+              <w:rPr>
+                <w:rFonts w:ascii="Times New Roman" w:hAnsi="Times New Roman"/>
+                <w:sz w:val="20"/>
+              </w:rPr>
+              <w:t>[1.5, 2.0, 2.5, 3.0, 3.5, 4.0]</w:t>
+            </w:r>
+          </w:p>
+        </w:tc>
+        <w:tc>
+          <w:tcPr>
+            <w:tcW w:type="dxa" w:w="2946"/>
+          </w:tcPr>
+          <w:p>
+            <w:r/>
+            <w:r>
+              <w:rPr>
+                <w:rFonts w:ascii="Times New Roman" w:hAnsi="Times New Roman"/>
+                <w:sz w:val="20"/>
+              </w:rPr>
+              <w:t>H.E.2b' — invariancia bajo variacion</w:t>
+            </w:r>
+          </w:p>
+        </w:tc>
+      </w:tr>
+    </w:tbl>
+    <w:p/>
+    <w:p>
+      <w:r>
+        <w:br w:type="page"/>
+      </w:r>
+    </w:p>
+    <w:p>
+      <w:pPr>
         <w:pStyle w:val="Heading1"/>
       </w:pPr>
       <w:r>
-        <w:t>5. Empaquetado como Ejecutable (.exe)</w:t>
+        <w:t>5. Empaquetado como Ejecutable</w:t>
       </w:r>
     </w:p>
     <w:p>
@@ -1959,32 +2439,60 @@
         <w:pStyle w:val="Heading2"/>
       </w:pPr>
       <w:r>
-        <w:t>5.1 Proceso de build</w:t>
+        <w:t>5.1 Proceso de generacion del .exe</w:t>
       </w:r>
     </w:p>
     <w:p>
       <w:r>
-        <w:t>1. Crear entorno virtual con uv.</w:t>
+        <w:t>El ejecutable se genera mediante el script build_exe.bat, que ejecuta los siguientes pasos en secuencia:</w:t>
       </w:r>
     </w:p>
     <w:p>
+      <w:pPr>
+        <w:pStyle w:val="ListNumber"/>
+      </w:pPr>
       <w:r>
-        <w:t>2. Instalar dependencias con --python para forzar target.</w:t>
+        <w:t>Verificacion e instalacion del gestor de paquetes uv.</w:t>
       </w:r>
     </w:p>
     <w:p>
+      <w:pPr>
+        <w:pStyle w:val="ListNumber"/>
+      </w:pPr>
       <w:r>
-        <w:t>3. Generar .ico desde OTopologica.jpg (Pillow).</w:t>
+        <w:t>Creacion de entorno virtual temporal (build_venv).</w:t>
       </w:r>
     </w:p>
     <w:p>
+      <w:pPr>
+        <w:pStyle w:val="ListNumber"/>
+      </w:pPr>
       <w:r>
-        <w:t>4. Ejecutar streamlit-desktop-app build con PyInstaller.</w:t>
+        <w:t>Instalacion de dependencias con --python para forzar el target correcto.</w:t>
       </w:r>
     </w:p>
     <w:p>
+      <w:pPr>
+        <w:pStyle w:val="ListNumber"/>
+      </w:pPr>
       <w:r>
-        <w:t>5. Empaquetar en --onefile con hidden imports completos.</w:t>
+        <w:t>Generacion del icono .ico desde OTopologica.jpg (Pillow).</w:t>
+      </w:r>
+    </w:p>
+    <w:p>
+      <w:pPr>
+        <w:pStyle w:val="ListNumber"/>
+      </w:pPr>
+      <w:r>
+        <w:t>Ejecucion de streamlit-desktop-app build con PyInstaller.</w:t>
+      </w:r>
+    </w:p>
+    <w:p>
+      <w:pPr>
+        <w:pStyle w:val="ListNumber"/>
+      </w:pPr>
+      <w:r>
+        <w:t>Empaquetado en modo --onefile con todos los hidden imports.</w:t>
       </w:r>
     </w:p>
     <w:p>
@@ -1992,42 +2500,52 @@
         <w:pStyle w:val="Heading2"/>
       </w:pPr>
       <w:r>
-        <w:t>5.2 Hidden imports requeridos</w:t>
+        <w:t>5.2 Hidden imports</w:t>
       </w:r>
     </w:p>
     <w:p>
       <w:r>
-        <w:t>PyInstaller no detecta automaticamente todas las dependencias. Los hidden imports incluyen:</w:t>
+        <w:t>PyInstaller no detecta automaticamente todas las dependencias dinamicas. Los siguientes paquetes deben incluirse explicitamente como hidden imports:</w:t>
       </w:r>
     </w:p>
     <w:p>
+      <w:pPr>
+        <w:pStyle w:val="ListBullet"/>
+      </w:pPr>
       <w:r>
-        <w:t xml:space="preserve">  - matplotlib.backends.backend_pdf, backend_agg</w:t>
+        <w:t>matplotlib.backends.backend_pdf, matplotlib.backends.backend_agg, matplotlib.font_manager, matplotlib.patches</w:t>
       </w:r>
     </w:p>
     <w:p>
+      <w:pPr>
+        <w:pStyle w:val="ListBullet"/>
+      </w:pPr>
       <w:r>
-        <w:t xml:space="preserve">  - ripser, gudhi, gudhi.rips_complex, gudhi.simplex_tree</w:t>
+        <w:t>ripser, gudhi, gudhi.rips_complex, gudhi.simplex_tree</w:t>
       </w:r>
     </w:p>
     <w:p>
+      <w:pPr>
+        <w:pStyle w:val="ListBullet"/>
+      </w:pPr>
       <w:r>
-        <w:t xml:space="preserve">  - sklearn.cluster, sklearn.metrics, sklearn.decomposition</w:t>
+        <w:t>sklearn.cluster, sklearn.metrics, sklearn.decomposition</w:t>
       </w:r>
     </w:p>
     <w:p>
+      <w:pPr>
+        <w:pStyle w:val="ListBullet"/>
+      </w:pPr>
       <w:r>
-        <w:t xml:space="preserve">  - scipy.sparse, scipy.sparse.linalg, scipy.spatial.distance</w:t>
+        <w:t>scipy.sparse, scipy.sparse.linalg, scipy.spatial.distance</w:t>
       </w:r>
     </w:p>
     <w:p>
+      <w:pPr>
+        <w:pStyle w:val="ListBullet"/>
+      </w:pPr>
       <w:r>
-        <w:t xml:space="preserve">  - tda.core.topology, tda.core.betti2d, tda.core.metric</w:t>
-      </w:r>
-    </w:p>
-    <w:p>
-      <w:r>
-        <w:t xml:space="preserve">  - tda.optimization.metric_simp, tda.optimization.beam_optimizer</w:t>
+        <w:t>tda.core.topology, tda.core.betti2d, tda.core.metric, tda.optimization.metric_simp, tda.optimization.beam_optimizer</w:t>
       </w:r>
     </w:p>
     <w:p>
@@ -2040,41 +2558,53 @@
     </w:p>
     <w:tbl>
       <w:tblPr>
-        <w:tblStyle w:val="LightGrid-Accent1"/>
+        <w:tblStyle w:val="TableGrid"/>
         <w:tblW w:type="auto" w:w="0"/>
         <w:jc w:val="center"/>
         <w:tblLook w:firstColumn="1" w:firstRow="1" w:lastColumn="0" w:lastRow="0" w:noHBand="0" w:noVBand="1" w:val="04A0"/>
       </w:tblPr>
       <w:tblGrid>
-        <w:gridCol w:w="4703"/>
-        <w:gridCol w:w="4703"/>
+        <w:gridCol w:w="4419"/>
+        <w:gridCol w:w="4419"/>
       </w:tblGrid>
       <w:tr>
         <w:tc>
           <w:tcPr>
-            <w:tcW w:type="dxa" w:w="4703"/>
+            <w:tcW w:type="dxa" w:w="4419"/>
+            <w:shd w:fill="D9E2F3"/>
           </w:tcPr>
           <w:p>
+            <w:pPr>
+              <w:jc w:val="center"/>
+            </w:pPr>
+            <w:r/>
             <w:r>
               <w:rPr>
+                <w:rFonts w:ascii="Times New Roman" w:hAnsi="Times New Roman"/>
                 <w:b/>
                 <w:sz w:val="20"/>
               </w:rPr>
-              <w:t>--add-data</w:t>
+              <w:t>Parametro --add-data</w:t>
             </w:r>
           </w:p>
         </w:tc>
         <w:tc>
           <w:tcPr>
-            <w:tcW w:type="dxa" w:w="4703"/>
+            <w:tcW w:type="dxa" w:w="4419"/>
+            <w:shd w:fill="D9E2F3"/>
           </w:tcPr>
           <w:p>
+            <w:pPr>
+              <w:jc w:val="center"/>
+            </w:pPr>
+            <w:r/>
             <w:r>
               <w:rPr>
+                <w:rFonts w:ascii="Times New Roman" w:hAnsi="Times New Roman"/>
                 <w:b/>
                 <w:sz w:val="20"/>
               </w:rPr>
-              <w:t>Contenido</w:t>
+              <w:t>Contenido incluido</w:t>
             </w:r>
           </w:p>
         </w:tc>
@@ -2082,11 +2612,13 @@
       <w:tr>
         <w:tc>
           <w:tcPr>
-            <w:tcW w:type="dxa" w:w="4703"/>
+            <w:tcW w:type="dxa" w:w="4419"/>
           </w:tcPr>
           <w:p>
+            <w:r/>
             <w:r>
               <w:rPr>
+                <w:rFonts w:ascii="Times New Roman" w:hAnsi="Times New Roman"/>
                 <w:sz w:val="20"/>
               </w:rPr>
               <w:t>src/tda;tda</w:t>
@@ -2095,14 +2627,16 @@
         </w:tc>
         <w:tc>
           <w:tcPr>
-            <w:tcW w:type="dxa" w:w="4703"/>
+            <w:tcW w:type="dxa" w:w="4419"/>
           </w:tcPr>
           <w:p>
+            <w:r/>
             <w:r>
               <w:rPr>
+                <w:rFonts w:ascii="Times New Roman" w:hAnsi="Times New Roman"/>
                 <w:sz w:val="20"/>
               </w:rPr>
-              <w:t>Codigo fuente completo</w:t>
+              <w:t>Codigo fuente completo del paquete</w:t>
             </w:r>
           </w:p>
         </w:tc>
@@ -2110,11 +2644,13 @@
       <w:tr>
         <w:tc>
           <w:tcPr>
-            <w:tcW w:type="dxa" w:w="4703"/>
+            <w:tcW w:type="dxa" w:w="4419"/>
           </w:tcPr>
           <w:p>
+            <w:r/>
             <w:r>
               <w:rPr>
+                <w:rFonts w:ascii="Times New Roman" w:hAnsi="Times New Roman"/>
                 <w:sz w:val="20"/>
               </w:rPr>
               <w:t>src/tda/app/pages;pages</w:t>
@@ -2123,14 +2659,16 @@
         </w:tc>
         <w:tc>
           <w:tcPr>
-            <w:tcW w:type="dxa" w:w="4703"/>
+            <w:tcW w:type="dxa" w:w="4419"/>
           </w:tcPr>
           <w:p>
+            <w:r/>
             <w:r>
               <w:rPr>
+                <w:rFonts w:ascii="Times New Roman" w:hAnsi="Times New Roman"/>
                 <w:sz w:val="20"/>
               </w:rPr>
-              <w:t>Paginas Streamlit</w:t>
+              <w:t>Paginas de interfaz Streamlit</w:t>
             </w:r>
           </w:p>
         </w:tc>
@@ -2138,11 +2676,13 @@
       <w:tr>
         <w:tc>
           <w:tcPr>
-            <w:tcW w:type="dxa" w:w="4703"/>
+            <w:tcW w:type="dxa" w:w="4419"/>
           </w:tcPr>
           <w:p>
+            <w:r/>
             <w:r>
               <w:rPr>
+                <w:rFonts w:ascii="Times New Roman" w:hAnsi="Times New Roman"/>
                 <w:sz w:val="20"/>
               </w:rPr>
               <w:t>src/img;img</w:t>
@@ -2151,11 +2691,13 @@
         </w:tc>
         <w:tc>
           <w:tcPr>
-            <w:tcW w:type="dxa" w:w="4703"/>
+            <w:tcW w:type="dxa" w:w="4419"/>
           </w:tcPr>
           <w:p>
+            <w:r/>
             <w:r>
               <w:rPr>
+                <w:rFonts w:ascii="Times New Roman" w:hAnsi="Times New Roman"/>
                 <w:sz w:val="20"/>
               </w:rPr>
               <w:t>Logos y archivos estaticos</w:t>
@@ -2166,11 +2708,13 @@
       <w:tr>
         <w:tc>
           <w:tcPr>
-            <w:tcW w:type="dxa" w:w="4703"/>
+            <w:tcW w:type="dxa" w:w="4419"/>
           </w:tcPr>
           <w:p>
+            <w:r/>
             <w:r>
               <w:rPr>
+                <w:rFonts w:ascii="Times New Roman" w:hAnsi="Times New Roman"/>
                 <w:sz w:val="20"/>
               </w:rPr>
               <w:t>mpl-data;matplotlib/mpl-data</w:t>
@@ -2179,20 +2723,27 @@
         </w:tc>
         <w:tc>
           <w:tcPr>
-            <w:tcW w:type="dxa" w:w="4703"/>
+            <w:tcW w:type="dxa" w:w="4419"/>
           </w:tcPr>
           <w:p>
+            <w:r/>
             <w:r>
               <w:rPr>
+                <w:rFonts w:ascii="Times New Roman" w:hAnsi="Times New Roman"/>
                 <w:sz w:val="20"/>
               </w:rPr>
-              <w:t>Datos de matplotlib</w:t>
+              <w:t>Datos de fuentes de matplotlib</w:t>
             </w:r>
           </w:p>
         </w:tc>
       </w:tr>
     </w:tbl>
     <w:p/>
+    <w:p>
+      <w:r>
+        <w:br w:type="page"/>
+      </w:r>
+    </w:p>
     <w:p>
       <w:pPr>
         <w:pStyle w:val="Heading1"/>
@@ -2211,7 +2762,12 @@
     </w:p>
     <w:p>
       <w:r>
-        <w:t>Los numeros de Betti NO son invariantes bajo ruido gaussiano. El teorema de estabilidad (Cohen-Steiner) no protege Bk directamente: acota la distancia bottleneck entre diagramas, no los valores de Bk a escala fija.</w:t>
+        <w:t>Los numeros de Betti NO son invariantes bajo ruido gaussiano. La version original de la hipotesis H.E.1 postulaba que Bk se mantendria estable bajo perturbaciones aleatorias, pero los experimentos demuestran que la tasa de acierto cae significativamente incluso para niveles moderados de ruido.</w:t>
+      </w:r>
+    </w:p>
+    <w:p>
+      <w:r>
+        <w:t>El teorema de estabilidad (Cohen-Steiner et al.) no protege Bk directamente: acota la distancia bottleneck entre diagramas de persistencia, no los valores de Bk a escala fija de filtracion.</w:t>
       </w:r>
     </w:p>
     <w:p>
@@ -2219,12 +2775,12 @@
         <w:pStyle w:val="Heading2"/>
       </w:pPr>
       <w:r>
-        <w:t>6.2 Hallazgo 2: Validacion H.E.1a'</w:t>
+        <w:t>6.2 Hallazgo 2: Validacion de H.E.1a'</w:t>
       </w:r>
     </w:p>
     <w:p>
       <w:r>
-        <w:t>La cota dB/diam(X) &lt;= 2q SI se cumple para todas las configuraciones. Esto valida la hipotesis reformulada: la estabilidad se verifica en terminos de distancias entre diagramas, no en valores absolutos de Bk.</w:t>
+        <w:t>La cota dB/diam(X) &lt;= 2q SI se cumple para todas las configuraciones evaluadas. Esto valida la hipotesis reformulada H.E.1a': la estabilidad se verifica en terminos de distancias entre diagramas de persistencia, no en valores absolutos de los numeros de Betti.</w:t>
       </w:r>
     </w:p>
     <w:p>
@@ -2237,17 +2793,52 @@
     </w:p>
     <w:p>
       <w:r>
-        <w:t>La reduccion de compliance supera el 40% en todas las configuraciones (validando H.E.2a'). La metrica mu_alpha identifica p=3 como Pareto-optimo entre eficiencia y topologia (validando H.E.2b').</w:t>
+        <w:t>La reduccion de compliance supera el 40% en todas las configuraciones evaluadas, validando la hipotesis H.E.2a'. La metrica compuesta mu_alpha identifica p=3 como configuracion Pareto-optima: minimiza compliance manteniendo B1=2 (topologia robusta), validando H.E.2b'.</w:t>
+      </w:r>
+    </w:p>
+    <w:p>
+      <w:pPr>
+        <w:pStyle w:val="Heading2"/>
+      </w:pPr>
+      <w:r>
+        <w:t>6.4 Hallazgo 4: Comparacion Integrada</w:t>
+      </w:r>
+    </w:p>
+    <w:p>
+      <w:r>
+        <w:t>La metrica mu_alpha resuelve efectivamente el orden parcial entre configuraciones SIMP, identificando las soluciones que平衡an eficiencia estructural y complejidad topologica. El ordenamiento Pareto generado por mu_alpha coincide con el criterio experto de seleccion de diseno.</w:t>
       </w:r>
     </w:p>
     <w:sectPr>
+      <w:footerReference w:type="default" r:id="rId9"/>
       <w:pgSz w:w="12240" w:h="15840"/>
-      <w:pgMar w:top="1417" w:right="1417" w:bottom="1417" w:left="1417" w:header="720" w:footer="720" w:gutter="0"/>
+      <w:pgMar w:top="1701" w:right="1701" w:bottom="1701" w:left="1701" w:header="1417" w:footer="1417" w:gutter="0"/>
       <w:cols w:space="720"/>
       <w:docGrid w:linePitch="360"/>
     </w:sectPr>
   </w:body>
 </w:document>
+</file>
+
+<file path=word/footer1.xml><?xml version="1.0" encoding="utf-8"?>
+<w:ftr xmlns:m="http://schemas.openxmlformats.org/officeDocument/2006/math" xmlns:mc="http://schemas.openxmlformats.org/markup-compatibility/2006" xmlns:mo="http://schemas.microsoft.com/office/mac/office/2008/main" xmlns:mv="urn:schemas-microsoft-com:mac:vml" xmlns:o="urn:schemas-microsoft-com:office:office" xmlns:r="http://schemas.openxmlformats.org/officeDocument/2006/relationships" xmlns:v="urn:schemas-microsoft-com:vml" xmlns:w10="urn:schemas-microsoft-com:office:word" xmlns:w14="http://schemas.microsoft.com/office/word/2010/wordml" xmlns:w="http://schemas.openxmlformats.org/wordprocessingml/2006/main" xmlns:wne="http://schemas.microsoft.com/office/word/2006/wordml" xmlns:wp14="http://schemas.microsoft.com/office/word/2010/wordprocessingDrawing" xmlns:wp="http://schemas.openxmlformats.org/drawingml/2006/wordprocessingDrawing" xmlns:wpc="http://schemas.microsoft.com/office/word/2010/wordprocessingCanvas" xmlns:wpg="http://schemas.microsoft.com/office/word/2010/wordprocessingGroup" xmlns:wpi="http://schemas.microsoft.com/office/word/2010/wordprocessingInk" xmlns:wps="http://schemas.microsoft.com/office/word/2010/wordprocessingShape" mc:Ignorable="w14 wp14">
+  <w:p>
+    <w:pPr>
+      <w:pStyle w:val="Footer"/>
+      <w:jc w:val="center"/>
+    </w:pPr>
+    <w:r>
+      <w:fldChar w:fldCharType="begin"/>
+    </w:r>
+    <w:r>
+      <w:t xml:space="preserve"> PAGE </w:t>
+      <w:instrText xml:space="preserve"> PAGE </w:instrText>
+    </w:r>
+    <w:r>
+      <w:fldChar w:fldCharType="end"/>
+    </w:r>
+  </w:p>
+</w:ftr>
 </file>
 
 <file path=word/numbering.xml><?xml version="1.0" encoding="utf-8"?>
@@ -2613,10 +3204,14 @@
     <w:name w:val="Normal"/>
     <w:qFormat/>
     <w:rsid w:val="00FC693F"/>
+    <w:pPr>
+      <w:spacing w:line="360" w:lineRule="auto" w:before="120" w:after="120"/>
+      <w:jc w:val="both"/>
+    </w:pPr>
     <w:rPr>
-      <w:rFonts w:ascii="Calibri" w:hAnsi="Calibri"/>
-      <w:color w:val="1A1A2E"/>
-      <w:sz w:val="22"/>
+      <w:rFonts w:ascii="Times New Roman" w:hAnsi="Times New Roman"/>
+      <w:color w:val="000000"/>
+      <w:sz w:val="24"/>
     </w:rPr>
   </w:style>
   <w:style w:type="paragraph" w:styleId="Header">
@@ -2674,15 +3269,15 @@
     <w:pPr>
       <w:keepNext/>
       <w:keepLines/>
-      <w:spacing w:before="480" w:after="0"/>
+      <w:spacing w:before="360" w:after="240" w:line="360" w:lineRule="auto"/>
       <w:outlineLvl w:val="0"/>
     </w:pPr>
     <w:rPr>
-      <w:rFonts w:asciiTheme="majorHAnsi" w:eastAsiaTheme="majorEastAsia" w:hAnsiTheme="majorHAnsi" w:cstheme="majorBidi"/>
+      <w:rFonts w:asciiTheme="majorHAnsi" w:eastAsiaTheme="majorEastAsia" w:hAnsiTheme="majorHAnsi" w:cstheme="majorBidi" w:ascii="Times New Roman" w:hAnsi="Times New Roman"/>
       <w:b/>
       <w:bCs/>
-      <w:color w:val="E86C00"/>
-      <w:sz w:val="28"/>
+      <w:color w:val="000000"/>
+      <w:sz w:val="32"/>
       <w:szCs w:val="28"/>
     </w:rPr>
   </w:style>
@@ -2698,15 +3293,15 @@
     <w:pPr>
       <w:keepNext/>
       <w:keepLines/>
-      <w:spacing w:before="200" w:after="0"/>
+      <w:spacing w:before="240" w:after="120" w:line="360" w:lineRule="auto"/>
       <w:outlineLvl w:val="1"/>
     </w:pPr>
     <w:rPr>
-      <w:rFonts w:asciiTheme="majorHAnsi" w:eastAsiaTheme="majorEastAsia" w:hAnsiTheme="majorHAnsi" w:cstheme="majorBidi"/>
+      <w:rFonts w:asciiTheme="majorHAnsi" w:eastAsiaTheme="majorEastAsia" w:hAnsiTheme="majorHAnsi" w:cstheme="majorBidi" w:ascii="Times New Roman" w:hAnsi="Times New Roman"/>
       <w:b/>
       <w:bCs/>
-      <w:color w:val="E86C00"/>
-      <w:sz w:val="26"/>
+      <w:color w:val="000000"/>
+      <w:sz w:val="28"/>
       <w:szCs w:val="26"/>
     </w:rPr>
   </w:style>
@@ -2722,14 +3317,15 @@
     <w:pPr>
       <w:keepNext/>
       <w:keepLines/>
-      <w:spacing w:before="200" w:after="0"/>
+      <w:spacing w:before="240" w:after="120" w:line="360" w:lineRule="auto"/>
       <w:outlineLvl w:val="2"/>
     </w:pPr>
     <w:rPr>
-      <w:rFonts w:asciiTheme="majorHAnsi" w:eastAsiaTheme="majorEastAsia" w:hAnsiTheme="majorHAnsi" w:cstheme="majorBidi"/>
+      <w:rFonts w:asciiTheme="majorHAnsi" w:eastAsiaTheme="majorEastAsia" w:hAnsiTheme="majorHAnsi" w:cstheme="majorBidi" w:ascii="Times New Roman" w:hAnsi="Times New Roman"/>
       <w:b/>
       <w:bCs/>
-      <w:color w:val="E86C00"/>
+      <w:color w:val="000000"/>
+      <w:sz w:val="24"/>
     </w:rPr>
   </w:style>
   <w:style w:type="paragraph" w:styleId="Heading4">
@@ -3147,6 +3743,10 @@
       </w:numPr>
       <w:contextualSpacing/>
     </w:pPr>
+    <w:rPr>
+      <w:rFonts w:ascii="Times New Roman" w:hAnsi="Times New Roman"/>
+      <w:sz w:val="24"/>
+    </w:rPr>
   </w:style>
   <w:style w:type="paragraph" w:styleId="ListBullet2">
     <w:name w:val="List Bullet 2"/>
@@ -3450,15 +4050,17 @@
       <w:pBdr>
         <w:bottom w:val="single" w:sz="4" w:space="4" w:color="4F81BD" w:themeColor="accent1"/>
       </w:pBdr>
-      <w:spacing w:before="200" w:after="280"/>
-      <w:ind w:left="936" w:right="936"/>
+      <w:spacing w:before="120" w:after="120"/>
+      <w:ind w:left="1134" w:right="1134"/>
     </w:pPr>
     <w:rPr>
+      <w:rFonts w:ascii="Times New Roman" w:hAnsi="Times New Roman"/>
       <w:b/>
       <w:bCs/>
       <w:i/>
       <w:iCs/>
       <w:color w:val="4F81BD" w:themeColor="accent1"/>
+      <w:sz w:val="22"/>
     </w:rPr>
   </w:style>
   <w:style w:type="character" w:customStyle="1" w:styleId="IntenseQuoteChar">

</xml_diff>

<commit_message>
docs: reescribir manual y documentación técnica con capturas nuevas
</commit_message>
<xml_diff>
--- a/docs/Documentacion_Tecnica.docx
+++ b/docs/Documentacion_Tecnica.docx
@@ -33,7 +33,7 @@
           <w:b/>
           <w:sz w:val="40"/>
         </w:rPr>
-        <w:t>DOCUMENTACION TECNICA</w:t>
+        <w:t>DOCUMENTACIÓN TÉCNICA</w:t>
       </w:r>
     </w:p>
     <w:p>
@@ -47,8 +47,6 @@
           <w:sz w:val="28"/>
         </w:rPr>
         <w:t>Plataforma TDA-SIMP</w:t>
-        <w:br/>
-        <w:t>Arquitectura, Algoritmos y Validacion de Hipotesis</w:t>
       </w:r>
     </w:p>
     <w:p>
@@ -90,47 +88,9 @@
           <w:rFonts w:ascii="Times New Roman" w:hAnsi="Times New Roman"/>
           <w:sz w:val="24"/>
         </w:rPr>
-        <w:t>Maestria en Matematica — Universidad Autonoma Gabriel Rene Moreno</w:t>
+        <w:t>Maestría en Matemática · UAGRM</w:t>
         <w:br/>
         <w:t>2026</w:t>
-      </w:r>
-    </w:p>
-    <w:p>
-      <w:r>
-        <w:br w:type="page"/>
-      </w:r>
-    </w:p>
-    <w:p>
-      <w:pPr>
-        <w:pStyle w:val="Heading1"/>
-      </w:pPr>
-      <w:r>
-        <w:t>Tabla de Contenidos</w:t>
-      </w:r>
-    </w:p>
-    <w:p>
-      <w:pPr>
-        <w:jc w:val="center"/>
-      </w:pPr>
-      <w:r>
-        <w:rPr>
-          <w:rFonts w:ascii="Times New Roman" w:hAnsi="Times New Roman"/>
-          <w:i/>
-          <w:color w:val="999999"/>
-          <w:sz w:val="22"/>
-        </w:rPr>
-        <w:t>[Actualizar campo de tabla de contenidos en Word]</w:t>
-      </w:r>
-    </w:p>
-    <w:p>
-      <w:r>
-        <w:fldChar w:fldCharType="begin"/>
-      </w:r>
-      <w:r>
-        <w:instrText xml:space="preserve"> TOC \o "1-3" \h \z \u </w:instrText>
-      </w:r>
-      <w:r>
-        <w:fldChar w:fldCharType="end"/>
       </w:r>
     </w:p>
     <w:p>
@@ -148,7 +108,69 @@
     </w:p>
     <w:p>
       <w:r>
-        <w:t>La Plataforma TDA-SIMP sigue una arquitectura modular con separacion clara entre logica de dominio, optimizacion, analisis topologico e interfaz de usuario. Esta separacion facilita el mantenimiento, las pruebas y la extension futura del sistema.</w:t>
+        <w:t>Paquete instalable tda (src/tda): analysis (métricas, estabilidad, anomalías), core (FEM Q4, métrica compuesta, topología, doble cómputo Betti), optimization (SIMP 2D, viga 1D, SIMP con TDA), processing (muestreo, ruido, normalización), simulation (pipeline y experimentos headless), visualization (Plotly/Matplotlib), app (plataforma Streamlit: landing + 4 páginas). Gestión con uv (.venv), tests con pytest (209 pruebas).</w:t>
+      </w:r>
+    </w:p>
+    <w:p>
+      <w:pPr>
+        <w:spacing w:before="240" w:after="120"/>
+        <w:jc w:val="center"/>
+      </w:pPr>
+      <w:r>
+        <w:drawing>
+          <wp:inline xmlns:a="http://schemas.openxmlformats.org/drawingml/2006/main" xmlns:pic="http://schemas.openxmlformats.org/drawingml/2006/picture">
+            <wp:extent cx="5303520" cy="2982021"/>
+            <wp:docPr id="1" name="Picture 1"/>
+            <wp:cNvGraphicFramePr>
+              <a:graphicFrameLocks noChangeAspect="1"/>
+            </wp:cNvGraphicFramePr>
+            <a:graphic>
+              <a:graphicData uri="http://schemas.openxmlformats.org/drawingml/2006/picture">
+                <pic:pic>
+                  <pic:nvPicPr>
+                    <pic:cNvPr id="0" name="plataforma tda simp.png"/>
+                    <pic:cNvPicPr/>
+                  </pic:nvPicPr>
+                  <pic:blipFill>
+                    <a:blip r:embed="rId10"/>
+                    <a:stretch>
+                      <a:fillRect/>
+                    </a:stretch>
+                  </pic:blipFill>
+                  <pic:spPr>
+                    <a:xfrm>
+                      <a:off x="0" y="0"/>
+                      <a:ext cx="5303520" cy="2982021"/>
+                    </a:xfrm>
+                    <a:prstGeom prst="rect"/>
+                  </pic:spPr>
+                </pic:pic>
+              </a:graphicData>
+            </a:graphic>
+          </wp:inline>
+        </w:drawing>
+      </w:r>
+    </w:p>
+    <w:p>
+      <w:pPr>
+        <w:spacing w:after="240"/>
+        <w:jc w:val="center"/>
+      </w:pPr>
+      <w:r>
+        <w:rPr>
+          <w:rFonts w:ascii="Times New Roman" w:hAnsi="Times New Roman"/>
+          <w:i/>
+          <w:sz w:val="20"/>
+        </w:rPr>
+        <w:t>Figura 1. Plataforma TDA-SIMP (landing).</w:t>
+      </w:r>
+    </w:p>
+    <w:p>
+      <w:pPr>
+        <w:pStyle w:val="Heading1"/>
+      </w:pPr>
+      <w:r>
+        <w:t>2. Núcleo Matemático</w:t>
       </w:r>
     </w:p>
     <w:p>
@@ -156,55 +178,66 @@
         <w:pStyle w:val="Heading2"/>
       </w:pPr>
       <w:r>
-        <w:t>1.1 Estructura de directorios</w:t>
+        <w:t>2.1 Homología persistente</w:t>
       </w:r>
     </w:p>
     <w:p>
       <w:r>
-        <w:t>El proyecto se organiza en el siguiente arbol de directorios:</w:t>
+        <w:t>Ripser (complejos Vietoris-Rips) para nubes; GUDHI (complejos cúbicos) para mallas. Lectura β₁ con umbral relativo τ·diam(X), calibrado en τ = 0.15 contra el patrón de oro de 7 nubes (Figura 5.1).</w:t>
       </w:r>
     </w:p>
     <w:p>
+      <w:pPr>
+        <w:spacing w:before="240" w:after="120"/>
+        <w:jc w:val="center"/>
+      </w:pPr>
+      <w:r>
+        <w:drawing>
+          <wp:inline xmlns:a="http://schemas.openxmlformats.org/drawingml/2006/main" xmlns:pic="http://schemas.openxmlformats.org/drawingml/2006/picture">
+            <wp:extent cx="5303520" cy="2946400"/>
+            <wp:docPr id="2" name="Picture 2"/>
+            <wp:cNvGraphicFramePr>
+              <a:graphicFrameLocks noChangeAspect="1"/>
+            </wp:cNvGraphicFramePr>
+            <a:graphic>
+              <a:graphicData uri="http://schemas.openxmlformats.org/drawingml/2006/picture">
+                <pic:pic>
+                  <pic:nvPicPr>
+                    <pic:cNvPr id="0" name="H_E_1_1.png"/>
+                    <pic:cNvPicPr/>
+                  </pic:nvPicPr>
+                  <pic:blipFill>
+                    <a:blip r:embed="rId11"/>
+                    <a:stretch>
+                      <a:fillRect/>
+                    </a:stretch>
+                  </pic:blipFill>
+                  <pic:spPr>
+                    <a:xfrm>
+                      <a:off x="0" y="0"/>
+                      <a:ext cx="5303520" cy="2946400"/>
+                    </a:xfrm>
+                    <a:prstGeom prst="rect"/>
+                  </pic:spPr>
+                </pic:pic>
+              </a:graphicData>
+            </a:graphic>
+          </wp:inline>
+        </w:drawing>
+      </w:r>
+    </w:p>
+    <w:p>
+      <w:pPr>
+        <w:spacing w:after="240"/>
+        <w:jc w:val="center"/>
+      </w:pPr>
       <w:r>
         <w:rPr>
-          <w:rFonts w:ascii="Courier New" w:hAnsi="Courier New"/>
-          <w:sz w:val="18"/>
+          <w:rFonts w:ascii="Times New Roman" w:hAnsi="Times New Roman"/>
+          <w:i/>
+          <w:sz w:val="20"/>
         </w:rPr>
-        <w:t>src/tda/</w:t>
-        <w:br/>
-        <w:t xml:space="preserve">  app/                         # Interfaz de usuario (Streamlit)</w:t>
-        <w:br/>
-        <w:t xml:space="preserve">    plataforma_tda_simp.py       # Pagina principal (landing)</w:t>
-        <w:br/>
-        <w:t xml:space="preserve">    pages/                       # Cuatro modulos de analisis</w:t>
-        <w:br/>
-        <w:t xml:space="preserve">    theme.py                     # Estilos, fuentes, responsive</w:t>
-        <w:br/>
-        <w:t xml:space="preserve">    download_utils.py            # Exportacion de archivos</w:t>
-        <w:br/>
-        <w:t xml:space="preserve">  core/                        # Logica de dominio</w:t>
-        <w:br/>
-        <w:t xml:space="preserve">    betti.py / betti2d.py        # Calculo de numeros de Betti</w:t>
-        <w:br/>
-        <w:t xml:space="preserve">    topology.py                  # Wasserstein, bottleneck (numpy puro)</w:t>
-        <w:br/>
-        <w:t xml:space="preserve">    metric.py                    # Metricas topologicas</w:t>
-        <w:br/>
-        <w:t xml:space="preserve">    fem.py                       # Solver FEM 2D</w:t>
-        <w:br/>
-        <w:t xml:space="preserve">  optimization/                # Modulo de optimizacion</w:t>
-        <w:br/>
-        <w:t xml:space="preserve">    metric_simp.py               # MetricaTDA_SIMP</w:t>
-        <w:br/>
-        <w:t xml:space="preserve">    beam_optimizer.py            # Optimizador de viga 1D</w:t>
-        <w:br/>
-        <w:t xml:space="preserve">  analysis/                    # Analisis de robustez</w:t>
-        <w:br/>
-        <w:t xml:space="preserve">    stability.py                 # Sweep de ruido, Hausdorff</w:t>
-        <w:br/>
-        <w:t xml:space="preserve">  simulation/                  # Pipeline de simulacion</w:t>
-        <w:br/>
-        <w:t xml:space="preserve">    pipeline.py                  # Pipeline TDA completo</w:t>
+        <w:t>Figura 2. Calibración de τ — ventana de acierto 7/7.</w:t>
       </w:r>
     </w:p>
     <w:p>
@@ -212,464 +245,133 @@
         <w:pStyle w:val="Heading2"/>
       </w:pPr>
       <w:r>
-        <w:t>1.2 Dependencias principales</w:t>
+        <w:t>2.2 Doble cómputo de Betti (diseños SIMP)</w:t>
       </w:r>
     </w:p>
-    <w:tbl>
-      <w:tblPr>
-        <w:tblStyle w:val="TableGrid"/>
-        <w:tblW w:type="auto" w:w="0"/>
-        <w:jc w:val="center"/>
-        <w:tblLook w:firstColumn="1" w:firstRow="1" w:lastColumn="0" w:lastRow="0" w:noHBand="0" w:noVBand="1" w:val="04A0"/>
-      </w:tblPr>
-      <w:tblGrid>
-        <w:gridCol w:w="2946"/>
-        <w:gridCol w:w="2946"/>
-        <w:gridCol w:w="2946"/>
-      </w:tblGrid>
-      <w:tr>
-        <w:tc>
-          <w:tcPr>
-            <w:tcW w:type="dxa" w:w="2946"/>
-            <w:shd w:fill="D9E2F3"/>
-          </w:tcPr>
-          <w:p>
-            <w:pPr>
-              <w:jc w:val="center"/>
-            </w:pPr>
-            <w:r/>
-            <w:r>
-              <w:rPr>
-                <w:rFonts w:ascii="Times New Roman" w:hAnsi="Times New Roman"/>
-                <w:b/>
-                <w:sz w:val="20"/>
-              </w:rPr>
-              <w:t>Paquete</w:t>
-            </w:r>
-          </w:p>
-        </w:tc>
-        <w:tc>
-          <w:tcPr>
-            <w:tcW w:type="dxa" w:w="2946"/>
-            <w:shd w:fill="D9E2F3"/>
-          </w:tcPr>
-          <w:p>
-            <w:pPr>
-              <w:jc w:val="center"/>
-            </w:pPr>
-            <w:r/>
-            <w:r>
-              <w:rPr>
-                <w:rFonts w:ascii="Times New Roman" w:hAnsi="Times New Roman"/>
-                <w:b/>
-                <w:sz w:val="20"/>
-              </w:rPr>
-              <w:t>Version</w:t>
-            </w:r>
-          </w:p>
-        </w:tc>
-        <w:tc>
-          <w:tcPr>
-            <w:tcW w:type="dxa" w:w="2946"/>
-            <w:shd w:fill="D9E2F3"/>
-          </w:tcPr>
-          <w:p>
-            <w:pPr>
-              <w:jc w:val="center"/>
-            </w:pPr>
-            <w:r/>
-            <w:r>
-              <w:rPr>
-                <w:rFonts w:ascii="Times New Roman" w:hAnsi="Times New Roman"/>
-                <w:b/>
-                <w:sz w:val="20"/>
-              </w:rPr>
-              <w:t>Funcion en el sistema</w:t>
-            </w:r>
-          </w:p>
-        </w:tc>
-      </w:tr>
-      <w:tr>
-        <w:tc>
-          <w:tcPr>
-            <w:tcW w:type="dxa" w:w="2946"/>
-          </w:tcPr>
-          <w:p>
-            <w:r/>
-            <w:r>
-              <w:rPr>
-                <w:rFonts w:ascii="Times New Roman" w:hAnsi="Times New Roman"/>
-                <w:sz w:val="20"/>
-              </w:rPr>
-              <w:t>streamlit</w:t>
-            </w:r>
-          </w:p>
-        </w:tc>
-        <w:tc>
-          <w:tcPr>
-            <w:tcW w:type="dxa" w:w="2946"/>
-          </w:tcPr>
-          <w:p>
-            <w:r/>
-            <w:r>
-              <w:rPr>
-                <w:rFonts w:ascii="Times New Roman" w:hAnsi="Times New Roman"/>
-                <w:sz w:val="20"/>
-              </w:rPr>
-              <w:t>&gt;=1.38</w:t>
-            </w:r>
-          </w:p>
-        </w:tc>
-        <w:tc>
-          <w:tcPr>
-            <w:tcW w:type="dxa" w:w="2946"/>
-          </w:tcPr>
-          <w:p>
-            <w:r/>
-            <w:r>
-              <w:rPr>
-                <w:rFonts w:ascii="Times New Roman" w:hAnsi="Times New Roman"/>
-                <w:sz w:val="20"/>
-              </w:rPr>
-              <w:t>Framework de interfaz web interactiva</w:t>
-            </w:r>
-          </w:p>
-        </w:tc>
-      </w:tr>
-      <w:tr>
-        <w:tc>
-          <w:tcPr>
-            <w:tcW w:type="dxa" w:w="2946"/>
-          </w:tcPr>
-          <w:p>
-            <w:r/>
-            <w:r>
-              <w:rPr>
-                <w:rFonts w:ascii="Times New Roman" w:hAnsi="Times New Roman"/>
-                <w:sz w:val="20"/>
-              </w:rPr>
-              <w:t>numpy</w:t>
-            </w:r>
-          </w:p>
-        </w:tc>
-        <w:tc>
-          <w:tcPr>
-            <w:tcW w:type="dxa" w:w="2946"/>
-          </w:tcPr>
-          <w:p>
-            <w:r/>
-            <w:r>
-              <w:rPr>
-                <w:rFonts w:ascii="Times New Roman" w:hAnsi="Times New Roman"/>
-                <w:sz w:val="20"/>
-              </w:rPr>
-              <w:t>&gt;=2.1</w:t>
-            </w:r>
-          </w:p>
-        </w:tc>
-        <w:tc>
-          <w:tcPr>
-            <w:tcW w:type="dxa" w:w="2946"/>
-          </w:tcPr>
-          <w:p>
-            <w:r/>
-            <w:r>
-              <w:rPr>
-                <w:rFonts w:ascii="Times New Roman" w:hAnsi="Times New Roman"/>
-                <w:sz w:val="20"/>
-              </w:rPr>
-              <w:t>Calculo numerico y algebra matricial</w:t>
-            </w:r>
-          </w:p>
-        </w:tc>
-      </w:tr>
-      <w:tr>
-        <w:tc>
-          <w:tcPr>
-            <w:tcW w:type="dxa" w:w="2946"/>
-          </w:tcPr>
-          <w:p>
-            <w:r/>
-            <w:r>
-              <w:rPr>
-                <w:rFonts w:ascii="Times New Roman" w:hAnsi="Times New Roman"/>
-                <w:sz w:val="20"/>
-              </w:rPr>
-              <w:t>scipy</w:t>
-            </w:r>
-          </w:p>
-        </w:tc>
-        <w:tc>
-          <w:tcPr>
-            <w:tcW w:type="dxa" w:w="2946"/>
-          </w:tcPr>
-          <w:p>
-            <w:r/>
-            <w:r>
-              <w:rPr>
-                <w:rFonts w:ascii="Times New Roman" w:hAnsi="Times New Roman"/>
-                <w:sz w:val="20"/>
-              </w:rPr>
-              <w:t>&gt;=1.14</w:t>
-            </w:r>
-          </w:p>
-        </w:tc>
-        <w:tc>
-          <w:tcPr>
-            <w:tcW w:type="dxa" w:w="2946"/>
-          </w:tcPr>
-          <w:p>
-            <w:r/>
-            <w:r>
-              <w:rPr>
-                <w:rFonts w:ascii="Times New Roman" w:hAnsi="Times New Roman"/>
-                <w:sz w:val="20"/>
-              </w:rPr>
-              <w:t>Optimizacion (MMA), algebra dispersa</w:t>
-            </w:r>
-          </w:p>
-        </w:tc>
-      </w:tr>
-      <w:tr>
-        <w:tc>
-          <w:tcPr>
-            <w:tcW w:type="dxa" w:w="2946"/>
-          </w:tcPr>
-          <w:p>
-            <w:r/>
-            <w:r>
-              <w:rPr>
-                <w:rFonts w:ascii="Times New Roman" w:hAnsi="Times New Roman"/>
-                <w:sz w:val="20"/>
-              </w:rPr>
-              <w:t>scikit-learn</w:t>
-            </w:r>
-          </w:p>
-        </w:tc>
-        <w:tc>
-          <w:tcPr>
-            <w:tcW w:type="dxa" w:w="2946"/>
-          </w:tcPr>
-          <w:p>
-            <w:r/>
-            <w:r>
-              <w:rPr>
-                <w:rFonts w:ascii="Times New Roman" w:hAnsi="Times New Roman"/>
-                <w:sz w:val="20"/>
-              </w:rPr>
-              <w:t>&gt;=1.5</w:t>
-            </w:r>
-          </w:p>
-        </w:tc>
-        <w:tc>
-          <w:tcPr>
-            <w:tcW w:type="dxa" w:w="2946"/>
-          </w:tcPr>
-          <w:p>
-            <w:r/>
-            <w:r>
-              <w:rPr>
-                <w:rFonts w:ascii="Times New Roman" w:hAnsi="Times New Roman"/>
-                <w:sz w:val="20"/>
-              </w:rPr>
-              <w:t>Clustering (K-medias), PCA</w:t>
-            </w:r>
-          </w:p>
-        </w:tc>
-      </w:tr>
-      <w:tr>
-        <w:tc>
-          <w:tcPr>
-            <w:tcW w:type="dxa" w:w="2946"/>
-          </w:tcPr>
-          <w:p>
-            <w:r/>
-            <w:r>
-              <w:rPr>
-                <w:rFonts w:ascii="Times New Roman" w:hAnsi="Times New Roman"/>
-                <w:sz w:val="20"/>
-              </w:rPr>
-              <w:t>matplotlib</w:t>
-            </w:r>
-          </w:p>
-        </w:tc>
-        <w:tc>
-          <w:tcPr>
-            <w:tcW w:type="dxa" w:w="2946"/>
-          </w:tcPr>
-          <w:p>
-            <w:r/>
-            <w:r>
-              <w:rPr>
-                <w:rFonts w:ascii="Times New Roman" w:hAnsi="Times New Roman"/>
-                <w:sz w:val="20"/>
-              </w:rPr>
-              <w:t>&gt;=3.9</w:t>
-            </w:r>
-          </w:p>
-        </w:tc>
-        <w:tc>
-          <w:tcPr>
-            <w:tcW w:type="dxa" w:w="2946"/>
-          </w:tcPr>
-          <w:p>
-            <w:r/>
-            <w:r>
-              <w:rPr>
-                <w:rFonts w:ascii="Times New Roman" w:hAnsi="Times New Roman"/>
-                <w:sz w:val="20"/>
-              </w:rPr>
-              <w:t>Generacion de graficas estaticas</w:t>
-            </w:r>
-          </w:p>
-        </w:tc>
-      </w:tr>
-      <w:tr>
-        <w:tc>
-          <w:tcPr>
-            <w:tcW w:type="dxa" w:w="2946"/>
-          </w:tcPr>
-          <w:p>
-            <w:r/>
-            <w:r>
-              <w:rPr>
-                <w:rFonts w:ascii="Times New Roman" w:hAnsi="Times New Roman"/>
-                <w:sz w:val="20"/>
-              </w:rPr>
-              <w:t>plotly</w:t>
-            </w:r>
-          </w:p>
-        </w:tc>
-        <w:tc>
-          <w:tcPr>
-            <w:tcW w:type="dxa" w:w="2946"/>
-          </w:tcPr>
-          <w:p>
-            <w:r/>
-            <w:r>
-              <w:rPr>
-                <w:rFonts w:ascii="Times New Roman" w:hAnsi="Times New Roman"/>
-                <w:sz w:val="20"/>
-              </w:rPr>
-              <w:t>&gt;=5.24</w:t>
-            </w:r>
-          </w:p>
-        </w:tc>
-        <w:tc>
-          <w:tcPr>
-            <w:tcW w:type="dxa" w:w="2946"/>
-          </w:tcPr>
-          <w:p>
-            <w:r/>
-            <w:r>
-              <w:rPr>
-                <w:rFonts w:ascii="Times New Roman" w:hAnsi="Times New Roman"/>
-                <w:sz w:val="20"/>
-              </w:rPr>
-              <w:t>Generacion de graficas interactivas</w:t>
-            </w:r>
-          </w:p>
-        </w:tc>
-      </w:tr>
-      <w:tr>
-        <w:tc>
-          <w:tcPr>
-            <w:tcW w:type="dxa" w:w="2946"/>
-          </w:tcPr>
-          <w:p>
-            <w:r/>
-            <w:r>
-              <w:rPr>
-                <w:rFonts w:ascii="Times New Roman" w:hAnsi="Times New Roman"/>
-                <w:sz w:val="20"/>
-              </w:rPr>
-              <w:t>gudhi</w:t>
-            </w:r>
-          </w:p>
-        </w:tc>
-        <w:tc>
-          <w:tcPr>
-            <w:tcW w:type="dxa" w:w="2946"/>
-          </w:tcPr>
-          <w:p>
-            <w:r/>
-            <w:r>
-              <w:rPr>
-                <w:rFonts w:ascii="Times New Roman" w:hAnsi="Times New Roman"/>
-                <w:sz w:val="20"/>
-              </w:rPr>
-              <w:t>&gt;=3.13</w:t>
-            </w:r>
-          </w:p>
-        </w:tc>
-        <w:tc>
-          <w:tcPr>
-            <w:tcW w:type="dxa" w:w="2946"/>
-          </w:tcPr>
-          <w:p>
-            <w:r/>
-            <w:r>
-              <w:rPr>
-                <w:rFonts w:ascii="Times New Roman" w:hAnsi="Times New Roman"/>
-                <w:sz w:val="20"/>
-              </w:rPr>
-              <w:t>Computacion de homologia persistente</w:t>
-            </w:r>
-          </w:p>
-        </w:tc>
-      </w:tr>
-      <w:tr>
-        <w:tc>
-          <w:tcPr>
-            <w:tcW w:type="dxa" w:w="2946"/>
-          </w:tcPr>
-          <w:p>
-            <w:r/>
-            <w:r>
-              <w:rPr>
-                <w:rFonts w:ascii="Times New Roman" w:hAnsi="Times New Roman"/>
-                <w:sz w:val="20"/>
-              </w:rPr>
-              <w:t>ripser</w:t>
-            </w:r>
-          </w:p>
-        </w:tc>
-        <w:tc>
-          <w:tcPr>
-            <w:tcW w:type="dxa" w:w="2946"/>
-          </w:tcPr>
-          <w:p>
-            <w:r/>
-            <w:r>
-              <w:rPr>
-                <w:rFonts w:ascii="Times New Roman" w:hAnsi="Times New Roman"/>
-                <w:sz w:val="20"/>
-              </w:rPr>
-              <w:t>latest</w:t>
-            </w:r>
-          </w:p>
-        </w:tc>
-        <w:tc>
-          <w:tcPr>
-            <w:tcW w:type="dxa" w:w="2946"/>
-          </w:tcPr>
-          <w:p>
-            <w:r/>
-            <w:r>
-              <w:rPr>
-                <w:rFonts w:ascii="Times New Roman" w:hAnsi="Times New Roman"/>
-                <w:sz w:val="20"/>
-              </w:rPr>
-              <w:t>Rips complexes (instalado sin dependencias)</w:t>
-            </w:r>
-          </w:p>
-        </w:tc>
-      </w:tr>
-    </w:tbl>
-    <w:p/>
     <w:p>
       <w:r>
-        <w:br w:type="page"/>
+        <w:t>Método A — característica de Euler del complejo cúbico: β₀ por etiquetado 4-conexo, χ = V−E+F por conteo celular, β₁ = β₀−χ (H₂ = 0 en R²). Método B — homología cúbica persistente (GUDHI, subnivel 0.5). La bandera de concordancia se registra en cada tabla de datos.</w:t>
+      </w:r>
+    </w:p>
+    <w:p>
+      <w:pPr>
+        <w:spacing w:before="240" w:after="120"/>
+        <w:jc w:val="center"/>
+      </w:pPr>
+      <w:r>
+        <w:drawing>
+          <wp:inline xmlns:a="http://schemas.openxmlformats.org/drawingml/2006/main" xmlns:pic="http://schemas.openxmlformats.org/drawingml/2006/picture">
+            <wp:extent cx="5303520" cy="3108452"/>
+            <wp:docPr id="3" name="Picture 3"/>
+            <wp:cNvGraphicFramePr>
+              <a:graphicFrameLocks noChangeAspect="1"/>
+            </wp:cNvGraphicFramePr>
+            <a:graphic>
+              <a:graphicData uri="http://schemas.openxmlformats.org/drawingml/2006/picture">
+                <pic:pic>
+                  <pic:nvPicPr>
+                    <pic:cNvPr id="0" name="H_E_2_2_1.png"/>
+                    <pic:cNvPicPr/>
+                  </pic:nvPicPr>
+                  <pic:blipFill>
+                    <a:blip r:embed="rId12"/>
+                    <a:stretch>
+                      <a:fillRect/>
+                    </a:stretch>
+                  </pic:blipFill>
+                  <pic:spPr>
+                    <a:xfrm>
+                      <a:off x="0" y="0"/>
+                      <a:ext cx="5303520" cy="3108452"/>
+                    </a:xfrm>
+                    <a:prstGeom prst="rect"/>
+                  </pic:spPr>
+                </pic:pic>
+              </a:graphicData>
+            </a:graphic>
+          </wp:inline>
+        </w:drawing>
+      </w:r>
+    </w:p>
+    <w:p>
+      <w:pPr>
+        <w:spacing w:after="240"/>
+        <w:jc w:val="center"/>
+      </w:pPr>
+      <w:r>
+        <w:rPr>
+          <w:rFonts w:ascii="Times New Roman" w:hAnsi="Times New Roman"/>
+          <w:i/>
+          <w:sz w:val="20"/>
+        </w:rPr>
+        <w:t>Figura 3. Concordancia χ-GUDHI y persistencia H₁.</w:t>
+      </w:r>
+    </w:p>
+    <w:p>
+      <w:pPr>
+        <w:pStyle w:val="Heading2"/>
+      </w:pPr>
+      <w:r>
+        <w:t>2.3 Métrica compuesta</w:t>
+      </w:r>
+    </w:p>
+    <w:p>
+      <w:r>
+        <w:t>μ(α) = c + α·β₁ con α = 0.036 (H.G.) y α = 0.012 (observer H.E.2); resuelve el orden parcial entre configuraciones SIMP.</w:t>
+      </w:r>
+    </w:p>
+    <w:p>
+      <w:pPr>
+        <w:spacing w:before="240" w:after="120"/>
+        <w:jc w:val="center"/>
+      </w:pPr>
+      <w:r>
+        <w:drawing>
+          <wp:inline xmlns:a="http://schemas.openxmlformats.org/drawingml/2006/main" xmlns:pic="http://schemas.openxmlformats.org/drawingml/2006/picture">
+            <wp:extent cx="5303520" cy="1998481"/>
+            <wp:docPr id="4" name="Picture 4"/>
+            <wp:cNvGraphicFramePr>
+              <a:graphicFrameLocks noChangeAspect="1"/>
+            </wp:cNvGraphicFramePr>
+            <a:graphic>
+              <a:graphicData uri="http://schemas.openxmlformats.org/drawingml/2006/picture">
+                <pic:pic>
+                  <pic:nvPicPr>
+                    <pic:cNvPr id="0" name="H_G_2.png"/>
+                    <pic:cNvPicPr/>
+                  </pic:nvPicPr>
+                  <pic:blipFill>
+                    <a:blip r:embed="rId13"/>
+                    <a:stretch>
+                      <a:fillRect/>
+                    </a:stretch>
+                  </pic:blipFill>
+                  <pic:spPr>
+                    <a:xfrm>
+                      <a:off x="0" y="0"/>
+                      <a:ext cx="5303520" cy="1998481"/>
+                    </a:xfrm>
+                    <a:prstGeom prst="rect"/>
+                  </pic:spPr>
+                </pic:pic>
+              </a:graphicData>
+            </a:graphic>
+          </wp:inline>
+        </w:drawing>
+      </w:r>
+    </w:p>
+    <w:p>
+      <w:pPr>
+        <w:spacing w:after="240"/>
+        <w:jc w:val="center"/>
+      </w:pPr>
+      <w:r>
+        <w:rPr>
+          <w:rFonts w:ascii="Times New Roman" w:hAnsi="Times New Roman"/>
+          <w:i/>
+          <w:sz w:val="20"/>
+        </w:rPr>
+        <w:t>Figura 4. Sensibilidad de μ(α) al peso α.</w:t>
       </w:r>
     </w:p>
     <w:p>
@@ -677,456 +379,120 @@
         <w:pStyle w:val="Heading1"/>
       </w:pPr>
       <w:r>
-        <w:t>2. Algoritmos Implementados</w:t>
+        <w:t>3. Solver FEM y SIMP</w:t>
+      </w:r>
+    </w:p>
+    <w:p>
+      <w:r>
+        <w:t>Motor Q4 (fem.py): ensamble, solver, sensibilidades y criterio OC con filtro de sensibilidad rmin. Optimización p = 3, fV = 0.5, mallas rectangulares (hasta 120×60) y cuadradas (Ne en {1600, 6400, 14400}).</w:t>
       </w:r>
     </w:p>
     <w:p>
       <w:pPr>
-        <w:pStyle w:val="Heading2"/>
+        <w:spacing w:before="240" w:after="120"/>
+        <w:jc w:val="center"/>
       </w:pPr>
       <w:r>
-        <w:t>2.1 Optimizacion SIMP</w:t>
-      </w:r>
-    </w:p>
-    <w:p>
-      <w:r>
-        <w:t>El metodo SIMP (Solid Isotropic Material with Penalization) penaliza las densidades intermedias para converger a disenos binarios (0-1). La formulacion del problema de optimizacion es la siguiente:</w:t>
+        <w:drawing>
+          <wp:inline xmlns:a="http://schemas.openxmlformats.org/drawingml/2006/main" xmlns:pic="http://schemas.openxmlformats.org/drawingml/2006/picture">
+            <wp:extent cx="5303520" cy="2437156"/>
+            <wp:docPr id="5" name="Picture 5"/>
+            <wp:cNvGraphicFramePr>
+              <a:graphicFrameLocks noChangeAspect="1"/>
+            </wp:cNvGraphicFramePr>
+            <a:graphic>
+              <a:graphicData uri="http://schemas.openxmlformats.org/drawingml/2006/picture">
+                <pic:pic>
+                  <pic:nvPicPr>
+                    <pic:cNvPr id="0" name="H_E_2_2_2.png"/>
+                    <pic:cNvPicPr/>
+                  </pic:nvPicPr>
+                  <pic:blipFill>
+                    <a:blip r:embed="rId14"/>
+                    <a:stretch>
+                      <a:fillRect/>
+                    </a:stretch>
+                  </pic:blipFill>
+                  <pic:spPr>
+                    <a:xfrm>
+                      <a:off x="0" y="0"/>
+                      <a:ext cx="5303520" cy="2437156"/>
+                    </a:xfrm>
+                    <a:prstGeom prst="rect"/>
+                  </pic:spPr>
+                </pic:pic>
+              </a:graphicData>
+            </a:graphic>
+          </wp:inline>
+        </w:drawing>
       </w:r>
     </w:p>
     <w:p>
       <w:pPr>
-        <w:pStyle w:val="IntenseQuote"/>
+        <w:spacing w:after="240"/>
+        <w:jc w:val="center"/>
       </w:pPr>
       <w:r>
-        <w:t>Minimizar:  c(rho) = sum(rho_e^p * ue^T * Ke * ue)</w:t>
+        <w:rPr>
+          <w:rFonts w:ascii="Times New Roman" w:hAnsi="Times New Roman"/>
+          <w:i/>
+          <w:sz w:val="20"/>
+        </w:rPr>
+        <w:t>Figura 5. Campo continuo vs sólido binarizado.</w:t>
       </w:r>
     </w:p>
     <w:p>
       <w:pPr>
-        <w:pStyle w:val="IntenseQuote"/>
+        <w:spacing w:before="240" w:after="120"/>
+        <w:jc w:val="center"/>
       </w:pPr>
       <w:r>
-        <w:t>Sujeto a:   K(rho) * U = F</w:t>
+        <w:drawing>
+          <wp:inline xmlns:a="http://schemas.openxmlformats.org/drawingml/2006/main" xmlns:pic="http://schemas.openxmlformats.org/drawingml/2006/picture">
+            <wp:extent cx="5303520" cy="2974073"/>
+            <wp:docPr id="6" name="Picture 6"/>
+            <wp:cNvGraphicFramePr>
+              <a:graphicFrameLocks noChangeAspect="1"/>
+            </wp:cNvGraphicFramePr>
+            <a:graphic>
+              <a:graphicData uri="http://schemas.openxmlformats.org/drawingml/2006/picture">
+                <pic:pic>
+                  <pic:nvPicPr>
+                    <pic:cNvPr id="0" name="H_E_2_4_1.png"/>
+                    <pic:cNvPicPr/>
+                  </pic:nvPicPr>
+                  <pic:blipFill>
+                    <a:blip r:embed="rId15"/>
+                    <a:stretch>
+                      <a:fillRect/>
+                    </a:stretch>
+                  </pic:blipFill>
+                  <pic:spPr>
+                    <a:xfrm>
+                      <a:off x="0" y="0"/>
+                      <a:ext cx="5303520" cy="2974073"/>
+                    </a:xfrm>
+                    <a:prstGeom prst="rect"/>
+                  </pic:spPr>
+                </pic:pic>
+              </a:graphicData>
+            </a:graphic>
+          </wp:inline>
+        </w:drawing>
       </w:r>
     </w:p>
     <w:p>
       <w:pPr>
-        <w:pStyle w:val="IntenseQuote"/>
+        <w:spacing w:after="240"/>
+        <w:jc w:val="center"/>
       </w:pPr>
       <w:r>
-        <w:t xml:space="preserve">            sum(rho_e * v_e) = fV * V0</w:t>
-      </w:r>
-    </w:p>
-    <w:p>
-      <w:pPr>
-        <w:pStyle w:val="IntenseQuote"/>
-      </w:pPr>
-      <w:r>
-        <w:t xml:space="preserve">            0 &lt; rho_min &lt;= rho_e &lt;= 1</w:t>
-      </w:r>
-    </w:p>
-    <w:p>
-      <w:r>
-        <w:t>Donde p es el factor de penalizacion, rho_e es la densidad del elemento e, Ke es la matriz de rigidez del elemento, ue es el vector de desplazamientos, fV es la fraccion de volumen objetivo y V0 es el volumen total del dominio.</w:t>
-      </w:r>
-    </w:p>
-    <w:p>
-      <w:r>
-        <w:t>El optimizador implementado utiliza el metodo MMA (Method of Moving Asymptotes) para calcular las actualizaciones de densidad en cada iteracion. MMA es un metodo de programacion matematica que approxima el problema original con subproblemas convexos resolubles.</w:t>
-      </w:r>
-    </w:p>
-    <w:p>
-      <w:pPr>
-        <w:pStyle w:val="Heading2"/>
-      </w:pPr>
-      <w:r>
-        <w:t>2.2 Metrica compuesta mu_alpha</w:t>
-      </w:r>
-    </w:p>
-    <w:p>
-      <w:r>
-        <w:t>La metrica compuesta combina el compliance (eficiencia estructural) con la complejidad topologica (numero de Betti-1) en una unica funcion objetivo escalar:</w:t>
-      </w:r>
-    </w:p>
-    <w:p>
-      <w:pPr>
-        <w:pStyle w:val="IntenseQuote"/>
-      </w:pPr>
-      <w:r>
-        <w:t>mu_alpha = c(rho*) + alpha * B1(Omega_solido)</w:t>
-      </w:r>
-    </w:p>
-    <w:p>
-      <w:r>
-        <w:t>Donde c(rho*) es el compliance optimizado y B1 es el numero de Betti-1 (agujeros) del diseno binarizado. El parametro alpha calibra el peso relativo entre ambos terminos.</w:t>
-      </w:r>
-    </w:p>
-    <w:p>
-      <w:r>
-        <w:t>El valor de alpha se calcula automaticamente para que ambos terminos tengan magnitud comparable: alpha = c_promedio / B1_promedio * 0.05. Esto permite que la metrica discrimine entre configuraciones que difieren en topologia pero no en compliance, o viceversa.</w:t>
-      </w:r>
-    </w:p>
-    <w:p>
-      <w:pPr>
-        <w:pStyle w:val="Heading2"/>
-      </w:pPr>
-      <w:r>
-        <w:t>2.3 Analisis topologico (TDA)</w:t>
-      </w:r>
-    </w:p>
-    <w:p>
-      <w:r>
-        <w:t>La plataforma calcula numeros de Betti (B0, B1) utilizando dos metodos independientes para validacion cruzada:</w:t>
-      </w:r>
-    </w:p>
-    <w:p>
-      <w:pPr>
-        <w:pStyle w:val="ListBullet"/>
-      </w:pPr>
-      <w:r>
-        <w:t>GUDHI: computa filtraciones de complejos de Rips sobre la nube de puntos y extrae los numeros de Betti de los diagramas de persistencia resultantes.</w:t>
-      </w:r>
-    </w:p>
-    <w:p>
-      <w:pPr>
-        <w:pStyle w:val="ListBullet"/>
-      </w:pPr>
-      <w:r>
-        <w:t>Euler numerico: realiza el conteo directo de componentes y agujeros sobre la grilla de densidades del diseno.</w:t>
-      </w:r>
-    </w:p>
-    <w:p>
-      <w:r>
-        <w:t>La concordancia entre ambos metodos se verifica en cada ejecucion. Las distancias entre diagramas de persistencia (Wasserstein y bottleneck) se implementan en numpy puro, eliminando la dependencia externa de persim.</w:t>
-      </w:r>
-    </w:p>
-    <w:p>
-      <w:pPr>
-        <w:pStyle w:val="Heading2"/>
-      </w:pPr>
-      <w:r>
-        <w:t>2.4 Validaciones estadisticas</w:t>
-      </w:r>
-    </w:p>
-    <w:p>
-      <w:r>
-        <w:t>Las hipotesis se validan mediante los siguientes criterios:</w:t>
-      </w:r>
-    </w:p>
-    <w:tbl>
-      <w:tblPr>
-        <w:tblStyle w:val="TableGrid"/>
-        <w:tblW w:type="auto" w:w="0"/>
-        <w:jc w:val="center"/>
-        <w:tblLook w:firstColumn="1" w:firstRow="1" w:lastColumn="0" w:lastRow="0" w:noHBand="0" w:noVBand="1" w:val="04A0"/>
-      </w:tblPr>
-      <w:tblGrid>
-        <w:gridCol w:w="2946"/>
-        <w:gridCol w:w="2946"/>
-        <w:gridCol w:w="2946"/>
-      </w:tblGrid>
-      <w:tr>
-        <w:tc>
-          <w:tcPr>
-            <w:tcW w:type="dxa" w:w="2946"/>
-            <w:shd w:fill="D9E2F3"/>
-          </w:tcPr>
-          <w:p>
-            <w:pPr>
-              <w:jc w:val="center"/>
-            </w:pPr>
-            <w:r/>
-            <w:r>
-              <w:rPr>
-                <w:rFonts w:ascii="Times New Roman" w:hAnsi="Times New Roman"/>
-                <w:b/>
-                <w:sz w:val="20"/>
-              </w:rPr>
-              <w:t>Hipotesis</w:t>
-            </w:r>
-          </w:p>
-        </w:tc>
-        <w:tc>
-          <w:tcPr>
-            <w:tcW w:type="dxa" w:w="2946"/>
-            <w:shd w:fill="D9E2F3"/>
-          </w:tcPr>
-          <w:p>
-            <w:pPr>
-              <w:jc w:val="center"/>
-            </w:pPr>
-            <w:r/>
-            <w:r>
-              <w:rPr>
-                <w:rFonts w:ascii="Times New Roman" w:hAnsi="Times New Roman"/>
-                <w:b/>
-                <w:sz w:val="20"/>
-              </w:rPr>
-              <w:t>Metodo de validacion</w:t>
-            </w:r>
-          </w:p>
-        </w:tc>
-        <w:tc>
-          <w:tcPr>
-            <w:tcW w:type="dxa" w:w="2946"/>
-            <w:shd w:fill="D9E2F3"/>
-          </w:tcPr>
-          <w:p>
-            <w:pPr>
-              <w:jc w:val="center"/>
-            </w:pPr>
-            <w:r/>
-            <w:r>
-              <w:rPr>
-                <w:rFonts w:ascii="Times New Roman" w:hAnsi="Times New Roman"/>
-                <w:b/>
-                <w:sz w:val="20"/>
-              </w:rPr>
-              <w:t>Criterio de aceptacion</w:t>
-            </w:r>
-          </w:p>
-        </w:tc>
-      </w:tr>
-      <w:tr>
-        <w:tc>
-          <w:tcPr>
-            <w:tcW w:type="dxa" w:w="2946"/>
-          </w:tcPr>
-          <w:p>
-            <w:r/>
-            <w:r>
-              <w:rPr>
-                <w:rFonts w:ascii="Times New Roman" w:hAnsi="Times New Roman"/>
-                <w:sz w:val="20"/>
-              </w:rPr>
-              <w:t>H.E.1a' (cota bottleneck)</w:t>
-            </w:r>
-          </w:p>
-        </w:tc>
-        <w:tc>
-          <w:tcPr>
-            <w:tcW w:type="dxa" w:w="2946"/>
-          </w:tcPr>
-          <w:p>
-            <w:r/>
-            <w:r>
-              <w:rPr>
-                <w:rFonts w:ascii="Times New Roman" w:hAnsi="Times New Roman"/>
-                <w:sz w:val="20"/>
-              </w:rPr>
-              <w:t>Ratio dB/diam(X) &lt;= 2q</w:t>
-            </w:r>
-          </w:p>
-        </w:tc>
-        <w:tc>
-          <w:tcPr>
-            <w:tcW w:type="dxa" w:w="2946"/>
-          </w:tcPr>
-          <w:p>
-            <w:r/>
-            <w:r>
-              <w:rPr>
-                <w:rFonts w:ascii="Times New Roman" w:hAnsi="Times New Roman"/>
-                <w:sz w:val="20"/>
-              </w:rPr>
-              <w:t>Todos los shapes deben cumplir la desigualdad</w:t>
-            </w:r>
-          </w:p>
-        </w:tc>
-      </w:tr>
-      <w:tr>
-        <w:tc>
-          <w:tcPr>
-            <w:tcW w:type="dxa" w:w="2946"/>
-          </w:tcPr>
-          <w:p>
-            <w:r/>
-            <w:r>
-              <w:rPr>
-                <w:rFonts w:ascii="Times New Roman" w:hAnsi="Times New Roman"/>
-                <w:sz w:val="20"/>
-              </w:rPr>
-              <w:t>H.E.1b (clasificacion)</w:t>
-            </w:r>
-          </w:p>
-        </w:tc>
-        <w:tc>
-          <w:tcPr>
-            <w:tcW w:type="dxa" w:w="2946"/>
-          </w:tcPr>
-          <w:p>
-            <w:r/>
-            <w:r>
-              <w:rPr>
-                <w:rFonts w:ascii="Times New Roman" w:hAnsi="Times New Roman"/>
-                <w:sz w:val="20"/>
-              </w:rPr>
-              <w:t>Test de McNemar</w:t>
-            </w:r>
-          </w:p>
-        </w:tc>
-        <w:tc>
-          <w:tcPr>
-            <w:tcW w:type="dxa" w:w="2946"/>
-          </w:tcPr>
-          <w:p>
-            <w:r/>
-            <w:r>
-              <w:rPr>
-                <w:rFonts w:ascii="Times New Roman" w:hAnsi="Times New Roman"/>
-                <w:sz w:val="20"/>
-              </w:rPr>
-              <w:t>p &lt; 0.05 (superioridad estadistica de TDA)</w:t>
-            </w:r>
-          </w:p>
-        </w:tc>
-      </w:tr>
-      <w:tr>
-        <w:tc>
-          <w:tcPr>
-            <w:tcW w:type="dxa" w:w="2946"/>
-          </w:tcPr>
-          <w:p>
-            <w:r/>
-            <w:r>
-              <w:rPr>
-                <w:rFonts w:ascii="Times New Roman" w:hAnsi="Times New Roman"/>
-                <w:sz w:val="20"/>
-              </w:rPr>
-              <w:t>H.E.1c (estabilidad)</w:t>
-            </w:r>
-          </w:p>
-        </w:tc>
-        <w:tc>
-          <w:tcPr>
-            <w:tcW w:type="dxa" w:w="2946"/>
-          </w:tcPr>
-          <w:p>
-            <w:r/>
-            <w:r>
-              <w:rPr>
-                <w:rFonts w:ascii="Times New Roman" w:hAnsi="Times New Roman"/>
-                <w:sz w:val="20"/>
-              </w:rPr>
-              <w:t>dB &lt;= 2 * dH(X,Y)</w:t>
-            </w:r>
-          </w:p>
-        </w:tc>
-        <w:tc>
-          <w:tcPr>
-            <w:tcW w:type="dxa" w:w="2946"/>
-          </w:tcPr>
-          <w:p>
-            <w:r/>
-            <w:r>
-              <w:rPr>
-                <w:rFonts w:ascii="Times New Roman" w:hAnsi="Times New Roman"/>
-                <w:sz w:val="20"/>
-              </w:rPr>
-              <w:t>Todos los shapes deben cumplir la cota</w:t>
-            </w:r>
-          </w:p>
-        </w:tc>
-      </w:tr>
-      <w:tr>
-        <w:tc>
-          <w:tcPr>
-            <w:tcW w:type="dxa" w:w="2946"/>
-          </w:tcPr>
-          <w:p>
-            <w:r/>
-            <w:r>
-              <w:rPr>
-                <w:rFonts w:ascii="Times New Roman" w:hAnsi="Times New Roman"/>
-                <w:sz w:val="20"/>
-              </w:rPr>
-              <w:t>H.E.2a' (reduccion)</w:t>
-            </w:r>
-          </w:p>
-        </w:tc>
-        <w:tc>
-          <w:tcPr>
-            <w:tcW w:type="dxa" w:w="2946"/>
-          </w:tcPr>
-          <w:p>
-            <w:r/>
-            <w:r>
-              <w:rPr>
-                <w:rFonts w:ascii="Times New Roman" w:hAnsi="Times New Roman"/>
-                <w:sz w:val="20"/>
-              </w:rPr>
-              <w:t>(c_unif - c_star) / c_unif &gt;= 0.40</w:t>
-            </w:r>
-          </w:p>
-        </w:tc>
-        <w:tc>
-          <w:tcPr>
-            <w:tcW w:type="dxa" w:w="2946"/>
-          </w:tcPr>
-          <w:p>
-            <w:r/>
-            <w:r>
-              <w:rPr>
-                <w:rFonts w:ascii="Times New Roman" w:hAnsi="Times New Roman"/>
-                <w:sz w:val="20"/>
-              </w:rPr>
-              <w:t>Reduccion de compliance &gt;= 40%</w:t>
-            </w:r>
-          </w:p>
-        </w:tc>
-      </w:tr>
-      <w:tr>
-        <w:tc>
-          <w:tcPr>
-            <w:tcW w:type="dxa" w:w="2946"/>
-          </w:tcPr>
-          <w:p>
-            <w:r/>
-            <w:r>
-              <w:rPr>
-                <w:rFonts w:ascii="Times New Roman" w:hAnsi="Times New Roman"/>
-                <w:sz w:val="20"/>
-              </w:rPr>
-              <w:t>H.E.2b' (invariancia)</w:t>
-            </w:r>
-          </w:p>
-        </w:tc>
-        <w:tc>
-          <w:tcPr>
-            <w:tcW w:type="dxa" w:w="2946"/>
-          </w:tcPr>
-          <w:p>
-            <w:r/>
-            <w:r>
-              <w:rPr>
-                <w:rFonts w:ascii="Times New Roman" w:hAnsi="Times New Roman"/>
-                <w:sz w:val="20"/>
-              </w:rPr>
-              <w:t>B1 invariante</w:t>
-            </w:r>
-          </w:p>
-        </w:tc>
-        <w:tc>
-          <w:tcPr>
-            <w:tcW w:type="dxa" w:w="2946"/>
-          </w:tcPr>
-          <w:p>
-            <w:r/>
-            <w:r>
-              <w:rPr>
-                <w:rFonts w:ascii="Times New Roman" w:hAnsi="Times New Roman"/>
-                <w:sz w:val="20"/>
-              </w:rPr>
-              <w:t>B1 constante para variaciones de p, malla y r_min</w:t>
-            </w:r>
-          </w:p>
-        </w:tc>
-      </w:tr>
-    </w:tbl>
-    <w:p/>
-    <w:p>
-      <w:r>
-        <w:br w:type="page"/>
+        <w:rPr>
+          <w:rFonts w:ascii="Times New Roman" w:hAnsi="Times New Roman"/>
+          <w:i/>
+          <w:sz w:val="20"/>
+        </w:rPr>
+        <w:t>Figura 6. Barrido p con grisura y β₁ anotado.</w:t>
       </w:r>
     </w:p>
     <w:p>
@@ -1134,467 +500,120 @@
         <w:pStyle w:val="Heading1"/>
       </w:pPr>
       <w:r>
-        <w:t>3. Solver de Elementos Finitos (FEM)</w:t>
+        <w:t>4. Validaciones Estadísticas</w:t>
       </w:r>
     </w:p>
     <w:p>
       <w:r>
-        <w:t>El solver FEM resuelve problemas de estado plano de tension en dos dimensiones. Utiliza elementos cuadrilaterales de cuatro nodos (Q4) con integracion completa de 2x2 puntos de Gauss.</w:t>
+        <w:t>McNemar (χ² con n01/n10 discordantes, p &lt; 0.001 si ínfimo), cotas bottleneck dB/diam ≤ 2q y dB ≤ 2dH, q* estimado, Tabla 5.5 dinámica y Tabla 5.9 con valores del documento (1.000; 0.950 vs 0.925; q* ≈ 0.05−0.10; +76.12 %).</w:t>
       </w:r>
     </w:p>
     <w:p>
       <w:pPr>
-        <w:pStyle w:val="Heading2"/>
+        <w:spacing w:before="240" w:after="120"/>
+        <w:jc w:val="center"/>
       </w:pPr>
       <w:r>
-        <w:t>3.1 Condiciones de contorno</w:t>
+        <w:drawing>
+          <wp:inline xmlns:a="http://schemas.openxmlformats.org/drawingml/2006/main" xmlns:pic="http://schemas.openxmlformats.org/drawingml/2006/picture">
+            <wp:extent cx="5303520" cy="3394108"/>
+            <wp:docPr id="7" name="Picture 7"/>
+            <wp:cNvGraphicFramePr>
+              <a:graphicFrameLocks noChangeAspect="1"/>
+            </wp:cNvGraphicFramePr>
+            <a:graphic>
+              <a:graphicData uri="http://schemas.openxmlformats.org/drawingml/2006/picture">
+                <pic:pic>
+                  <pic:nvPicPr>
+                    <pic:cNvPr id="0" name="H_E_1_4_2.png"/>
+                    <pic:cNvPicPr/>
+                  </pic:nvPicPr>
+                  <pic:blipFill>
+                    <a:blip r:embed="rId16"/>
+                    <a:stretch>
+                      <a:fillRect/>
+                    </a:stretch>
+                  </pic:blipFill>
+                  <pic:spPr>
+                    <a:xfrm>
+                      <a:off x="0" y="0"/>
+                      <a:ext cx="5303520" cy="3394108"/>
+                    </a:xfrm>
+                    <a:prstGeom prst="rect"/>
+                  </pic:spPr>
+                </pic:pic>
+              </a:graphicData>
+            </a:graphic>
+          </wp:inline>
+        </w:drawing>
       </w:r>
     </w:p>
-    <w:tbl>
-      <w:tblPr>
-        <w:tblStyle w:val="TableGrid"/>
-        <w:tblW w:type="auto" w:w="0"/>
-        <w:jc w:val="center"/>
-        <w:tblLook w:firstColumn="1" w:firstRow="1" w:lastColumn="0" w:lastRow="0" w:noHBand="0" w:noVBand="1" w:val="04A0"/>
-      </w:tblPr>
-      <w:tblGrid>
-        <w:gridCol w:w="2946"/>
-        <w:gridCol w:w="2946"/>
-        <w:gridCol w:w="2946"/>
-      </w:tblGrid>
-      <w:tr>
-        <w:tc>
-          <w:tcPr>
-            <w:tcW w:type="dxa" w:w="2946"/>
-            <w:shd w:fill="D9E2F3"/>
-          </w:tcPr>
-          <w:p>
-            <w:pPr>
-              <w:jc w:val="center"/>
-            </w:pPr>
-            <w:r/>
-            <w:r>
-              <w:rPr>
-                <w:rFonts w:ascii="Times New Roman" w:hAnsi="Times New Roman"/>
-                <w:b/>
-                <w:sz w:val="20"/>
-              </w:rPr>
-              <w:t>Caso de uso</w:t>
-            </w:r>
-          </w:p>
-        </w:tc>
-        <w:tc>
-          <w:tcPr>
-            <w:tcW w:type="dxa" w:w="2946"/>
-            <w:shd w:fill="D9E2F3"/>
-          </w:tcPr>
-          <w:p>
-            <w:pPr>
-              <w:jc w:val="center"/>
-            </w:pPr>
-            <w:r/>
-            <w:r>
-              <w:rPr>
-                <w:rFonts w:ascii="Times New Roman" w:hAnsi="Times New Roman"/>
-                <w:b/>
-                <w:sz w:val="20"/>
-              </w:rPr>
-              <w:t>Condicion izquierda</w:t>
-            </w:r>
-          </w:p>
-        </w:tc>
-        <w:tc>
-          <w:tcPr>
-            <w:tcW w:type="dxa" w:w="2946"/>
-            <w:shd w:fill="D9E2F3"/>
-          </w:tcPr>
-          <w:p>
-            <w:pPr>
-              <w:jc w:val="center"/>
-            </w:pPr>
-            <w:r/>
-            <w:r>
-              <w:rPr>
-                <w:rFonts w:ascii="Times New Roman" w:hAnsi="Times New Roman"/>
-                <w:b/>
-                <w:sz w:val="20"/>
-              </w:rPr>
-              <w:t>Carga aplicada</w:t>
-            </w:r>
-          </w:p>
-        </w:tc>
-      </w:tr>
-      <w:tr>
-        <w:tc>
-          <w:tcPr>
-            <w:tcW w:type="dxa" w:w="2946"/>
-          </w:tcPr>
-          <w:p>
-            <w:r/>
-            <w:r>
-              <w:rPr>
-                <w:rFonts w:ascii="Times New Roman" w:hAnsi="Times New Roman"/>
-                <w:sz w:val="20"/>
-              </w:rPr>
-              <w:t>Viga en voladizo</w:t>
-            </w:r>
-          </w:p>
-        </w:tc>
-        <w:tc>
-          <w:tcPr>
-            <w:tcW w:type="dxa" w:w="2946"/>
-          </w:tcPr>
-          <w:p>
-            <w:r/>
-            <w:r>
-              <w:rPr>
-                <w:rFonts w:ascii="Times New Roman" w:hAnsi="Times New Roman"/>
-                <w:sz w:val="20"/>
-              </w:rPr>
-              <w:t>Empotrada (uj = 0, vj = 0)</w:t>
-            </w:r>
-          </w:p>
-        </w:tc>
-        <w:tc>
-          <w:tcPr>
-            <w:tcW w:type="dxa" w:w="2946"/>
-          </w:tcPr>
-          <w:p>
-            <w:r/>
-            <w:r>
-              <w:rPr>
-                <w:rFonts w:ascii="Times New Roman" w:hAnsi="Times New Roman"/>
-                <w:sz w:val="20"/>
-              </w:rPr>
-              <w:t>Puntual en extremo libre</w:t>
-            </w:r>
-          </w:p>
-        </w:tc>
-      </w:tr>
-      <w:tr>
-        <w:tc>
-          <w:tcPr>
-            <w:tcW w:type="dxa" w:w="2946"/>
-          </w:tcPr>
-          <w:p>
-            <w:r/>
-            <w:r>
-              <w:rPr>
-                <w:rFonts w:ascii="Times New Roman" w:hAnsi="Times New Roman"/>
-                <w:sz w:val="20"/>
-              </w:rPr>
-              <w:t>Placa cuadrada</w:t>
-            </w:r>
-          </w:p>
-        </w:tc>
-        <w:tc>
-          <w:tcPr>
-            <w:tcW w:type="dxa" w:w="2946"/>
-          </w:tcPr>
-          <w:p>
-            <w:r/>
-            <w:r>
-              <w:rPr>
-                <w:rFonts w:ascii="Times New Roman" w:hAnsi="Times New Roman"/>
-                <w:sz w:val="20"/>
-              </w:rPr>
-              <w:t>Empotrada (uj = 0, vj = 0)</w:t>
-            </w:r>
-          </w:p>
-        </w:tc>
-        <w:tc>
-          <w:tcPr>
-            <w:tcW w:type="dxa" w:w="2946"/>
-          </w:tcPr>
-          <w:p>
-            <w:r/>
-            <w:r>
-              <w:rPr>
-                <w:rFonts w:ascii="Times New Roman" w:hAnsi="Times New Roman"/>
-                <w:sz w:val="20"/>
-              </w:rPr>
-              <w:t>Puntual en esquina opuesta</w:t>
-            </w:r>
-          </w:p>
-        </w:tc>
-      </w:tr>
-    </w:tbl>
-    <w:p/>
     <w:p>
       <w:pPr>
-        <w:pStyle w:val="Heading2"/>
+        <w:spacing w:after="240"/>
+        <w:jc w:val="center"/>
       </w:pPr>
       <w:r>
-        <w:t>3.2 Propiedades del material</w:t>
+        <w:rPr>
+          <w:rFonts w:ascii="Times New Roman" w:hAnsi="Times New Roman"/>
+          <w:i/>
+          <w:sz w:val="20"/>
+        </w:rPr>
+        <w:t>Figura 7. McNemar y cota réplica por réplica.</w:t>
       </w:r>
     </w:p>
-    <w:tbl>
-      <w:tblPr>
-        <w:tblStyle w:val="TableGrid"/>
-        <w:tblW w:type="auto" w:w="0"/>
+    <w:p>
+      <w:pPr>
+        <w:spacing w:before="240" w:after="120"/>
         <w:jc w:val="center"/>
-        <w:tblLook w:firstColumn="1" w:firstRow="1" w:lastColumn="0" w:lastRow="0" w:noHBand="0" w:noVBand="1" w:val="04A0"/>
-      </w:tblPr>
-      <w:tblGrid>
-        <w:gridCol w:w="2946"/>
-        <w:gridCol w:w="2946"/>
-        <w:gridCol w:w="2946"/>
-      </w:tblGrid>
-      <w:tr>
-        <w:tc>
-          <w:tcPr>
-            <w:tcW w:type="dxa" w:w="2946"/>
-            <w:shd w:fill="D9E2F3"/>
-          </w:tcPr>
-          <w:p>
-            <w:pPr>
-              <w:jc w:val="center"/>
-            </w:pPr>
-            <w:r/>
-            <w:r>
-              <w:rPr>
-                <w:rFonts w:ascii="Times New Roman" w:hAnsi="Times New Roman"/>
-                <w:b/>
-                <w:sz w:val="20"/>
-              </w:rPr>
-              <w:t>Propiedad</w:t>
-            </w:r>
-          </w:p>
-        </w:tc>
-        <w:tc>
-          <w:tcPr>
-            <w:tcW w:type="dxa" w:w="2946"/>
-            <w:shd w:fill="D9E2F3"/>
-          </w:tcPr>
-          <w:p>
-            <w:pPr>
-              <w:jc w:val="center"/>
-            </w:pPr>
-            <w:r/>
-            <w:r>
-              <w:rPr>
-                <w:rFonts w:ascii="Times New Roman" w:hAnsi="Times New Roman"/>
-                <w:b/>
-                <w:sz w:val="20"/>
-              </w:rPr>
-              <w:t>Valor</w:t>
-            </w:r>
-          </w:p>
-        </w:tc>
-        <w:tc>
-          <w:tcPr>
-            <w:tcW w:type="dxa" w:w="2946"/>
-            <w:shd w:fill="D9E2F3"/>
-          </w:tcPr>
-          <w:p>
-            <w:pPr>
-              <w:jc w:val="center"/>
-            </w:pPr>
-            <w:r/>
-            <w:r>
-              <w:rPr>
-                <w:rFonts w:ascii="Times New Roman" w:hAnsi="Times New Roman"/>
-                <w:b/>
-                <w:sz w:val="20"/>
-              </w:rPr>
-              <w:t>Unidad</w:t>
-            </w:r>
-          </w:p>
-        </w:tc>
-      </w:tr>
-      <w:tr>
-        <w:tc>
-          <w:tcPr>
-            <w:tcW w:type="dxa" w:w="2946"/>
-          </w:tcPr>
-          <w:p>
-            <w:r/>
-            <w:r>
-              <w:rPr>
-                <w:rFonts w:ascii="Times New Roman" w:hAnsi="Times New Roman"/>
-                <w:sz w:val="20"/>
-              </w:rPr>
-              <w:t>Modulo Young (E0)</w:t>
-            </w:r>
-          </w:p>
-        </w:tc>
-        <w:tc>
-          <w:tcPr>
-            <w:tcW w:type="dxa" w:w="2946"/>
-          </w:tcPr>
-          <w:p>
-            <w:r/>
-            <w:r>
-              <w:rPr>
-                <w:rFonts w:ascii="Times New Roman" w:hAnsi="Times New Roman"/>
-                <w:sz w:val="20"/>
-              </w:rPr>
-              <w:t>200000</w:t>
-            </w:r>
-          </w:p>
-        </w:tc>
-        <w:tc>
-          <w:tcPr>
-            <w:tcW w:type="dxa" w:w="2946"/>
-          </w:tcPr>
-          <w:p>
-            <w:r/>
-            <w:r>
-              <w:rPr>
-                <w:rFonts w:ascii="Times New Roman" w:hAnsi="Times New Roman"/>
-                <w:sz w:val="20"/>
-              </w:rPr>
-              <w:t>MPa</w:t>
-            </w:r>
-          </w:p>
-        </w:tc>
-      </w:tr>
-      <w:tr>
-        <w:tc>
-          <w:tcPr>
-            <w:tcW w:type="dxa" w:w="2946"/>
-          </w:tcPr>
-          <w:p>
-            <w:r/>
-            <w:r>
-              <w:rPr>
-                <w:rFonts w:ascii="Times New Roman" w:hAnsi="Times New Roman"/>
-                <w:sz w:val="20"/>
-              </w:rPr>
-              <w:t>Relacion de Poisson</w:t>
-            </w:r>
-          </w:p>
-        </w:tc>
-        <w:tc>
-          <w:tcPr>
-            <w:tcW w:type="dxa" w:w="2946"/>
-          </w:tcPr>
-          <w:p>
-            <w:r/>
-            <w:r>
-              <w:rPr>
-                <w:rFonts w:ascii="Times New Roman" w:hAnsi="Times New Roman"/>
-                <w:sz w:val="20"/>
-              </w:rPr>
-              <w:t>0.3</w:t>
-            </w:r>
-          </w:p>
-        </w:tc>
-        <w:tc>
-          <w:tcPr>
-            <w:tcW w:type="dxa" w:w="2946"/>
-          </w:tcPr>
-          <w:p>
-            <w:r/>
-            <w:r>
-              <w:rPr>
-                <w:rFonts w:ascii="Times New Roman" w:hAnsi="Times New Roman"/>
-                <w:sz w:val="20"/>
-              </w:rPr>
-              <w:t>Adimensional</w:t>
-            </w:r>
-          </w:p>
-        </w:tc>
-      </w:tr>
-      <w:tr>
-        <w:tc>
-          <w:tcPr>
-            <w:tcW w:type="dxa" w:w="2946"/>
-          </w:tcPr>
-          <w:p>
-            <w:r/>
-            <w:r>
-              <w:rPr>
-                <w:rFonts w:ascii="Times New Roman" w:hAnsi="Times New Roman"/>
-                <w:sz w:val="20"/>
-              </w:rPr>
-              <w:t>Espesor</w:t>
-            </w:r>
-          </w:p>
-        </w:tc>
-        <w:tc>
-          <w:tcPr>
-            <w:tcW w:type="dxa" w:w="2946"/>
-          </w:tcPr>
-          <w:p>
-            <w:r/>
-            <w:r>
-              <w:rPr>
-                <w:rFonts w:ascii="Times New Roman" w:hAnsi="Times New Roman"/>
-                <w:sz w:val="20"/>
-              </w:rPr>
-              <w:t>1.0</w:t>
-            </w:r>
-          </w:p>
-        </w:tc>
-        <w:tc>
-          <w:tcPr>
-            <w:tcW w:type="dxa" w:w="2946"/>
-          </w:tcPr>
-          <w:p>
-            <w:r/>
-            <w:r>
-              <w:rPr>
-                <w:rFonts w:ascii="Times New Roman" w:hAnsi="Times New Roman"/>
-                <w:sz w:val="20"/>
-              </w:rPr>
-              <w:t>mm</w:t>
-            </w:r>
-          </w:p>
-        </w:tc>
-      </w:tr>
-      <w:tr>
-        <w:tc>
-          <w:tcPr>
-            <w:tcW w:type="dxa" w:w="2946"/>
-          </w:tcPr>
-          <w:p>
-            <w:r/>
-            <w:r>
-              <w:rPr>
-                <w:rFonts w:ascii="Times New Roman" w:hAnsi="Times New Roman"/>
-                <w:sz w:val="20"/>
-              </w:rPr>
-              <w:t>Densidad de referencia</w:t>
-            </w:r>
-          </w:p>
-        </w:tc>
-        <w:tc>
-          <w:tcPr>
-            <w:tcW w:type="dxa" w:w="2946"/>
-          </w:tcPr>
-          <w:p>
-            <w:r/>
-            <w:r>
-              <w:rPr>
-                <w:rFonts w:ascii="Times New Roman" w:hAnsi="Times New Roman"/>
-                <w:sz w:val="20"/>
-              </w:rPr>
-              <w:t>1.0</w:t>
-            </w:r>
-          </w:p>
-        </w:tc>
-        <w:tc>
-          <w:tcPr>
-            <w:tcW w:type="dxa" w:w="2946"/>
-          </w:tcPr>
-          <w:p>
-            <w:r/>
-            <w:r>
-              <w:rPr>
-                <w:rFonts w:ascii="Times New Roman" w:hAnsi="Times New Roman"/>
-                <w:sz w:val="20"/>
-              </w:rPr>
-              <w:t>kg/mm3</w:t>
-            </w:r>
-          </w:p>
-        </w:tc>
-      </w:tr>
-    </w:tbl>
-    <w:p/>
+      </w:pPr>
+      <w:r>
+        <w:drawing>
+          <wp:inline xmlns:a="http://schemas.openxmlformats.org/drawingml/2006/main" xmlns:pic="http://schemas.openxmlformats.org/drawingml/2006/picture">
+            <wp:extent cx="5303520" cy="1656888"/>
+            <wp:docPr id="8" name="Picture 8"/>
+            <wp:cNvGraphicFramePr>
+              <a:graphicFrameLocks noChangeAspect="1"/>
+            </wp:cNvGraphicFramePr>
+            <a:graphic>
+              <a:graphicData uri="http://schemas.openxmlformats.org/drawingml/2006/picture">
+                <pic:pic>
+                  <pic:nvPicPr>
+                    <pic:cNvPr id="0" name="H_G_6.png"/>
+                    <pic:cNvPicPr/>
+                  </pic:nvPicPr>
+                  <pic:blipFill>
+                    <a:blip r:embed="rId17"/>
+                    <a:stretch>
+                      <a:fillRect/>
+                    </a:stretch>
+                  </pic:blipFill>
+                  <pic:spPr>
+                    <a:xfrm>
+                      <a:off x="0" y="0"/>
+                      <a:ext cx="5303520" cy="1656888"/>
+                    </a:xfrm>
+                    <a:prstGeom prst="rect"/>
+                  </pic:spPr>
+                </pic:pic>
+              </a:graphicData>
+            </a:graphic>
+          </wp:inline>
+        </w:drawing>
+      </w:r>
+    </w:p>
     <w:p>
+      <w:pPr>
+        <w:spacing w:after="240"/>
+        <w:jc w:val="center"/>
+      </w:pPr>
       <w:r>
-        <w:br w:type="page"/>
+        <w:rPr>
+          <w:rFonts w:ascii="Times New Roman" w:hAnsi="Times New Roman"/>
+          <w:i/>
+          <w:sz w:val="20"/>
+        </w:rPr>
+        <w:t>Figura 8. Tabla 5.9 de veredictos con evidencia.</w:t>
       </w:r>
     </w:p>
     <w:p>
@@ -1602,1146 +621,66 @@
         <w:pStyle w:val="Heading1"/>
       </w:pPr>
       <w:r>
-        <w:t>4. Configuracion de Experimentos</w:t>
+        <w:t>5. Exportación y Ejecutable</w:t>
+      </w:r>
+    </w:p>
+    <w:p>
+      <w:r>
+        <w:t>download_utils.py: fig_png_bytes (kaleido/Matplotlib) y write_figs_zip (22 gráficos registrados, .txt de error si alguno falla). Empaquetado .exe con PyInstaller + streamlit-desktop-app (ver docs de empaquetado).</w:t>
       </w:r>
     </w:p>
     <w:p>
       <w:pPr>
-        <w:pStyle w:val="Heading2"/>
+        <w:spacing w:before="240" w:after="120"/>
+        <w:jc w:val="center"/>
       </w:pPr>
       <w:r>
-        <w:t>4.1 Cuadros de resultados del documento</w:t>
-      </w:r>
-    </w:p>
-    <w:tbl>
-      <w:tblPr>
-        <w:tblStyle w:val="TableGrid"/>
-        <w:tblW w:type="auto" w:w="0"/>
-        <w:jc w:val="center"/>
-        <w:tblLook w:firstColumn="1" w:firstRow="1" w:lastColumn="0" w:lastRow="0" w:noHBand="0" w:noVBand="1" w:val="04A0"/>
-      </w:tblPr>
-      <w:tblGrid>
-        <w:gridCol w:w="2946"/>
-        <w:gridCol w:w="2946"/>
-        <w:gridCol w:w="2946"/>
-      </w:tblGrid>
-      <w:tr>
-        <w:tc>
-          <w:tcPr>
-            <w:tcW w:type="dxa" w:w="2946"/>
-            <w:shd w:fill="D9E2F3"/>
-          </w:tcPr>
-          <w:p>
-            <w:pPr>
-              <w:jc w:val="center"/>
-            </w:pPr>
-            <w:r/>
-            <w:r>
-              <w:rPr>
-                <w:rFonts w:ascii="Times New Roman" w:hAnsi="Times New Roman"/>
-                <w:b/>
-                <w:sz w:val="20"/>
-              </w:rPr>
-              <w:t>Cuadro</w:t>
-            </w:r>
-          </w:p>
-        </w:tc>
-        <w:tc>
-          <w:tcPr>
-            <w:tcW w:type="dxa" w:w="2946"/>
-            <w:shd w:fill="D9E2F3"/>
-          </w:tcPr>
-          <w:p>
-            <w:pPr>
-              <w:jc w:val="center"/>
-            </w:pPr>
-            <w:r/>
-            <w:r>
-              <w:rPr>
-                <w:rFonts w:ascii="Times New Roman" w:hAnsi="Times New Roman"/>
-                <w:b/>
-                <w:sz w:val="20"/>
-              </w:rPr>
-              <w:t>Ubicacion</w:t>
-            </w:r>
-          </w:p>
-        </w:tc>
-        <w:tc>
-          <w:tcPr>
-            <w:tcW w:type="dxa" w:w="2946"/>
-            <w:shd w:fill="D9E2F3"/>
-          </w:tcPr>
-          <w:p>
-            <w:pPr>
-              <w:jc w:val="center"/>
-            </w:pPr>
-            <w:r/>
-            <w:r>
-              <w:rPr>
-                <w:rFonts w:ascii="Times New Roman" w:hAnsi="Times New Roman"/>
-                <w:b/>
-                <w:sz w:val="20"/>
-              </w:rPr>
-              <w:t>Contenido</w:t>
-            </w:r>
-          </w:p>
-        </w:tc>
-      </w:tr>
-      <w:tr>
-        <w:tc>
-          <w:tcPr>
-            <w:tcW w:type="dxa" w:w="2946"/>
-          </w:tcPr>
-          <w:p>
-            <w:r/>
-            <w:r>
-              <w:rPr>
-                <w:rFonts w:ascii="Times New Roman" w:hAnsi="Times New Roman"/>
-                <w:sz w:val="20"/>
-              </w:rPr>
-              <w:t>Cuadro 1</w:t>
-            </w:r>
-          </w:p>
-        </w:tc>
-        <w:tc>
-          <w:tcPr>
-            <w:tcW w:type="dxa" w:w="2946"/>
-          </w:tcPr>
-          <w:p>
-            <w:r/>
-            <w:r>
-              <w:rPr>
-                <w:rFonts w:ascii="Times New Roman" w:hAnsi="Times New Roman"/>
-                <w:sz w:val="20"/>
-              </w:rPr>
-              <w:t>H.E.2a'</w:t>
-            </w:r>
-          </w:p>
-        </w:tc>
-        <w:tc>
-          <w:tcPr>
-            <w:tcW w:type="dxa" w:w="2946"/>
-          </w:tcPr>
-          <w:p>
-            <w:r/>
-            <w:r>
-              <w:rPr>
-                <w:rFonts w:ascii="Times New Roman" w:hAnsi="Times New Roman"/>
-                <w:sz w:val="20"/>
-              </w:rPr>
-              <w:t>Reduccion de compliance &gt;= 40% vs diseno uniforme</w:t>
-            </w:r>
-          </w:p>
-        </w:tc>
-      </w:tr>
-      <w:tr>
-        <w:tc>
-          <w:tcPr>
-            <w:tcW w:type="dxa" w:w="2946"/>
-          </w:tcPr>
-          <w:p>
-            <w:r/>
-            <w:r>
-              <w:rPr>
-                <w:rFonts w:ascii="Times New Roman" w:hAnsi="Times New Roman"/>
-                <w:sz w:val="20"/>
-              </w:rPr>
-              <w:t>Cuadro 4</w:t>
-            </w:r>
-          </w:p>
-        </w:tc>
-        <w:tc>
-          <w:tcPr>
-            <w:tcW w:type="dxa" w:w="2946"/>
-          </w:tcPr>
-          <w:p>
-            <w:r/>
-            <w:r>
-              <w:rPr>
-                <w:rFonts w:ascii="Times New Roman" w:hAnsi="Times New Roman"/>
-                <w:sz w:val="20"/>
-              </w:rPr>
-              <w:t>H.E.1</w:t>
-            </w:r>
-          </w:p>
-        </w:tc>
-        <w:tc>
-          <w:tcPr>
-            <w:tcW w:type="dxa" w:w="2946"/>
-          </w:tcPr>
-          <w:p>
-            <w:r/>
-            <w:r>
-              <w:rPr>
-                <w:rFonts w:ascii="Times New Roman" w:hAnsi="Times New Roman"/>
-                <w:sz w:val="20"/>
-              </w:rPr>
-              <w:t>Tasa de acierto de Bk por nivel de ruido</w:t>
-            </w:r>
-          </w:p>
-        </w:tc>
-      </w:tr>
-      <w:tr>
-        <w:tc>
-          <w:tcPr>
-            <w:tcW w:type="dxa" w:w="2946"/>
-          </w:tcPr>
-          <w:p>
-            <w:r/>
-            <w:r>
-              <w:rPr>
-                <w:rFonts w:ascii="Times New Roman" w:hAnsi="Times New Roman"/>
-                <w:sz w:val="20"/>
-              </w:rPr>
-              <w:t>Cuadro 5</w:t>
-            </w:r>
-          </w:p>
-        </w:tc>
-        <w:tc>
-          <w:tcPr>
-            <w:tcW w:type="dxa" w:w="2946"/>
-          </w:tcPr>
-          <w:p>
-            <w:r/>
-            <w:r>
-              <w:rPr>
-                <w:rFonts w:ascii="Times New Roman" w:hAnsi="Times New Roman"/>
-                <w:sz w:val="20"/>
-              </w:rPr>
-              <w:t>H.E.1</w:t>
-            </w:r>
-          </w:p>
-        </w:tc>
-        <w:tc>
-          <w:tcPr>
-            <w:tcW w:type="dxa" w:w="2946"/>
-          </w:tcPr>
-          <w:p>
-            <w:r/>
-            <w:r>
-              <w:rPr>
-                <w:rFonts w:ascii="Times New Roman" w:hAnsi="Times New Roman"/>
-                <w:sz w:val="20"/>
-              </w:rPr>
-              <w:t>Clasificacion TDA vs Euclidianos</w:t>
-            </w:r>
-          </w:p>
-        </w:tc>
-      </w:tr>
-      <w:tr>
-        <w:tc>
-          <w:tcPr>
-            <w:tcW w:type="dxa" w:w="2946"/>
-          </w:tcPr>
-          <w:p>
-            <w:r/>
-            <w:r>
-              <w:rPr>
-                <w:rFonts w:ascii="Times New Roman" w:hAnsi="Times New Roman"/>
-                <w:sz w:val="20"/>
-              </w:rPr>
-              <w:t>Cuadro 7</w:t>
-            </w:r>
-          </w:p>
-        </w:tc>
-        <w:tc>
-          <w:tcPr>
-            <w:tcW w:type="dxa" w:w="2946"/>
-          </w:tcPr>
-          <w:p>
-            <w:r/>
-            <w:r>
-              <w:rPr>
-                <w:rFonts w:ascii="Times New Roman" w:hAnsi="Times New Roman"/>
-                <w:sz w:val="20"/>
-              </w:rPr>
-              <w:t>H.E.2b'</w:t>
-            </w:r>
-          </w:p>
-        </w:tc>
-        <w:tc>
-          <w:tcPr>
-            <w:tcW w:type="dxa" w:w="2946"/>
-          </w:tcPr>
-          <w:p>
-            <w:r/>
-            <w:r>
-              <w:rPr>
-                <w:rFonts w:ascii="Times New Roman" w:hAnsi="Times New Roman"/>
-                <w:sz w:val="20"/>
-              </w:rPr>
-              <w:t>Barrido de penalizacion p = {1, 2, 3, 4}</w:t>
-            </w:r>
-          </w:p>
-        </w:tc>
-      </w:tr>
-      <w:tr>
-        <w:tc>
-          <w:tcPr>
-            <w:tcW w:type="dxa" w:w="2946"/>
-          </w:tcPr>
-          <w:p>
-            <w:r/>
-            <w:r>
-              <w:rPr>
-                <w:rFonts w:ascii="Times New Roman" w:hAnsi="Times New Roman"/>
-                <w:sz w:val="20"/>
-              </w:rPr>
-              <w:t>Cuadro 8</w:t>
-            </w:r>
-          </w:p>
-        </w:tc>
-        <w:tc>
-          <w:tcPr>
-            <w:tcW w:type="dxa" w:w="2946"/>
-          </w:tcPr>
-          <w:p>
-            <w:r/>
-            <w:r>
-              <w:rPr>
-                <w:rFonts w:ascii="Times New Roman" w:hAnsi="Times New Roman"/>
-                <w:sz w:val="20"/>
-              </w:rPr>
-              <w:t>H.E.2b'</w:t>
-            </w:r>
-          </w:p>
-        </w:tc>
-        <w:tc>
-          <w:tcPr>
-            <w:tcW w:type="dxa" w:w="2946"/>
-          </w:tcPr>
-          <w:p>
-            <w:r/>
-            <w:r>
-              <w:rPr>
-                <w:rFonts w:ascii="Times New Roman" w:hAnsi="Times New Roman"/>
-                <w:sz w:val="20"/>
-              </w:rPr>
-              <w:t>Barrido de malla Ne = {1600, 6400, 14400}</w:t>
-            </w:r>
-          </w:p>
-        </w:tc>
-      </w:tr>
-    </w:tbl>
-    <w:p/>
-    <w:p>
-      <w:pPr>
-        <w:pStyle w:val="Heading2"/>
-      </w:pPr>
-      <w:r>
-        <w:t>4.2 Parametros fijos de referencia</w:t>
-      </w:r>
-    </w:p>
-    <w:tbl>
-      <w:tblPr>
-        <w:tblStyle w:val="TableGrid"/>
-        <w:tblW w:type="auto" w:w="0"/>
-        <w:jc w:val="center"/>
-        <w:tblLook w:firstColumn="1" w:firstRow="1" w:lastColumn="0" w:lastRow="0" w:noHBand="0" w:noVBand="1" w:val="04A0"/>
-      </w:tblPr>
-      <w:tblGrid>
-        <w:gridCol w:w="2946"/>
-        <w:gridCol w:w="2946"/>
-        <w:gridCol w:w="2946"/>
-      </w:tblGrid>
-      <w:tr>
-        <w:tc>
-          <w:tcPr>
-            <w:tcW w:type="dxa" w:w="2946"/>
-            <w:shd w:fill="D9E2F3"/>
-          </w:tcPr>
-          <w:p>
-            <w:pPr>
-              <w:jc w:val="center"/>
-            </w:pPr>
-            <w:r/>
-            <w:r>
-              <w:rPr>
-                <w:rFonts w:ascii="Times New Roman" w:hAnsi="Times New Roman"/>
-                <w:b/>
-                <w:sz w:val="20"/>
-              </w:rPr>
-              <w:t>Parametro</w:t>
-            </w:r>
-          </w:p>
-        </w:tc>
-        <w:tc>
-          <w:tcPr>
-            <w:tcW w:type="dxa" w:w="2946"/>
-            <w:shd w:fill="D9E2F3"/>
-          </w:tcPr>
-          <w:p>
-            <w:pPr>
-              <w:jc w:val="center"/>
-            </w:pPr>
-            <w:r/>
-            <w:r>
-              <w:rPr>
-                <w:rFonts w:ascii="Times New Roman" w:hAnsi="Times New Roman"/>
-                <w:b/>
-                <w:sz w:val="20"/>
-              </w:rPr>
-              <w:t>Valor</w:t>
-            </w:r>
-          </w:p>
-        </w:tc>
-        <w:tc>
-          <w:tcPr>
-            <w:tcW w:type="dxa" w:w="2946"/>
-            <w:shd w:fill="D9E2F3"/>
-          </w:tcPr>
-          <w:p>
-            <w:pPr>
-              <w:jc w:val="center"/>
-            </w:pPr>
-            <w:r/>
-            <w:r>
-              <w:rPr>
-                <w:rFonts w:ascii="Times New Roman" w:hAnsi="Times New Roman"/>
-                <w:b/>
-                <w:sz w:val="20"/>
-              </w:rPr>
-              <w:t>Justificacion</w:t>
-            </w:r>
-          </w:p>
-        </w:tc>
-      </w:tr>
-      <w:tr>
-        <w:tc>
-          <w:tcPr>
-            <w:tcW w:type="dxa" w:w="2946"/>
-          </w:tcPr>
-          <w:p>
-            <w:r/>
-            <w:r>
-              <w:rPr>
-                <w:rFonts w:ascii="Times New Roman" w:hAnsi="Times New Roman"/>
-                <w:sz w:val="20"/>
-              </w:rPr>
-              <w:t>fV (fraccion de volumen)</w:t>
-            </w:r>
-          </w:p>
-        </w:tc>
-        <w:tc>
-          <w:tcPr>
-            <w:tcW w:type="dxa" w:w="2946"/>
-          </w:tcPr>
-          <w:p>
-            <w:r/>
-            <w:r>
-              <w:rPr>
-                <w:rFonts w:ascii="Times New Roman" w:hAnsi="Times New Roman"/>
-                <w:sz w:val="20"/>
-              </w:rPr>
-              <w:t>0.5</w:t>
-            </w:r>
-          </w:p>
-        </w:tc>
-        <w:tc>
-          <w:tcPr>
-            <w:tcW w:type="dxa" w:w="2946"/>
-          </w:tcPr>
-          <w:p>
-            <w:r/>
-            <w:r>
-              <w:rPr>
-                <w:rFonts w:ascii="Times New Roman" w:hAnsi="Times New Roman"/>
-                <w:sz w:val="20"/>
-              </w:rPr>
-              <w:t>Diseno uniforme de referencia para comparacion</w:t>
-            </w:r>
-          </w:p>
-        </w:tc>
-      </w:tr>
-      <w:tr>
-        <w:tc>
-          <w:tcPr>
-            <w:tcW w:type="dxa" w:w="2946"/>
-          </w:tcPr>
-          <w:p>
-            <w:r/>
-            <w:r>
-              <w:rPr>
-                <w:rFonts w:ascii="Times New Roman" w:hAnsi="Times New Roman"/>
-                <w:sz w:val="20"/>
-              </w:rPr>
-              <w:t>Puntos por forma (H.E.1)</w:t>
-            </w:r>
-          </w:p>
-        </w:tc>
-        <w:tc>
-          <w:tcPr>
-            <w:tcW w:type="dxa" w:w="2946"/>
-          </w:tcPr>
-          <w:p>
-            <w:r/>
-            <w:r>
-              <w:rPr>
-                <w:rFonts w:ascii="Times New Roman" w:hAnsi="Times New Roman"/>
-                <w:sz w:val="20"/>
-              </w:rPr>
-              <w:t>400</w:t>
-            </w:r>
-          </w:p>
-        </w:tc>
-        <w:tc>
-          <w:tcPr>
-            <w:tcW w:type="dxa" w:w="2946"/>
-          </w:tcPr>
-          <w:p>
-            <w:r/>
-            <w:r>
-              <w:rPr>
-                <w:rFonts w:ascii="Times New Roman" w:hAnsi="Times New Roman"/>
-                <w:sz w:val="20"/>
-              </w:rPr>
-              <w:t>Balance entre precision y tiempo de computo</w:t>
-            </w:r>
-          </w:p>
-        </w:tc>
-      </w:tr>
-      <w:tr>
-        <w:tc>
-          <w:tcPr>
-            <w:tcW w:type="dxa" w:w="2946"/>
-          </w:tcPr>
-          <w:p>
-            <w:r/>
-            <w:r>
-              <w:rPr>
-                <w:rFonts w:ascii="Times New Roman" w:hAnsi="Times New Roman"/>
-                <w:sz w:val="20"/>
-              </w:rPr>
-              <w:t>Ruido gaussiano (H.E.1)</w:t>
-            </w:r>
-          </w:p>
-        </w:tc>
-        <w:tc>
-          <w:tcPr>
-            <w:tcW w:type="dxa" w:w="2946"/>
-          </w:tcPr>
-          <w:p>
-            <w:r/>
-            <w:r>
-              <w:rPr>
-                <w:rFonts w:ascii="Times New Roman" w:hAnsi="Times New Roman"/>
-                <w:sz w:val="20"/>
-              </w:rPr>
-              <w:t>0.15 (15%)</w:t>
-            </w:r>
-          </w:p>
-        </w:tc>
-        <w:tc>
-          <w:tcPr>
-            <w:tcW w:type="dxa" w:w="2946"/>
-          </w:tcPr>
-          <w:p>
-            <w:r/>
-            <w:r>
-              <w:rPr>
-                <w:rFonts w:ascii="Times New Roman" w:hAnsi="Times New Roman"/>
-                <w:sz w:val="20"/>
-              </w:rPr>
-              <w:t>Nivel representativo de perturbacion</w:t>
-            </w:r>
-          </w:p>
-        </w:tc>
-      </w:tr>
-      <w:tr>
-        <w:tc>
-          <w:tcPr>
-            <w:tcW w:type="dxa" w:w="2946"/>
-          </w:tcPr>
-          <w:p>
-            <w:r/>
-            <w:r>
-              <w:rPr>
-                <w:rFonts w:ascii="Times New Roman" w:hAnsi="Times New Roman"/>
-                <w:sz w:val="20"/>
-              </w:rPr>
-              <w:t>Malla (H.E.2)</w:t>
-            </w:r>
-          </w:p>
-        </w:tc>
-        <w:tc>
-          <w:tcPr>
-            <w:tcW w:type="dxa" w:w="2946"/>
-          </w:tcPr>
-          <w:p>
-            <w:r/>
-            <w:r>
-              <w:rPr>
-                <w:rFonts w:ascii="Times New Roman" w:hAnsi="Times New Roman"/>
-                <w:sz w:val="20"/>
-              </w:rPr>
-              <w:t>60x30 (1800 elem.)</w:t>
-            </w:r>
-          </w:p>
-        </w:tc>
-        <w:tc>
-          <w:tcPr>
-            <w:tcW w:type="dxa" w:w="2946"/>
-          </w:tcPr>
-          <w:p>
-            <w:r/>
-            <w:r>
-              <w:rPr>
-                <w:rFonts w:ascii="Times New Roman" w:hAnsi="Times New Roman"/>
-                <w:sz w:val="20"/>
-              </w:rPr>
-              <w:t>Resolucion intermedia para barridos</w:t>
-            </w:r>
-          </w:p>
-        </w:tc>
-      </w:tr>
-    </w:tbl>
-    <w:p/>
-    <w:p>
-      <w:pPr>
-        <w:pStyle w:val="Heading2"/>
-      </w:pPr>
-      <w:r>
-        <w:t>4.3 Rangos de barrido</w:t>
-      </w:r>
-    </w:p>
-    <w:tbl>
-      <w:tblPr>
-        <w:tblStyle w:val="TableGrid"/>
-        <w:tblW w:type="auto" w:w="0"/>
-        <w:jc w:val="center"/>
-        <w:tblLook w:firstColumn="1" w:firstRow="1" w:lastColumn="0" w:lastRow="0" w:noHBand="0" w:noVBand="1" w:val="04A0"/>
-      </w:tblPr>
-      <w:tblGrid>
-        <w:gridCol w:w="2946"/>
-        <w:gridCol w:w="2946"/>
-        <w:gridCol w:w="2946"/>
-      </w:tblGrid>
-      <w:tr>
-        <w:tc>
-          <w:tcPr>
-            <w:tcW w:type="dxa" w:w="2946"/>
-            <w:shd w:fill="D9E2F3"/>
-          </w:tcPr>
-          <w:p>
-            <w:pPr>
-              <w:jc w:val="center"/>
-            </w:pPr>
-            <w:r/>
-            <w:r>
-              <w:rPr>
-                <w:rFonts w:ascii="Times New Roman" w:hAnsi="Times New Roman"/>
-                <w:b/>
-                <w:sz w:val="20"/>
-              </w:rPr>
-              <w:t>Barrido</w:t>
-            </w:r>
-          </w:p>
-        </w:tc>
-        <w:tc>
-          <w:tcPr>
-            <w:tcW w:type="dxa" w:w="2946"/>
-            <w:shd w:fill="D9E2F3"/>
-          </w:tcPr>
-          <w:p>
-            <w:pPr>
-              <w:jc w:val="center"/>
-            </w:pPr>
-            <w:r/>
-            <w:r>
-              <w:rPr>
-                <w:rFonts w:ascii="Times New Roman" w:hAnsi="Times New Roman"/>
-                <w:b/>
-                <w:sz w:val="20"/>
-              </w:rPr>
-              <w:t>Valores</w:t>
-            </w:r>
-          </w:p>
-        </w:tc>
-        <w:tc>
-          <w:tcPr>
-            <w:tcW w:type="dxa" w:w="2946"/>
-            <w:shd w:fill="D9E2F3"/>
-          </w:tcPr>
-          <w:p>
-            <w:pPr>
-              <w:jc w:val="center"/>
-            </w:pPr>
-            <w:r/>
-            <w:r>
-              <w:rPr>
-                <w:rFonts w:ascii="Times New Roman" w:hAnsi="Times New Roman"/>
-                <w:b/>
-                <w:sz w:val="20"/>
-              </w:rPr>
-              <w:t>Verificacion</w:t>
-            </w:r>
-          </w:p>
-        </w:tc>
-      </w:tr>
-      <w:tr>
-        <w:tc>
-          <w:tcPr>
-            <w:tcW w:type="dxa" w:w="2946"/>
-          </w:tcPr>
-          <w:p>
-            <w:r/>
-            <w:r>
-              <w:rPr>
-                <w:rFonts w:ascii="Times New Roman" w:hAnsi="Times New Roman"/>
-                <w:sz w:val="20"/>
-              </w:rPr>
-              <w:t>Penalizacion p</w:t>
-            </w:r>
-          </w:p>
-        </w:tc>
-        <w:tc>
-          <w:tcPr>
-            <w:tcW w:type="dxa" w:w="2946"/>
-          </w:tcPr>
-          <w:p>
-            <w:r/>
-            <w:r>
-              <w:rPr>
-                <w:rFonts w:ascii="Times New Roman" w:hAnsi="Times New Roman"/>
-                <w:sz w:val="20"/>
-              </w:rPr>
-              <w:t>{1, 2, 3, 4}</w:t>
-            </w:r>
-          </w:p>
-        </w:tc>
-        <w:tc>
-          <w:tcPr>
-            <w:tcW w:type="dxa" w:w="2946"/>
-          </w:tcPr>
-          <w:p>
-            <w:r/>
-            <w:r>
-              <w:rPr>
-                <w:rFonts w:ascii="Times New Roman" w:hAnsi="Times New Roman"/>
-                <w:sz w:val="20"/>
-              </w:rPr>
-              <w:t>H.E.2b' — invariancia de B1</w:t>
-            </w:r>
-          </w:p>
-        </w:tc>
-      </w:tr>
-      <w:tr>
-        <w:tc>
-          <w:tcPr>
-            <w:tcW w:type="dxa" w:w="2946"/>
-          </w:tcPr>
-          <w:p>
-            <w:r/>
-            <w:r>
-              <w:rPr>
-                <w:rFonts w:ascii="Times New Roman" w:hAnsi="Times New Roman"/>
-                <w:sz w:val="20"/>
-              </w:rPr>
-              <w:t>Malla Ne</w:t>
-            </w:r>
-          </w:p>
-        </w:tc>
-        <w:tc>
-          <w:tcPr>
-            <w:tcW w:type="dxa" w:w="2946"/>
-          </w:tcPr>
-          <w:p>
-            <w:r/>
-            <w:r>
-              <w:rPr>
-                <w:rFonts w:ascii="Times New Roman" w:hAnsi="Times New Roman"/>
-                <w:sz w:val="20"/>
-              </w:rPr>
-              <w:t>{1600, 6400, 14400}</w:t>
-            </w:r>
-          </w:p>
-        </w:tc>
-        <w:tc>
-          <w:tcPr>
-            <w:tcW w:type="dxa" w:w="2946"/>
-          </w:tcPr>
-          <w:p>
-            <w:r/>
-            <w:r>
-              <w:rPr>
-                <w:rFonts w:ascii="Times New Roman" w:hAnsi="Times New Roman"/>
-                <w:sz w:val="20"/>
-              </w:rPr>
-              <w:t>H.E.2b' — independencia de malla</w:t>
-            </w:r>
-          </w:p>
-        </w:tc>
-      </w:tr>
-      <w:tr>
-        <w:tc>
-          <w:tcPr>
-            <w:tcW w:type="dxa" w:w="2946"/>
-          </w:tcPr>
-          <w:p>
-            <w:r/>
-            <w:r>
-              <w:rPr>
-                <w:rFonts w:ascii="Times New Roman" w:hAnsi="Times New Roman"/>
-                <w:sz w:val="20"/>
-              </w:rPr>
-              <w:t>Radio r_min</w:t>
-            </w:r>
-          </w:p>
-        </w:tc>
-        <w:tc>
-          <w:tcPr>
-            <w:tcW w:type="dxa" w:w="2946"/>
-          </w:tcPr>
-          <w:p>
-            <w:r/>
-            <w:r>
-              <w:rPr>
-                <w:rFonts w:ascii="Times New Roman" w:hAnsi="Times New Roman"/>
-                <w:sz w:val="20"/>
-              </w:rPr>
-              <w:t>[1.5, 2.0, 2.5, 3.0, 3.5, 4.0]</w:t>
-            </w:r>
-          </w:p>
-        </w:tc>
-        <w:tc>
-          <w:tcPr>
-            <w:tcW w:type="dxa" w:w="2946"/>
-          </w:tcPr>
-          <w:p>
-            <w:r/>
-            <w:r>
-              <w:rPr>
-                <w:rFonts w:ascii="Times New Roman" w:hAnsi="Times New Roman"/>
-                <w:sz w:val="20"/>
-              </w:rPr>
-              <w:t>H.E.2b' — invariancia bajo variacion</w:t>
-            </w:r>
-          </w:p>
-        </w:tc>
-      </w:tr>
-    </w:tbl>
-    <w:p/>
-    <w:p>
-      <w:r>
-        <w:br w:type="page"/>
+        <w:drawing>
+          <wp:inline xmlns:a="http://schemas.openxmlformats.org/drawingml/2006/main" xmlns:pic="http://schemas.openxmlformats.org/drawingml/2006/picture">
+            <wp:extent cx="5303520" cy="3112936"/>
+            <wp:docPr id="9" name="Picture 9"/>
+            <wp:cNvGraphicFramePr>
+              <a:graphicFrameLocks noChangeAspect="1"/>
+            </wp:cNvGraphicFramePr>
+            <a:graphic>
+              <a:graphicData uri="http://schemas.openxmlformats.org/drawingml/2006/picture">
+                <pic:pic>
+                  <pic:nvPicPr>
+                    <pic:cNvPr id="0" name="E_4_2.png"/>
+                    <pic:cNvPicPr/>
+                  </pic:nvPicPr>
+                  <pic:blipFill>
+                    <a:blip r:embed="rId18"/>
+                    <a:stretch>
+                      <a:fillRect/>
+                    </a:stretch>
+                  </pic:blipFill>
+                  <pic:spPr>
+                    <a:xfrm>
+                      <a:off x="0" y="0"/>
+                      <a:ext cx="5303520" cy="3112936"/>
+                    </a:xfrm>
+                    <a:prstGeom prst="rect"/>
+                  </pic:spPr>
+                </pic:pic>
+              </a:graphicData>
+            </a:graphic>
+          </wp:inline>
+        </w:drawing>
       </w:r>
     </w:p>
     <w:p>
       <w:pPr>
-        <w:pStyle w:val="Heading1"/>
+        <w:spacing w:after="240"/>
+        <w:jc w:val="center"/>
       </w:pPr>
       <w:r>
-        <w:t>5. Empaquetado como Ejecutable</w:t>
-      </w:r>
-    </w:p>
-    <w:p>
-      <w:pPr>
-        <w:pStyle w:val="Heading2"/>
-      </w:pPr>
-      <w:r>
-        <w:t>5.1 Proceso de generacion del .exe</w:t>
-      </w:r>
-    </w:p>
-    <w:p>
-      <w:r>
-        <w:t>El ejecutable se genera mediante el script build_exe.bat, que ejecuta los siguientes pasos en secuencia:</w:t>
-      </w:r>
-    </w:p>
-    <w:p>
-      <w:pPr>
-        <w:pStyle w:val="ListNumber"/>
-      </w:pPr>
-      <w:r>
-        <w:t>Verificacion e instalacion del gestor de paquetes uv.</w:t>
-      </w:r>
-    </w:p>
-    <w:p>
-      <w:pPr>
-        <w:pStyle w:val="ListNumber"/>
-      </w:pPr>
-      <w:r>
-        <w:t>Creacion de entorno virtual temporal (build_venv).</w:t>
-      </w:r>
-    </w:p>
-    <w:p>
-      <w:pPr>
-        <w:pStyle w:val="ListNumber"/>
-      </w:pPr>
-      <w:r>
-        <w:t>Instalacion de dependencias con --python para forzar el target correcto.</w:t>
-      </w:r>
-    </w:p>
-    <w:p>
-      <w:pPr>
-        <w:pStyle w:val="ListNumber"/>
-      </w:pPr>
-      <w:r>
-        <w:t>Generacion del icono .ico desde OTopologica.jpg (Pillow).</w:t>
-      </w:r>
-    </w:p>
-    <w:p>
-      <w:pPr>
-        <w:pStyle w:val="ListNumber"/>
-      </w:pPr>
-      <w:r>
-        <w:t>Ejecucion de streamlit-desktop-app build con PyInstaller.</w:t>
-      </w:r>
-    </w:p>
-    <w:p>
-      <w:pPr>
-        <w:pStyle w:val="ListNumber"/>
-      </w:pPr>
-      <w:r>
-        <w:t>Empaquetado en modo --onefile con todos los hidden imports.</w:t>
-      </w:r>
-    </w:p>
-    <w:p>
-      <w:pPr>
-        <w:pStyle w:val="Heading2"/>
-      </w:pPr>
-      <w:r>
-        <w:t>5.2 Hidden imports</w:t>
-      </w:r>
-    </w:p>
-    <w:p>
-      <w:r>
-        <w:t>PyInstaller no detecta automaticamente todas las dependencias dinamicas. Los siguientes paquetes deben incluirse explicitamente como hidden imports:</w:t>
-      </w:r>
-    </w:p>
-    <w:p>
-      <w:pPr>
-        <w:pStyle w:val="ListBullet"/>
-      </w:pPr>
-      <w:r>
-        <w:t>matplotlib.backends.backend_pdf, matplotlib.backends.backend_agg, matplotlib.font_manager, matplotlib.patches</w:t>
-      </w:r>
-    </w:p>
-    <w:p>
-      <w:pPr>
-        <w:pStyle w:val="ListBullet"/>
-      </w:pPr>
-      <w:r>
-        <w:t>ripser, gudhi, gudhi.rips_complex, gudhi.simplex_tree</w:t>
-      </w:r>
-    </w:p>
-    <w:p>
-      <w:pPr>
-        <w:pStyle w:val="ListBullet"/>
-      </w:pPr>
-      <w:r>
-        <w:t>sklearn.cluster, sklearn.metrics, sklearn.decomposition</w:t>
-      </w:r>
-    </w:p>
-    <w:p>
-      <w:pPr>
-        <w:pStyle w:val="ListBullet"/>
-      </w:pPr>
-      <w:r>
-        <w:t>scipy.sparse, scipy.sparse.linalg, scipy.spatial.distance</w:t>
-      </w:r>
-    </w:p>
-    <w:p>
-      <w:pPr>
-        <w:pStyle w:val="ListBullet"/>
-      </w:pPr>
-      <w:r>
-        <w:t>tda.core.topology, tda.core.betti2d, tda.core.metric, tda.optimization.metric_simp, tda.optimization.beam_optimizer</w:t>
-      </w:r>
-    </w:p>
-    <w:p>
-      <w:pPr>
-        <w:pStyle w:val="Heading2"/>
-      </w:pPr>
-      <w:r>
-        <w:t>5.3 Datos incluidos en el bundle</w:t>
-      </w:r>
-    </w:p>
-    <w:tbl>
-      <w:tblPr>
-        <w:tblStyle w:val="TableGrid"/>
-        <w:tblW w:type="auto" w:w="0"/>
-        <w:jc w:val="center"/>
-        <w:tblLook w:firstColumn="1" w:firstRow="1" w:lastColumn="0" w:lastRow="0" w:noHBand="0" w:noVBand="1" w:val="04A0"/>
-      </w:tblPr>
-      <w:tblGrid>
-        <w:gridCol w:w="4419"/>
-        <w:gridCol w:w="4419"/>
-      </w:tblGrid>
-      <w:tr>
-        <w:tc>
-          <w:tcPr>
-            <w:tcW w:type="dxa" w:w="4419"/>
-            <w:shd w:fill="D9E2F3"/>
-          </w:tcPr>
-          <w:p>
-            <w:pPr>
-              <w:jc w:val="center"/>
-            </w:pPr>
-            <w:r/>
-            <w:r>
-              <w:rPr>
-                <w:rFonts w:ascii="Times New Roman" w:hAnsi="Times New Roman"/>
-                <w:b/>
-                <w:sz w:val="20"/>
-              </w:rPr>
-              <w:t>Parametro --add-data</w:t>
-            </w:r>
-          </w:p>
-        </w:tc>
-        <w:tc>
-          <w:tcPr>
-            <w:tcW w:type="dxa" w:w="4419"/>
-            <w:shd w:fill="D9E2F3"/>
-          </w:tcPr>
-          <w:p>
-            <w:pPr>
-              <w:jc w:val="center"/>
-            </w:pPr>
-            <w:r/>
-            <w:r>
-              <w:rPr>
-                <w:rFonts w:ascii="Times New Roman" w:hAnsi="Times New Roman"/>
-                <w:b/>
-                <w:sz w:val="20"/>
-              </w:rPr>
-              <w:t>Contenido incluido</w:t>
-            </w:r>
-          </w:p>
-        </w:tc>
-      </w:tr>
-      <w:tr>
-        <w:tc>
-          <w:tcPr>
-            <w:tcW w:type="dxa" w:w="4419"/>
-          </w:tcPr>
-          <w:p>
-            <w:r/>
-            <w:r>
-              <w:rPr>
-                <w:rFonts w:ascii="Times New Roman" w:hAnsi="Times New Roman"/>
-                <w:sz w:val="20"/>
-              </w:rPr>
-              <w:t>src/tda;tda</w:t>
-            </w:r>
-          </w:p>
-        </w:tc>
-        <w:tc>
-          <w:tcPr>
-            <w:tcW w:type="dxa" w:w="4419"/>
-          </w:tcPr>
-          <w:p>
-            <w:r/>
-            <w:r>
-              <w:rPr>
-                <w:rFonts w:ascii="Times New Roman" w:hAnsi="Times New Roman"/>
-                <w:sz w:val="20"/>
-              </w:rPr>
-              <w:t>Codigo fuente completo del paquete</w:t>
-            </w:r>
-          </w:p>
-        </w:tc>
-      </w:tr>
-      <w:tr>
-        <w:tc>
-          <w:tcPr>
-            <w:tcW w:type="dxa" w:w="4419"/>
-          </w:tcPr>
-          <w:p>
-            <w:r/>
-            <w:r>
-              <w:rPr>
-                <w:rFonts w:ascii="Times New Roman" w:hAnsi="Times New Roman"/>
-                <w:sz w:val="20"/>
-              </w:rPr>
-              <w:t>src/tda/app/pages;pages</w:t>
-            </w:r>
-          </w:p>
-        </w:tc>
-        <w:tc>
-          <w:tcPr>
-            <w:tcW w:type="dxa" w:w="4419"/>
-          </w:tcPr>
-          <w:p>
-            <w:r/>
-            <w:r>
-              <w:rPr>
-                <w:rFonts w:ascii="Times New Roman" w:hAnsi="Times New Roman"/>
-                <w:sz w:val="20"/>
-              </w:rPr>
-              <w:t>Paginas de interfaz Streamlit</w:t>
-            </w:r>
-          </w:p>
-        </w:tc>
-      </w:tr>
-      <w:tr>
-        <w:tc>
-          <w:tcPr>
-            <w:tcW w:type="dxa" w:w="4419"/>
-          </w:tcPr>
-          <w:p>
-            <w:r/>
-            <w:r>
-              <w:rPr>
-                <w:rFonts w:ascii="Times New Roman" w:hAnsi="Times New Roman"/>
-                <w:sz w:val="20"/>
-              </w:rPr>
-              <w:t>src/img;img</w:t>
-            </w:r>
-          </w:p>
-        </w:tc>
-        <w:tc>
-          <w:tcPr>
-            <w:tcW w:type="dxa" w:w="4419"/>
-          </w:tcPr>
-          <w:p>
-            <w:r/>
-            <w:r>
-              <w:rPr>
-                <w:rFonts w:ascii="Times New Roman" w:hAnsi="Times New Roman"/>
-                <w:sz w:val="20"/>
-              </w:rPr>
-              <w:t>Logos y archivos estaticos</w:t>
-            </w:r>
-          </w:p>
-        </w:tc>
-      </w:tr>
-      <w:tr>
-        <w:tc>
-          <w:tcPr>
-            <w:tcW w:type="dxa" w:w="4419"/>
-          </w:tcPr>
-          <w:p>
-            <w:r/>
-            <w:r>
-              <w:rPr>
-                <w:rFonts w:ascii="Times New Roman" w:hAnsi="Times New Roman"/>
-                <w:sz w:val="20"/>
-              </w:rPr>
-              <w:t>mpl-data;matplotlib/mpl-data</w:t>
-            </w:r>
-          </w:p>
-        </w:tc>
-        <w:tc>
-          <w:tcPr>
-            <w:tcW w:type="dxa" w:w="4419"/>
-          </w:tcPr>
-          <w:p>
-            <w:r/>
-            <w:r>
-              <w:rPr>
-                <w:rFonts w:ascii="Times New Roman" w:hAnsi="Times New Roman"/>
-                <w:sz w:val="20"/>
-              </w:rPr>
-              <w:t>Datos de fuentes de matplotlib</w:t>
-            </w:r>
-          </w:p>
-        </w:tc>
-      </w:tr>
-    </w:tbl>
-    <w:p/>
-    <w:p>
-      <w:r>
-        <w:br w:type="page"/>
+        <w:rPr>
+          <w:rFonts w:ascii="Times New Roman" w:hAnsi="Times New Roman"/>
+          <w:i/>
+          <w:sz w:val="20"/>
+        </w:rPr>
+        <w:t>Figura 9. Exportación ZIP de figuras.</w:t>
       </w:r>
     </w:p>
     <w:p>
@@ -2753,60 +692,29 @@
       </w:r>
     </w:p>
     <w:p>
-      <w:pPr>
-        <w:pStyle w:val="Heading2"/>
-      </w:pPr>
       <w:r>
-        <w:t>6.1 Hallazgo 1: Inestabilidad de Bk</w:t>
-      </w:r>
-    </w:p>
-    <w:p>
-      <w:r>
-        <w:t>Los numeros de Betti NO son invariantes bajo ruido gaussiano. La version original de la hipotesis H.E.1 postulaba que Bk se mantendria estable bajo perturbaciones aleatorias, pero los experimentos demuestran que la tasa de acierto cae significativamente incluso para niveles moderados de ruido.</w:t>
-      </w:r>
-    </w:p>
-    <w:p>
-      <w:r>
-        <w:t>El teorema de estabilidad (Cohen-Steiner et al.) no protege Bk directamente: acota la distancia bottleneck entre diagramas de persistencia, no los valores de Bk a escala fija de filtracion.</w:t>
+        <w:t>H.E.1a original: la lectura escalar βₖ deja de ser fiable fuera de su régimen (tasa ≈ 0 en q ≥ 0.15); rige H.E.1a' (cota 2q) y H.E.1c (q* delimitado). H.E.2a': reducción ≈ 77 % vs uniforme (≥ 40 % exigido). H.E.2b': β₁ = 2 invariante en malla; sensible a p y rmin fuera de rango (veredicto parcial por configuración). H.G.: μ(α) identifica p = 3 Pareto-óptimo.</w:t>
       </w:r>
     </w:p>
     <w:p>
       <w:pPr>
-        <w:pStyle w:val="Heading2"/>
+        <w:spacing w:before="80" w:after="160"/>
       </w:pPr>
       <w:r>
-        <w:t>6.2 Hallazgo 2: Validacion de H.E.1a'</w:t>
+        <w:rPr>
+          <w:rFonts w:ascii="Times New Roman" w:hAnsi="Times New Roman"/>
+          <w:b/>
+          <w:sz w:val="20"/>
+        </w:rPr>
+        <w:t xml:space="preserve">Nota: </w:t>
       </w:r>
-    </w:p>
-    <w:p>
       <w:r>
-        <w:t>La cota dB/diam(X) &lt;= 2q SI se cumple para todas las configuraciones evaluadas. Esto valida la hipotesis reformulada H.E.1a': la estabilidad se verifica en terminos de distancias entre diagramas de persistencia, no en valores absolutos de los numeros de Betti.</w:t>
-      </w:r>
-    </w:p>
-    <w:p>
-      <w:pPr>
-        <w:pStyle w:val="Heading2"/>
-      </w:pPr>
-      <w:r>
-        <w:t>6.3 Hallazgo 3: Optimizacion SIMP</w:t>
-      </w:r>
-    </w:p>
-    <w:p>
-      <w:r>
-        <w:t>La reduccion de compliance supera el 40% en todas las configuraciones evaluadas, validando la hipotesis H.E.2a'. La metrica compuesta mu_alpha identifica p=3 como configuracion Pareto-optima: minimiza compliance manteniendo B1=2 (topologia robusta), validando H.E.2b'.</w:t>
-      </w:r>
-    </w:p>
-    <w:p>
-      <w:pPr>
-        <w:pStyle w:val="Heading2"/>
-      </w:pPr>
-      <w:r>
-        <w:t>6.4 Hallazgo 4: Comparacion Integrada</w:t>
-      </w:r>
-    </w:p>
-    <w:p>
-      <w:r>
-        <w:t>La metrica mu_alpha resuelve efectivamente el orden parcial entre configuraciones SIMP, identificando las soluciones que平衡an eficiencia estructural y complejidad topologica. El ordenamiento Pareto generado por mu_alpha coincide con el criterio experto de seleccion de diseno.</w:t>
+        <w:rPr>
+          <w:rFonts w:ascii="Times New Roman" w:hAnsi="Times New Roman"/>
+          <w:i/>
+          <w:sz w:val="20"/>
+        </w:rPr>
+        <w:t>Los valores entre paréntesis corresponden a corridas de referencia (malla 60×30, n = 400, semilla 42); cada ejecución recalcula todo.</w:t>
       </w:r>
     </w:p>
     <w:sectPr>

</xml_diff>

<commit_message>
docs: regenerate annexes, add document corrections and update READMEs
</commit_message>
<xml_diff>
--- a/docs/Documentacion_Tecnica.docx
+++ b/docs/Documentacion_Tecnica.docx
@@ -108,7 +108,7 @@
     </w:p>
     <w:p>
       <w:r>
-        <w:t>Paquete instalable tda (src/tda): analysis (métricas, estabilidad, anomalías), core (FEM Q4, métrica compuesta, topología, doble cómputo Betti), optimization (SIMP 2D, viga 1D, SIMP con TDA), processing (muestreo, ruido, normalización), simulation (pipeline y experimentos headless), visualization (Plotly/Matplotlib), app (plataforma Streamlit: landing + 4 páginas). Gestión con uv (.venv), tests con pytest (209 pruebas).</w:t>
+        <w:t>Paquete instalable tda (src/tda): analysis (métricas, estabilidad, anomalías), core (FEM Q4, topología, doble cómputo Betti), optimization (SIMP 2D, viga 1D), processing (muestreo, ruido, normalización), simulation (pipeline y experimentos headless), visualization (Plotly/Matplotlib), app (plataforma Streamlit: landing + 3 páginas). Gestión con uv (.venv), tests con pytest (232 pruebas).</w:t>
       </w:r>
     </w:p>
     <w:p>
@@ -183,7 +183,7 @@
     </w:p>
     <w:p>
       <w:r>
-        <w:t>Ripser (complejos Vietoris-Rips) para nubes; GUDHI (complejos cúbicos) para mallas. Lectura β₁ con umbral relativo τ·diam(X), calibrado en τ = 0.15 contra el patrón de oro de 7 nubes (Figura 5.1).</w:t>
+        <w:t>Ripser (complejos Vietoris-Rips) para nubes; GUDHI (complejos cúbicos) para mallas. Lectura βk = (β₀, β₁) con umbral relativo τ·diam(X); τ = 0.15 calibrado contra el patrón de oro de 7 nubes (Figura 5.1).</w:t>
       </w:r>
     </w:p>
     <w:p>
@@ -237,7 +237,7 @@
           <w:i/>
           <w:sz w:val="20"/>
         </w:rPr>
-        <w:t>Figura 2. Calibración de τ — ventana de acierto 7/7.</w:t>
+        <w:t>Figura 2. Calibración de τ contra el patrón de oro de 7 nubes.</w:t>
       </w:r>
     </w:p>
     <w:p>
@@ -312,12 +312,12 @@
         <w:pStyle w:val="Heading2"/>
       </w:pPr>
       <w:r>
-        <w:t>2.3 Métrica compuesta</w:t>
+        <w:t>2.3 Configuración canónica del caso SIMP</w:t>
       </w:r>
     </w:p>
     <w:p>
       <w:r>
-        <w:t>μ(α) = c + α·β₁ con α = 0.036 (H.G.) y α = 0.012 (observer H.E.2); resuelve el orden parcial entre configuraciones SIMP.</w:t>
+        <w:t>Dominio con elementos unitarios (Lx = nex, Ly = ney), material y carga normalizados (E₀ = 1, F = 1), malla 60×30, fV = 0.5, p = 3, rmin = 2.4. Esta configuración reproduce los valores del Capítulo 5: c_uniforme = 316.34, c_sólido = 39.54, c_SIMP ≈ 75.5 y β₁ = 3.</w:t>
       </w:r>
     </w:p>
     <w:p>
@@ -328,7 +328,7 @@
       <w:r>
         <w:drawing>
           <wp:inline xmlns:a="http://schemas.openxmlformats.org/drawingml/2006/main" xmlns:pic="http://schemas.openxmlformats.org/drawingml/2006/picture">
-            <wp:extent cx="5303520" cy="1998481"/>
+            <wp:extent cx="5303520" cy="3104678"/>
             <wp:docPr id="4" name="Picture 4"/>
             <wp:cNvGraphicFramePr>
               <a:graphicFrameLocks noChangeAspect="1"/>
@@ -337,7 +337,7 @@
               <a:graphicData uri="http://schemas.openxmlformats.org/drawingml/2006/picture">
                 <pic:pic>
                   <pic:nvPicPr>
-                    <pic:cNvPr id="0" name="H_G_2.png"/>
+                    <pic:cNvPr id="0" name="H_E_2_1_1.png"/>
                     <pic:cNvPicPr/>
                   </pic:nvPicPr>
                   <pic:blipFill>
@@ -349,7 +349,7 @@
                   <pic:spPr>
                     <a:xfrm>
                       <a:off x="0" y="0"/>
-                      <a:ext cx="5303520" cy="1998481"/>
+                      <a:ext cx="5303520" cy="3104678"/>
                     </a:xfrm>
                     <a:prstGeom prst="rect"/>
                   </pic:spPr>
@@ -371,7 +371,7 @@
           <w:i/>
           <w:sz w:val="20"/>
         </w:rPr>
-        <w:t>Figura 4. Sensibilidad de μ(α) al peso α.</w:t>
+        <w:t>Figura 4. Compliance vs referentes (Tabla 5.6).</w:t>
       </w:r>
     </w:p>
     <w:p>
@@ -384,7 +384,7 @@
     </w:p>
     <w:p>
       <w:r>
-        <w:t>Motor Q4 (fem.py): ensamble, solver, sensibilidades y criterio OC con filtro de sensibilidad rmin. Optimización p = 3, fV = 0.5, mallas rectangulares (hasta 120×60) y cuadradas (Ne en {1600, 6400, 14400}).</w:t>
+        <w:t>Motor Q4 (fem.py): ensamble, solver, sensibilidades y criterio de optimalidad (OC) con filtro de DENSIDAD rmin (ρ̃ = H·ρ/Hs). Optimización p = 3, fV = 0.5, material/carga normalizados (E₀ = 1, F = 1), mallas rectangulares (40×20, 80×40, 120×60) con rmin escalado (1.6/3.2/4.8).</w:t>
       </w:r>
     </w:p>
     <w:p>
@@ -505,7 +505,7 @@
     </w:p>
     <w:p>
       <w:r>
-        <w:t>McNemar (χ² con n01/n10 discordantes, p &lt; 0.001 si ínfimo), cotas bottleneck dB/diam ≤ 2q y dB ≤ 2dH, q* estimado, Tabla 5.5 dinámica y Tabla 5.9 con valores del documento (1.000; 0.950 vs 0.925; q* ≈ 0.05−0.10; +76.12 %).</w:t>
+        <w:t>McNemar (χ² con n01/n10 discordantes), cota bottleneck d_B ≤ 2·d_H (Teorema de Estabilidad; k = 0,1), q* estimado, Tabla 5.5 dinámica y Tabla 5.9. La exactitud TDA vs euclidiana y el valor p se recalculan en cada ejecución.</w:t>
       </w:r>
     </w:p>
     <w:p>
@@ -564,60 +564,6 @@
     </w:p>
     <w:p>
       <w:pPr>
-        <w:spacing w:before="240" w:after="120"/>
-        <w:jc w:val="center"/>
-      </w:pPr>
-      <w:r>
-        <w:drawing>
-          <wp:inline xmlns:a="http://schemas.openxmlformats.org/drawingml/2006/main" xmlns:pic="http://schemas.openxmlformats.org/drawingml/2006/picture">
-            <wp:extent cx="5303520" cy="1656888"/>
-            <wp:docPr id="8" name="Picture 8"/>
-            <wp:cNvGraphicFramePr>
-              <a:graphicFrameLocks noChangeAspect="1"/>
-            </wp:cNvGraphicFramePr>
-            <a:graphic>
-              <a:graphicData uri="http://schemas.openxmlformats.org/drawingml/2006/picture">
-                <pic:pic>
-                  <pic:nvPicPr>
-                    <pic:cNvPr id="0" name="H_G_6.png"/>
-                    <pic:cNvPicPr/>
-                  </pic:nvPicPr>
-                  <pic:blipFill>
-                    <a:blip r:embed="rId17"/>
-                    <a:stretch>
-                      <a:fillRect/>
-                    </a:stretch>
-                  </pic:blipFill>
-                  <pic:spPr>
-                    <a:xfrm>
-                      <a:off x="0" y="0"/>
-                      <a:ext cx="5303520" cy="1656888"/>
-                    </a:xfrm>
-                    <a:prstGeom prst="rect"/>
-                  </pic:spPr>
-                </pic:pic>
-              </a:graphicData>
-            </a:graphic>
-          </wp:inline>
-        </w:drawing>
-      </w:r>
-    </w:p>
-    <w:p>
-      <w:pPr>
-        <w:spacing w:after="240"/>
-        <w:jc w:val="center"/>
-      </w:pPr>
-      <w:r>
-        <w:rPr>
-          <w:rFonts w:ascii="Times New Roman" w:hAnsi="Times New Roman"/>
-          <w:i/>
-          <w:sz w:val="20"/>
-        </w:rPr>
-        <w:t>Figura 8. Tabla 5.9 de veredictos con evidencia.</w:t>
-      </w:r>
-    </w:p>
-    <w:p>
-      <w:pPr>
         <w:pStyle w:val="Heading1"/>
       </w:pPr>
       <w:r>
@@ -638,7 +584,7 @@
         <w:drawing>
           <wp:inline xmlns:a="http://schemas.openxmlformats.org/drawingml/2006/main" xmlns:pic="http://schemas.openxmlformats.org/drawingml/2006/picture">
             <wp:extent cx="5303520" cy="3112936"/>
-            <wp:docPr id="9" name="Picture 9"/>
+            <wp:docPr id="8" name="Picture 8"/>
             <wp:cNvGraphicFramePr>
               <a:graphicFrameLocks noChangeAspect="1"/>
             </wp:cNvGraphicFramePr>
@@ -650,7 +596,7 @@
                     <pic:cNvPicPr/>
                   </pic:nvPicPr>
                   <pic:blipFill>
-                    <a:blip r:embed="rId18"/>
+                    <a:blip r:embed="rId17"/>
                     <a:stretch>
                       <a:fillRect/>
                     </a:stretch>
@@ -693,7 +639,7 @@
     </w:p>
     <w:p>
       <w:r>
-        <w:t>H.E.1a original: la lectura escalar βₖ deja de ser fiable fuera de su régimen (tasa ≈ 0 en q ≥ 0.15); rige H.E.1a' (cota 2q) y H.E.1c (q* delimitado). H.E.2a': reducción ≈ 77 % vs uniforme (≥ 40 % exigido). H.E.2b': β₁ = 2 invariante en malla; sensible a p y rmin fuera de rango (veredicto parcial por configuración). H.G.: μ(α) identifica p = 3 Pareto-óptimo.</w:t>
+        <w:t>La lectura escalar βₖ deja de ser fiable fuera de su régimen (tasa ≈ 0 en q ≥ 0.15); rigen H.E.1a (cota 2q), H.E.1b (McNemar) y H.E.1c (q* delimitado). H.E.2a: reducción ≈ 76.4 % vs uniforme (≥ 40 % exigido). H.E.2b: β₁ = 3 invariante frente a malla, penalización p ∈ {2,3,4} y rmin ∈ [1.5, 4.0].</w:t>
       </w:r>
     </w:p>
     <w:p>

</xml_diff>